<commit_message>
Narrow prohibition-dates TZ to auto-shift and opening request
Drop accountant role and Excel from the first queue (deferred).
Replace the term "окно" with "срок действия открытого периода"
in OpenSpec artifacts and the Word TZ.

Co-authored-by: an_skripko <an_skripko@vk.com>
</commit_message>
<xml_diff>
--- a/openspec/changes/np-dates-of-prohibition-setup/ТЗ_установка_дат_запрета_изменения.docx
+++ b/openspec/changes/np-dates-of-prohibition-setup/ТЗ_установка_дат_запрета_изменения.docx
@@ -15,7 +15,6 @@
           <w:i w:val="0"/>
           <w:color w:val="000000"/>
           <w:sz w:val="28"/>
-          <w:cs w:val="0"/>
         </w:rPr>
         <w:t>УТВЕРЖДАЮ</w:t>
       </w:r>
@@ -33,7 +32,6 @@
           <w:i w:val="0"/>
           <w:color w:val="000000"/>
           <w:sz w:val="28"/>
-          <w:cs w:val="0"/>
         </w:rPr>
         <w:t>_____________________________</w:t>
       </w:r>
@@ -51,7 +49,6 @@
           <w:i w:val="0"/>
           <w:color w:val="000000"/>
           <w:sz w:val="28"/>
-          <w:cs w:val="0"/>
         </w:rPr>
         <w:t>(должность)</w:t>
       </w:r>
@@ -69,7 +66,6 @@
           <w:i w:val="0"/>
           <w:color w:val="000000"/>
           <w:sz w:val="28"/>
-          <w:cs w:val="0"/>
         </w:rPr>
         <w:t>_____________________________</w:t>
       </w:r>
@@ -87,7 +83,6 @@
           <w:i w:val="0"/>
           <w:color w:val="000000"/>
           <w:sz w:val="28"/>
-          <w:cs w:val="0"/>
         </w:rPr>
         <w:t>(подпись, расшифровка)</w:t>
       </w:r>
@@ -105,7 +100,6 @@
           <w:i w:val="0"/>
           <w:color w:val="000000"/>
           <w:sz w:val="28"/>
-          <w:cs w:val="0"/>
         </w:rPr>
         <w:t>«___» ______________ 2026 г.</w:t>
       </w:r>
@@ -123,7 +117,6 @@
           <w:i w:val="0"/>
           <w:color w:val="000000"/>
           <w:sz w:val="28"/>
-          <w:cs w:val="0"/>
         </w:rPr>
         <w:t>ТЕХНИЧЕСКОЕ ЗАДАНИЕ</w:t>
       </w:r>
@@ -141,7 +134,6 @@
           <w:i w:val="0"/>
           <w:color w:val="000000"/>
           <w:sz w:val="28"/>
-          <w:cs w:val="0"/>
         </w:rPr>
         <w:t>на доработку конфигурации «1С:ERP. Управление холдингом»</w:t>
       </w:r>
@@ -159,27 +151,8 @@
           <w:i w:val="0"/>
           <w:color w:val="000000"/>
           <w:sz w:val="28"/>
-          <w:cs w:val="0"/>
         </w:rPr>
-        <w:t>Установка дат запрета изменения по организациям</w:t>
-      </w:r>
-    </w:p>
-    <w:p>
-      <w:pPr>
-        <w:spacing w:after="480" w:before="0" w:line="360" w:lineRule="auto"/>
-        <w:ind w:firstLine="0"/>
-        <w:jc w:val="center"/>
-      </w:pPr>
-      <w:r>
-        <w:rPr>
-          <w:rFonts w:ascii="Times New Roman" w:hAnsi="Times New Roman" w:eastAsia="Times New Roman"/>
-          <w:b w:val="0"/>
-          <w:i w:val="0"/>
-          <w:color w:val="000000"/>
-          <w:sz w:val="28"/>
-          <w:cs w:val="0"/>
-        </w:rPr>
-        <w:t>(массовая загрузка, автосдвиг, заявка на открытие периода)</w:t>
+        <w:t>Автосдвиг дат запрета изменения и заявка на открытие периода</w:t>
       </w:r>
     </w:p>
     <w:p>
@@ -195,7 +168,6 @@
           <w:i w:val="0"/>
           <w:color w:val="000000"/>
           <w:sz w:val="28"/>
-          <w:cs w:val="0"/>
         </w:rPr>
         <w:t xml:space="preserve">Конфигурация: </w:t>
       </w:r>
@@ -206,7 +178,6 @@
           <w:i w:val="0"/>
           <w:color w:val="000000"/>
           <w:sz w:val="28"/>
-          <w:cs w:val="0"/>
         </w:rPr>
         <w:t>1С:ERP. Управление холдингом, версия 3.2.8.25 (режим совместимости 8.3.27)</w:t>
       </w:r>
@@ -224,7 +195,6 @@
           <w:i w:val="0"/>
           <w:color w:val="000000"/>
           <w:sz w:val="28"/>
-          <w:cs w:val="0"/>
         </w:rPr>
         <w:t xml:space="preserve">Место реализации: </w:t>
       </w:r>
@@ -235,7 +205,6 @@
           <w:i w:val="0"/>
           <w:color w:val="000000"/>
           <w:sz w:val="28"/>
-          <w:cs w:val="0"/>
         </w:rPr>
         <w:t>расширение НП (префикс имен объектов нп_)</w:t>
       </w:r>
@@ -253,7 +222,6 @@
           <w:i w:val="0"/>
           <w:color w:val="000000"/>
           <w:sz w:val="28"/>
-          <w:cs w:val="0"/>
         </w:rPr>
         <w:t xml:space="preserve">Дата: </w:t>
       </w:r>
@@ -264,7 +232,6 @@
           <w:i w:val="0"/>
           <w:color w:val="000000"/>
           <w:sz w:val="28"/>
-          <w:cs w:val="0"/>
         </w:rPr>
         <w:t>18.08.2026</w:t>
       </w:r>
@@ -283,7 +250,6 @@
           <w:i w:val="0"/>
           <w:color w:val="000000"/>
           <w:sz w:val="28"/>
-          <w:cs w:val="0"/>
         </w:rPr>
         <w:t>1. Общие сведения</w:t>
       </w:r>
@@ -302,7 +268,6 @@
           <w:i w:val="0"/>
           <w:color w:val="000000"/>
           <w:sz w:val="28"/>
-          <w:cs w:val="0"/>
         </w:rPr>
         <w:t>1.1. Основание</w:t>
       </w:r>
@@ -320,9 +285,8 @@
           <w:i w:val="0"/>
           <w:color w:val="000000"/>
           <w:sz w:val="28"/>
-          <w:cs w:val="0"/>
         </w:rPr>
-        <w:t>Необходимость упростить для бухгалтерии холдинга работу с типовым механизмом БСП «Даты запрета изменения»: массовая установка по списку организаций, скользящая абсолютная граница «сегодня минус N дней», согласованное временное открытие уже закрытого периода, работа без прав администратора на весь регистр.</w:t>
+        <w:t>Типовой механизм БСП «Даты запрета изменения» проверяет период при записи, но абсолютные даты сами не сдвигаются, а временное открытие уже закрытого периода нельзя согласовать в 1С:Документооборот 3.</w:t>
       </w:r>
     </w:p>
     <w:p>
@@ -339,7 +303,6 @@
           <w:i w:val="0"/>
           <w:color w:val="000000"/>
           <w:sz w:val="28"/>
-          <w:cs w:val="0"/>
         </w:rPr>
         <w:t>1.2. Назначение</w:t>
       </w:r>
@@ -357,9 +320,8 @@
           <w:i w:val="0"/>
           <w:color w:val="000000"/>
           <w:sz w:val="28"/>
-          <w:cs w:val="0"/>
         </w:rPr>
-        <w:t>Доработка предназначена для установки и сопровождения дат запрета изменения по организациям без изменения типовой проверки периода при записи объектов.</w:t>
+        <w:t>Доработка предназначена для автоматического сдвига абсолютной даты запрета («сегодня минус N дней») и для согласованного временного открытия периода по заявке. Типовая проверка периода при записи объектов не изменяется.</w:t>
       </w:r>
     </w:p>
     <w:p>
@@ -376,7 +338,6 @@
           <w:i w:val="0"/>
           <w:color w:val="000000"/>
           <w:sz w:val="28"/>
-          <w:cs w:val="0"/>
         </w:rPr>
         <w:t>1.3. Пользователи</w:t>
       </w:r>
@@ -394,7 +355,6 @@
           <w:i/>
           <w:color w:val="000000"/>
           <w:sz w:val="24"/>
-          <w:cs w:val="0"/>
         </w:rPr>
         <w:t>Таблица 1 - Пользователи доработки</w:t>
       </w:r>
@@ -446,7 +406,6 @@
                 <w:i w:val="0"/>
                 <w:color w:val="000000"/>
                 <w:sz w:val="24"/>
-                <w:cs w:val="0"/>
               </w:rPr>
               <w:t>Роль в процессе</w:t>
             </w:r>
@@ -484,7 +443,6 @@
                 <w:i w:val="0"/>
                 <w:color w:val="000000"/>
                 <w:sz w:val="24"/>
-                <w:cs w:val="0"/>
               </w:rPr>
               <w:t>Действия</w:t>
             </w:r>
@@ -523,9 +481,8 @@
                 <w:i w:val="0"/>
                 <w:color w:val="000000"/>
                 <w:sz w:val="24"/>
-                <w:cs w:val="0"/>
               </w:rPr>
-              <w:t>Бухгалтер (роль нп_УстановкаДатЗапретаПоОрганизациям)</w:t>
+              <w:t>Инициатор заявки</w:t>
             </w:r>
           </w:p>
         </w:tc>
@@ -560,9 +517,8 @@
                 <w:i w:val="0"/>
                 <w:color w:val="000000"/>
                 <w:sz w:val="24"/>
-                <w:cs w:val="0"/>
               </w:rPr>
-              <w:t>форма установки, загрузка из Excel, создание заявки по своим организациям</w:t>
+              <w:t>создание и отправка документа нп_ЗаявкаНаОткрытиеПериода</w:t>
             </w:r>
           </w:p>
         </w:tc>
@@ -599,7 +555,6 @@
                 <w:i w:val="0"/>
                 <w:color w:val="000000"/>
                 <w:sz w:val="24"/>
-                <w:cs w:val="0"/>
               </w:rPr>
               <w:t>Согласующий в 1С:Документооборот 3</w:t>
             </w:r>
@@ -636,9 +591,8 @@
                 <w:i w:val="0"/>
                 <w:color w:val="000000"/>
                 <w:sz w:val="24"/>
-                <w:cs w:val="0"/>
               </w:rPr>
-              <w:t>согласование заявки на открытие периода</w:t>
+              <w:t>согласование заявки</w:t>
             </w:r>
           </w:p>
         </w:tc>
@@ -675,9 +629,8 @@
                 <w:i w:val="0"/>
                 <w:color w:val="000000"/>
                 <w:sz w:val="24"/>
-                <w:cs w:val="0"/>
               </w:rPr>
-              <w:t>Администратор дат запрета (типовые роли регистра сведений)</w:t>
+              <w:t>Администратор дат запрета</w:t>
             </w:r>
           </w:p>
         </w:tc>
@@ -712,9 +665,8 @@
                 <w:i w:val="0"/>
                 <w:color w:val="000000"/>
                 <w:sz w:val="24"/>
-                <w:cs w:val="0"/>
               </w:rPr>
-              <w:t>полный регистр и типовая форма (без изменений в рамках настоящей доработки)</w:t>
+              <w:t>заполнение настроек автосдвига, типовой регистр и типовая форма (без изменений)</w:t>
             </w:r>
           </w:p>
         </w:tc>
@@ -751,7 +703,6 @@
                 <w:i w:val="0"/>
                 <w:color w:val="000000"/>
                 <w:sz w:val="24"/>
-                <w:cs w:val="0"/>
               </w:rPr>
               <w:t>Регламентное задание</w:t>
             </w:r>
@@ -788,9 +739,8 @@
                 <w:i w:val="0"/>
                 <w:color w:val="000000"/>
                 <w:sz w:val="24"/>
-                <w:cs w:val="0"/>
               </w:rPr>
-              <w:t>ночной пересчет абсолютных дат</w:t>
+              <w:t>ночной пересчет абсолютных дат и сопровождение срока действия открытия</w:t>
             </w:r>
           </w:p>
         </w:tc>
@@ -817,9 +767,25 @@
           <w:i w:val="0"/>
           <w:color w:val="000000"/>
           <w:sz w:val="28"/>
-          <w:cs w:val="0"/>
         </w:rPr>
         <w:t>1.4. Вне рамок настоящей доработки</w:t>
+      </w:r>
+    </w:p>
+    <w:p>
+      <w:pPr>
+        <w:spacing w:after="120" w:before="0" w:line="360" w:lineRule="auto"/>
+        <w:ind w:firstLine="709"/>
+        <w:jc w:val="both"/>
+      </w:pPr>
+      <w:r>
+        <w:rPr>
+          <w:rFonts w:ascii="Times New Roman" w:hAnsi="Times New Roman" w:eastAsia="Times New Roman"/>
+          <w:b w:val="0"/>
+          <w:i w:val="0"/>
+          <w:color w:val="000000"/>
+          <w:sz w:val="28"/>
+        </w:rPr>
+        <w:t>Постоянно:</w:t>
       </w:r>
     </w:p>
     <w:p>
@@ -835,7 +801,6 @@
           <w:i w:val="0"/>
           <w:color w:val="000000"/>
           <w:sz w:val="28"/>
-          <w:cs w:val="0"/>
         </w:rPr>
         <w:t>1. Изменение типовых подписок и модулей проверки даты запрета (событие ПередЗаписью).</w:t>
       </w:r>
@@ -853,7 +818,6 @@
           <w:i w:val="0"/>
           <w:color w:val="000000"/>
           <w:sz w:val="28"/>
-          <w:cs w:val="0"/>
         </w:rPr>
         <w:t>2. Новый относительный вариант БСП вида «прошло N дней» в реквизите ОписаниеДатыЗапрета.</w:t>
       </w:r>
@@ -871,7 +835,6 @@
           <w:i w:val="0"/>
           <w:color w:val="000000"/>
           <w:sz w:val="28"/>
-          <w:cs w:val="0"/>
         </w:rPr>
         <w:t>3. Открытие только середины закрытого диапазона (например, открыт только июль при уже закрытом начале августа). Одной датой БСП это невозможно: запрещено все с датой не позднее ДатыЗапрета.</w:t>
       </w:r>
@@ -889,7 +852,6 @@
           <w:i w:val="0"/>
           <w:color w:val="000000"/>
           <w:sz w:val="28"/>
-          <w:cs w:val="0"/>
         </w:rPr>
         <w:t>4. Перезапись персональных дат пользователей, а также разделов «Касса», «Складские операции», «Бюджетирование», «Планирование», «Банк» (банковские счета) при пустом разделе.</w:t>
       </w:r>
@@ -907,9 +869,8 @@
           <w:i w:val="0"/>
           <w:color w:val="000000"/>
           <w:sz w:val="28"/>
-          <w:cs w:val="0"/>
         </w:rPr>
-        <w:t>5. Включение регистра ДатыЗапретаИзменения в типовой список «Загрузка данных из файла» (типовая загрузка работает только со справочниками).</w:t>
+        <w:t>5. Правки форм расширения ТН и обработки нп_ОткрытиеДатЗапретаИзменения.</w:t>
       </w:r>
     </w:p>
     <w:p>
@@ -925,9 +886,25 @@
           <w:i w:val="0"/>
           <w:color w:val="000000"/>
           <w:sz w:val="28"/>
-          <w:cs w:val="0"/>
         </w:rPr>
-        <w:t>6. Правки форм расширения ТН (тн_УстановитьДатуЗапретаДляСпискаОрганизаций, тн_ИзменитьДатыЗапретаПоОрганизации) и обработки нп_ОткрытиеДатЗапретаИзменения.</w:t>
+        <w:t>6. Согласование через подсистему согласования УХ вместо 1С:Документооборот 3.</w:t>
+      </w:r>
+    </w:p>
+    <w:p>
+      <w:pPr>
+        <w:spacing w:after="120" w:before="0" w:line="360" w:lineRule="auto"/>
+        <w:ind w:firstLine="709"/>
+        <w:jc w:val="both"/>
+      </w:pPr>
+      <w:r>
+        <w:rPr>
+          <w:rFonts w:ascii="Times New Roman" w:hAnsi="Times New Roman" w:eastAsia="Times New Roman"/>
+          <w:b w:val="0"/>
+          <w:i w:val="0"/>
+          <w:color w:val="000000"/>
+          <w:sz w:val="28"/>
+        </w:rPr>
+        <w:t>Отложено (возможен возврат отдельным изменением):</w:t>
       </w:r>
     </w:p>
     <w:p>
@@ -943,9 +920,25 @@
           <w:i w:val="0"/>
           <w:color w:val="000000"/>
           <w:sz w:val="28"/>
-          <w:cs w:val="0"/>
         </w:rPr>
-        <w:t>7. Согласование через подсистему согласования УХ вместо 1С:Документооборот 3.</w:t>
+        <w:t>7. Форма бухгалтера без прав на весь типовой регистр и роль нп_УстановкаДатЗапретаПоОрганизациям.</w:t>
+      </w:r>
+    </w:p>
+    <w:p>
+      <w:pPr>
+        <w:spacing w:after="80" w:before="0" w:line="360" w:lineRule="auto"/>
+        <w:ind w:left="709" w:hanging="425"/>
+        <w:jc w:val="both"/>
+      </w:pPr>
+      <w:r>
+        <w:rPr>
+          <w:rFonts w:ascii="Times New Roman" w:hAnsi="Times New Roman" w:eastAsia="Times New Roman"/>
+          <w:b w:val="0"/>
+          <w:i w:val="0"/>
+          <w:color w:val="000000"/>
+          <w:sz w:val="28"/>
+        </w:rPr>
+        <w:t>8. Массовая загрузка из Excel.</w:t>
       </w:r>
     </w:p>
     <w:p>
@@ -962,7 +955,6 @@
           <w:i w:val="0"/>
           <w:color w:val="000000"/>
           <w:sz w:val="28"/>
-          <w:cs w:val="0"/>
         </w:rPr>
         <w:t>2. Характеристика объекта автоматизации</w:t>
       </w:r>
@@ -981,7 +973,6 @@
           <w:i w:val="0"/>
           <w:color w:val="000000"/>
           <w:sz w:val="28"/>
-          <w:cs w:val="0"/>
         </w:rPr>
         <w:t>2.1. Типовой механизм</w:t>
       </w:r>
@@ -999,7 +990,6 @@
           <w:i w:val="0"/>
           <w:color w:val="000000"/>
           <w:sz w:val="28"/>
-          <w:cs w:val="0"/>
         </w:rPr>
         <w:t>Даты запрета хранятся в регистре сведений ДатыЗапретаИзменения.</w:t>
       </w:r>
@@ -1017,7 +1007,6 @@
           <w:i/>
           <w:color w:val="000000"/>
           <w:sz w:val="24"/>
-          <w:cs w:val="0"/>
         </w:rPr>
         <w:t>Таблица 2 - Структура типового регистра сведений ДатыЗапретаИзменения</w:t>
       </w:r>
@@ -1069,7 +1058,6 @@
                 <w:i w:val="0"/>
                 <w:color w:val="000000"/>
                 <w:sz w:val="24"/>
-                <w:cs w:val="0"/>
               </w:rPr>
               <w:t>Измерение (ресурс)</w:t>
             </w:r>
@@ -1107,7 +1095,6 @@
                 <w:i w:val="0"/>
                 <w:color w:val="000000"/>
                 <w:sz w:val="24"/>
-                <w:cs w:val="0"/>
               </w:rPr>
               <w:t>Назначение</w:t>
             </w:r>
@@ -1146,7 +1133,6 @@
                 <w:i w:val="0"/>
                 <w:color w:val="000000"/>
                 <w:sz w:val="24"/>
-                <w:cs w:val="0"/>
               </w:rPr>
               <w:t>Раздел</w:t>
             </w:r>
@@ -1183,7 +1169,6 @@
                 <w:i w:val="0"/>
                 <w:color w:val="000000"/>
                 <w:sz w:val="24"/>
-                <w:cs w:val="0"/>
               </w:rPr>
               <w:t>раздел учета (план видов характеристик РазделыДатЗапретаИзменения)</w:t>
             </w:r>
@@ -1222,7 +1207,6 @@
                 <w:i w:val="0"/>
                 <w:color w:val="000000"/>
                 <w:sz w:val="24"/>
-                <w:cs w:val="0"/>
               </w:rPr>
               <w:t>Объект</w:t>
             </w:r>
@@ -1259,7 +1243,6 @@
                 <w:i w:val="0"/>
                 <w:color w:val="000000"/>
                 <w:sz w:val="24"/>
-                <w:cs w:val="0"/>
               </w:rPr>
               <w:t>организация (для разделов с типом объекта «Организации»)</w:t>
             </w:r>
@@ -1298,7 +1281,6 @@
                 <w:i w:val="0"/>
                 <w:color w:val="000000"/>
                 <w:sz w:val="24"/>
-                <w:cs w:val="0"/>
               </w:rPr>
               <w:t>Пользователь</w:t>
             </w:r>
@@ -1335,7 +1317,6 @@
                 <w:i w:val="0"/>
                 <w:color w:val="000000"/>
                 <w:sz w:val="24"/>
-                <w:cs w:val="0"/>
               </w:rPr>
               <w:t>пользователь либо значение «для всех пользователей»</w:t>
             </w:r>
@@ -1374,7 +1355,6 @@
                 <w:i w:val="0"/>
                 <w:color w:val="000000"/>
                 <w:sz w:val="24"/>
-                <w:cs w:val="0"/>
               </w:rPr>
               <w:t>ДатаЗапрета</w:t>
             </w:r>
@@ -1411,7 +1391,6 @@
                 <w:i w:val="0"/>
                 <w:color w:val="000000"/>
                 <w:sz w:val="24"/>
-                <w:cs w:val="0"/>
               </w:rPr>
               <w:t>граница: запрещено изменение объектов с датой не позднее этой границы</w:t>
             </w:r>
@@ -1450,7 +1429,6 @@
                 <w:i w:val="0"/>
                 <w:color w:val="000000"/>
                 <w:sz w:val="24"/>
-                <w:cs w:val="0"/>
               </w:rPr>
               <w:t>ОписаниеДатыЗапрета</w:t>
             </w:r>
@@ -1487,7 +1465,6 @@
                 <w:i w:val="0"/>
                 <w:color w:val="000000"/>
                 <w:sz w:val="24"/>
-                <w:cs w:val="0"/>
               </w:rPr>
               <w:t>относительный вариант БСП либо произвольная дата</w:t>
             </w:r>
@@ -1515,7 +1492,6 @@
           <w:i w:val="0"/>
           <w:color w:val="000000"/>
           <w:sz w:val="28"/>
-          <w:cs w:val="0"/>
         </w:rPr>
         <w:t>Проверка односторонняя. Произвольная абсолютная дата не имеет отсрочки (КоличествоДнейРазрешения равно 0).</w:t>
       </w:r>
@@ -1534,7 +1510,6 @@
           <w:i w:val="0"/>
           <w:color w:val="000000"/>
           <w:sz w:val="28"/>
-          <w:cs w:val="0"/>
         </w:rPr>
         <w:t>2.2. Принцип настоящей доработки</w:t>
       </w:r>
@@ -1552,9 +1527,8 @@
           <w:i w:val="0"/>
           <w:color w:val="000000"/>
           <w:sz w:val="28"/>
-          <w:cs w:val="0"/>
         </w:rPr>
-        <w:t>Эффективная отсечка по-прежнему хранится только в типовом регистре. Новые объекты расширения задают, какие абсолютные значения туда записывать и когда. Параллельный регистр исключений не создается.</w:t>
+        <w:t>Эффективная отсечка хранится только в типовом регистре. Новые объекты расширения задают, какие абсолютные значения туда записывать и когда. Параллельный регистр исключений не создается.</w:t>
       </w:r>
     </w:p>
     <w:p>
@@ -1571,7 +1545,6 @@
           <w:i w:val="0"/>
           <w:color w:val="000000"/>
           <w:sz w:val="28"/>
-          <w:cs w:val="0"/>
         </w:rPr>
         <w:t>3. Общие требования к доработке</w:t>
       </w:r>
@@ -1589,7 +1562,6 @@
           <w:i w:val="0"/>
           <w:color w:val="000000"/>
           <w:sz w:val="28"/>
-          <w:cs w:val="0"/>
         </w:rPr>
         <w:t>1. Реализовать в расширении НП. Префикс объектов: нп_.</w:t>
       </w:r>
@@ -1607,7 +1579,6 @@
           <w:i w:val="0"/>
           <w:color w:val="000000"/>
           <w:sz w:val="28"/>
-          <w:cs w:val="0"/>
         </w:rPr>
         <w:t>2. Не изменять типовую проверку даты запрета при записи документов и справочников.</w:t>
       </w:r>
@@ -1625,7 +1596,6 @@
           <w:i w:val="0"/>
           <w:color w:val="000000"/>
           <w:sz w:val="28"/>
-          <w:cs w:val="0"/>
         </w:rPr>
         <w:t>3. Записывать в типовой регистр сведений только ключи настоящего механизма (см. п. 4).</w:t>
       </w:r>
@@ -1643,7 +1613,6 @@
           <w:i w:val="0"/>
           <w:color w:val="000000"/>
           <w:sz w:val="28"/>
-          <w:cs w:val="0"/>
         </w:rPr>
         <w:t>4. Не копировать и не изменять формы ТН на типовом регистре.</w:t>
       </w:r>
@@ -1661,7 +1630,6 @@
           <w:i w:val="0"/>
           <w:color w:val="000000"/>
           <w:sz w:val="28"/>
-          <w:cs w:val="0"/>
         </w:rPr>
         <w:t>5. Интеграцию с 1С:Документооборот 3 выполнять штатными средствами БИД: модули ИнтеграцияС1СДокументооборот3, регистры ОбъектыИнтегрированныеС1СДокументооборотом и СостоянияСогласованияВДокументообороте.</w:t>
       </w:r>
@@ -1679,7 +1647,6 @@
           <w:i w:val="0"/>
           <w:color w:val="000000"/>
           <w:sz w:val="28"/>
-          <w:cs w:val="0"/>
         </w:rPr>
         <w:t>6. После набора записей в типовой регистр сведений вызывать типовое обновление действующих дат запрета (сброс кэша версии).</w:t>
       </w:r>
@@ -1697,9 +1664,8 @@
           <w:i w:val="0"/>
           <w:color w:val="000000"/>
           <w:sz w:val="28"/>
-          <w:cs w:val="0"/>
         </w:rPr>
-        <w:t>7. Привилегированная запись в типовой регистр сведений допускается только после серверной проверки списка организаций пользователя (для интерактивных действий) либо в контексте регламентного задания (для автосдвига и сопровождения окна заявки).</w:t>
+        <w:t>7. Запись в типовой регистр выполняется регламентным заданием и серверной логикой после состояния «Согласован». Интерактивная запись типового регистра из формы бухгалтера в этой очереди не делается.</w:t>
       </w:r>
     </w:p>
     <w:p>
@@ -1715,9 +1681,8 @@
           <w:i w:val="0"/>
           <w:color w:val="000000"/>
           <w:sz w:val="28"/>
-          <w:cs w:val="0"/>
         </w:rPr>
-        <w:t>8. Факты записи (организация, старая и новая дата, режим: сдвиг, окно заявки, разовая установка) фиксировать в журнале регистрации.</w:t>
+        <w:t>8. Факты записи (организация, старая и новая дата, режим: автосдвиг или заявка) фиксировать в журнале регистрации.</w:t>
       </w:r>
     </w:p>
     <w:p>
@@ -1734,7 +1699,6 @@
           <w:i w:val="0"/>
           <w:color w:val="000000"/>
           <w:sz w:val="28"/>
-          <w:cs w:val="0"/>
         </w:rPr>
         <w:t>4. Правила записи в типовой регистр</w:t>
       </w:r>
@@ -1752,7 +1716,6 @@
           <w:i w:val="0"/>
           <w:color w:val="000000"/>
           <w:sz w:val="28"/>
-          <w:cs w:val="0"/>
         </w:rPr>
         <w:t>Настоящий механизм создает и изменяет только следующие ключи:</w:t>
       </w:r>
@@ -1770,7 +1733,6 @@
           <w:i/>
           <w:color w:val="000000"/>
           <w:sz w:val="24"/>
-          <w:cs w:val="0"/>
         </w:rPr>
         <w:t>Таблица 3 - Ключи записей механизма в типовом регистре</w:t>
       </w:r>
@@ -1822,7 +1784,6 @@
                 <w:i w:val="0"/>
                 <w:color w:val="000000"/>
                 <w:sz w:val="24"/>
-                <w:cs w:val="0"/>
               </w:rPr>
               <w:t>Поле</w:t>
             </w:r>
@@ -1860,7 +1821,6 @@
                 <w:i w:val="0"/>
                 <w:color w:val="000000"/>
                 <w:sz w:val="24"/>
-                <w:cs w:val="0"/>
               </w:rPr>
               <w:t>Значение</w:t>
             </w:r>
@@ -1899,7 +1859,6 @@
                 <w:i w:val="0"/>
                 <w:color w:val="000000"/>
                 <w:sz w:val="24"/>
-                <w:cs w:val="0"/>
               </w:rPr>
               <w:t>Раздел</w:t>
             </w:r>
@@ -1936,7 +1895,6 @@
                 <w:i w:val="0"/>
                 <w:color w:val="000000"/>
                 <w:sz w:val="24"/>
-                <w:cs w:val="0"/>
               </w:rPr>
               <w:t>выбранный раздел с типом объекта СправочникСсылка.Организации либо (если раздел не указан) все такие разделы</w:t>
             </w:r>
@@ -1975,7 +1933,6 @@
                 <w:i w:val="0"/>
                 <w:color w:val="000000"/>
                 <w:sz w:val="24"/>
-                <w:cs w:val="0"/>
               </w:rPr>
               <w:t>Объект</w:t>
             </w:r>
@@ -2012,9 +1969,8 @@
                 <w:i w:val="0"/>
                 <w:color w:val="000000"/>
                 <w:sz w:val="24"/>
-                <w:cs w:val="0"/>
               </w:rPr>
-              <w:t>организация из формы, файла Excel, заявки или настройки автосдвига</w:t>
+              <w:t>организация из заявки или настройки автосдвига</w:t>
             </w:r>
           </w:p>
         </w:tc>
@@ -2051,7 +2007,6 @@
                 <w:i w:val="0"/>
                 <w:color w:val="000000"/>
                 <w:sz w:val="24"/>
-                <w:cs w:val="0"/>
               </w:rPr>
               <w:t>Пользователь</w:t>
             </w:r>
@@ -2088,7 +2043,6 @@
                 <w:i w:val="0"/>
                 <w:color w:val="000000"/>
                 <w:sz w:val="24"/>
-                <w:cs w:val="0"/>
               </w:rPr>
               <w:t>«для всех пользователей»</w:t>
             </w:r>
@@ -2127,7 +2081,6 @@
                 <w:i w:val="0"/>
                 <w:color w:val="000000"/>
                 <w:sz w:val="24"/>
-                <w:cs w:val="0"/>
               </w:rPr>
               <w:t>ДатаЗапрета</w:t>
             </w:r>
@@ -2164,7 +2117,6 @@
                 <w:i w:val="0"/>
                 <w:color w:val="000000"/>
                 <w:sz w:val="24"/>
-                <w:cs w:val="0"/>
               </w:rPr>
               <w:t>абсолютная дата (начало дня)</w:t>
             </w:r>
@@ -2203,7 +2155,6 @@
                 <w:i w:val="0"/>
                 <w:color w:val="000000"/>
                 <w:sz w:val="24"/>
-                <w:cs w:val="0"/>
               </w:rPr>
               <w:t>ОписаниеДатыЗапрета</w:t>
             </w:r>
@@ -2240,7 +2191,6 @@
                 <w:i w:val="0"/>
                 <w:color w:val="000000"/>
                 <w:sz w:val="24"/>
-                <w:cs w:val="0"/>
               </w:rPr>
               <w:t>пусто либо «произвольная дата»; относительные варианты БСП не использовать</w:t>
             </w:r>
@@ -2268,7 +2218,6 @@
           <w:i w:val="0"/>
           <w:color w:val="000000"/>
           <w:sz w:val="28"/>
-          <w:cs w:val="0"/>
         </w:rPr>
         <w:t>Запрещается:</w:t>
       </w:r>
@@ -2286,7 +2235,6 @@
           <w:i w:val="0"/>
           <w:color w:val="000000"/>
           <w:sz w:val="28"/>
-          <w:cs w:val="0"/>
         </w:rPr>
         <w:t>- изменять строки с конкретным пользователем;</w:t>
       </w:r>
@@ -2304,7 +2252,6 @@
           <w:i w:val="0"/>
           <w:color w:val="000000"/>
           <w:sz w:val="28"/>
-          <w:cs w:val="0"/>
         </w:rPr>
         <w:t>- при пустом разделе заполнять разделы, у которых тип объекта не «Организации» (касса, склады, сценарии, банковские счета);</w:t>
       </w:r>
@@ -2322,7 +2269,6 @@
           <w:i w:val="0"/>
           <w:color w:val="000000"/>
           <w:sz w:val="28"/>
-          <w:cs w:val="0"/>
         </w:rPr>
         <w:t>- затирать чужие относительные даты БСП на ключах, которыми механизм не владеет.</w:t>
       </w:r>
@@ -2340,7 +2286,6 @@
           <w:i w:val="0"/>
           <w:color w:val="000000"/>
           <w:sz w:val="28"/>
-          <w:cs w:val="0"/>
         </w:rPr>
         <w:t>Примечание. Индивидуальная дата пользователя в БСП по-прежнему перекрывает дату «для всех пользователей». Заявка и автосдвиг такие строки не открывают и не сдвигают.</w:t>
       </w:r>
@@ -2359,7 +2304,6 @@
           <w:i w:val="0"/>
           <w:color w:val="000000"/>
           <w:sz w:val="28"/>
-          <w:cs w:val="0"/>
         </w:rPr>
         <w:t>5. Состав объектов метаданных</w:t>
       </w:r>
@@ -2377,7 +2321,6 @@
           <w:i/>
           <w:color w:val="000000"/>
           <w:sz w:val="24"/>
-          <w:cs w:val="0"/>
         </w:rPr>
         <w:t>Таблица 4 - Объекты расширения НП</w:t>
       </w:r>
@@ -2430,7 +2373,6 @@
                 <w:i w:val="0"/>
                 <w:color w:val="000000"/>
                 <w:sz w:val="24"/>
-                <w:cs w:val="0"/>
               </w:rPr>
               <w:t>Вид объекта</w:t>
             </w:r>
@@ -2468,7 +2410,6 @@
                 <w:i w:val="0"/>
                 <w:color w:val="000000"/>
                 <w:sz w:val="24"/>
-                <w:cs w:val="0"/>
               </w:rPr>
               <w:t>Имя</w:t>
             </w:r>
@@ -2506,7 +2447,6 @@
                 <w:i w:val="0"/>
                 <w:color w:val="000000"/>
                 <w:sz w:val="24"/>
-                <w:cs w:val="0"/>
               </w:rPr>
               <w:t>Назначение</w:t>
             </w:r>
@@ -2545,120 +2485,6 @@
                 <w:i w:val="0"/>
                 <w:color w:val="000000"/>
                 <w:sz w:val="24"/>
-                <w:cs w:val="0"/>
-              </w:rPr>
-              <w:t>Роль</w:t>
-            </w:r>
-          </w:p>
-        </w:tc>
-        <w:tc>
-          <w:tcPr>
-            <w:tcW w:type="dxa" w:w="3118"/>
-            <w:vAlign w:val="center"/>
-            <w:tcBorders>
-              <w:top w:val="single" w:sz="8" w:space="0" w:color="000000"/>
-              <w:left w:val="single" w:sz="8" w:space="0" w:color="000000"/>
-              <w:bottom w:val="single" w:sz="8" w:space="0" w:color="000000"/>
-              <w:right w:val="single" w:sz="8" w:space="0" w:color="000000"/>
-            </w:tcBorders>
-            <w:tcMar>
-              <w:top w:w="45" w:type="dxa"/>
-              <w:left w:w="45" w:type="dxa"/>
-              <w:bottom w:w="45" w:type="dxa"/>
-              <w:right w:w="45" w:type="dxa"/>
-            </w:tcMar>
-          </w:tcPr>
-          <w:p>
-            <w:pPr>
-              <w:spacing w:after="0" w:before="0" w:line="240" w:lineRule="auto"/>
-              <w:ind w:firstLine="0"/>
-              <w:jc w:val="left"/>
-            </w:pPr>
-            <w:r/>
-            <w:r>
-              <w:rPr>
-                <w:rFonts w:ascii="Times New Roman" w:hAnsi="Times New Roman" w:eastAsia="Times New Roman"/>
-                <w:b w:val="0"/>
-                <w:i w:val="0"/>
-                <w:color w:val="000000"/>
-                <w:sz w:val="24"/>
-                <w:cs w:val="0"/>
-              </w:rPr>
-              <w:t>нп_УстановкаДатЗапретаПоОрганизациям</w:t>
-            </w:r>
-          </w:p>
-        </w:tc>
-        <w:tc>
-          <w:tcPr>
-            <w:tcW w:type="dxa" w:w="3969"/>
-            <w:vAlign w:val="center"/>
-            <w:tcBorders>
-              <w:top w:val="single" w:sz="8" w:space="0" w:color="000000"/>
-              <w:left w:val="single" w:sz="8" w:space="0" w:color="000000"/>
-              <w:bottom w:val="single" w:sz="8" w:space="0" w:color="000000"/>
-              <w:right w:val="single" w:sz="8" w:space="0" w:color="000000"/>
-            </w:tcBorders>
-            <w:tcMar>
-              <w:top w:w="45" w:type="dxa"/>
-              <w:left w:w="45" w:type="dxa"/>
-              <w:bottom w:w="45" w:type="dxa"/>
-              <w:right w:w="45" w:type="dxa"/>
-            </w:tcMar>
-          </w:tcPr>
-          <w:p>
-            <w:pPr>
-              <w:spacing w:after="0" w:before="0" w:line="240" w:lineRule="auto"/>
-              <w:ind w:firstLine="0"/>
-              <w:jc w:val="left"/>
-            </w:pPr>
-            <w:r/>
-            <w:r>
-              <w:rPr>
-                <w:rFonts w:ascii="Times New Roman" w:hAnsi="Times New Roman" w:eastAsia="Times New Roman"/>
-                <w:b w:val="0"/>
-                <w:i w:val="0"/>
-                <w:color w:val="000000"/>
-                <w:sz w:val="24"/>
-                <w:cs w:val="0"/>
-              </w:rPr>
-              <w:t>доступ к обработке, документу заявки, регистру настроек автосдвига; без прав на весь типовой регистр и типовую форму администрирования</w:t>
-            </w:r>
-          </w:p>
-        </w:tc>
-      </w:tr>
-      <w:tr>
-        <w:tc>
-          <w:tcPr>
-            <w:tcW w:type="dxa" w:w="2268"/>
-            <w:vAlign w:val="center"/>
-            <w:tcBorders>
-              <w:top w:val="single" w:sz="8" w:space="0" w:color="000000"/>
-              <w:left w:val="single" w:sz="8" w:space="0" w:color="000000"/>
-              <w:bottom w:val="single" w:sz="8" w:space="0" w:color="000000"/>
-              <w:right w:val="single" w:sz="8" w:space="0" w:color="000000"/>
-            </w:tcBorders>
-            <w:tcMar>
-              <w:top w:w="45" w:type="dxa"/>
-              <w:left w:w="45" w:type="dxa"/>
-              <w:bottom w:w="45" w:type="dxa"/>
-              <w:right w:w="45" w:type="dxa"/>
-            </w:tcMar>
-          </w:tcPr>
-          <w:p>
-            <w:pPr>
-              <w:spacing w:after="0" w:before="0" w:line="240" w:lineRule="auto"/>
-              <w:ind w:firstLine="0"/>
-              <w:jc w:val="left"/>
-            </w:pPr>
-            <w:r/>
-            <w:r>
-              <w:rPr>
-                <w:rFonts w:ascii="Times New Roman" w:hAnsi="Times New Roman" w:eastAsia="Times New Roman"/>
-                <w:b w:val="0"/>
-                <w:i w:val="0"/>
-                <w:color w:val="000000"/>
-                <w:sz w:val="24"/>
-                <w:cs w:val="0"/>
               </w:rPr>
               <w:t>Регистр сведений</w:t>
             </w:r>
@@ -2695,7 +2521,6 @@
                 <w:i w:val="0"/>
                 <w:color w:val="000000"/>
                 <w:sz w:val="24"/>
-                <w:cs w:val="0"/>
               </w:rPr>
               <w:t>нп_НастройкиАвтосдвигаДатЗапрета</w:t>
             </w:r>
@@ -2732,7 +2557,6 @@
                 <w:i w:val="0"/>
                 <w:color w:val="000000"/>
                 <w:sz w:val="24"/>
-                <w:cs w:val="0"/>
               </w:rPr>
               <w:t>организация, число дней N, признак включения</w:t>
             </w:r>
@@ -2771,7 +2595,6 @@
                 <w:i w:val="0"/>
                 <w:color w:val="000000"/>
                 <w:sz w:val="24"/>
-                <w:cs w:val="0"/>
               </w:rPr>
               <w:t>Документ</w:t>
             </w:r>
@@ -2808,7 +2631,6 @@
                 <w:i w:val="0"/>
                 <w:color w:val="000000"/>
                 <w:sz w:val="24"/>
-                <w:cs w:val="0"/>
               </w:rPr>
               <w:t>нп_ЗаявкаНаОткрытиеПериода</w:t>
             </w:r>
@@ -2845,7 +2667,6 @@
                 <w:i w:val="0"/>
                 <w:color w:val="000000"/>
                 <w:sz w:val="24"/>
-                <w:cs w:val="0"/>
               </w:rPr>
               <w:t>заявка на временное открытие периода, объект бесшовной интеграции с 1С:Документооборот 3</w:t>
             </w:r>
@@ -2884,120 +2705,6 @@
                 <w:i w:val="0"/>
                 <w:color w:val="000000"/>
                 <w:sz w:val="24"/>
-                <w:cs w:val="0"/>
-              </w:rPr>
-              <w:t>Обработка</w:t>
-            </w:r>
-          </w:p>
-        </w:tc>
-        <w:tc>
-          <w:tcPr>
-            <w:tcW w:type="dxa" w:w="3118"/>
-            <w:vAlign w:val="center"/>
-            <w:tcBorders>
-              <w:top w:val="single" w:sz="8" w:space="0" w:color="000000"/>
-              <w:left w:val="single" w:sz="8" w:space="0" w:color="000000"/>
-              <w:bottom w:val="single" w:sz="8" w:space="0" w:color="000000"/>
-              <w:right w:val="single" w:sz="8" w:space="0" w:color="000000"/>
-            </w:tcBorders>
-            <w:tcMar>
-              <w:top w:w="45" w:type="dxa"/>
-              <w:left w:w="45" w:type="dxa"/>
-              <w:bottom w:w="45" w:type="dxa"/>
-              <w:right w:w="45" w:type="dxa"/>
-            </w:tcMar>
-          </w:tcPr>
-          <w:p>
-            <w:pPr>
-              <w:spacing w:after="0" w:before="0" w:line="240" w:lineRule="auto"/>
-              <w:ind w:firstLine="0"/>
-              <w:jc w:val="left"/>
-            </w:pPr>
-            <w:r/>
-            <w:r>
-              <w:rPr>
-                <w:rFonts w:ascii="Times New Roman" w:hAnsi="Times New Roman" w:eastAsia="Times New Roman"/>
-                <w:b w:val="0"/>
-                <w:i w:val="0"/>
-                <w:color w:val="000000"/>
-                <w:sz w:val="24"/>
-                <w:cs w:val="0"/>
-              </w:rPr>
-              <w:t>нп_УстановкаДатЗапретаИзменения</w:t>
-            </w:r>
-          </w:p>
-        </w:tc>
-        <w:tc>
-          <w:tcPr>
-            <w:tcW w:type="dxa" w:w="3969"/>
-            <w:vAlign w:val="center"/>
-            <w:tcBorders>
-              <w:top w:val="single" w:sz="8" w:space="0" w:color="000000"/>
-              <w:left w:val="single" w:sz="8" w:space="0" w:color="000000"/>
-              <w:bottom w:val="single" w:sz="8" w:space="0" w:color="000000"/>
-              <w:right w:val="single" w:sz="8" w:space="0" w:color="000000"/>
-            </w:tcBorders>
-            <w:tcMar>
-              <w:top w:w="45" w:type="dxa"/>
-              <w:left w:w="45" w:type="dxa"/>
-              <w:bottom w:w="45" w:type="dxa"/>
-              <w:right w:w="45" w:type="dxa"/>
-            </w:tcMar>
-          </w:tcPr>
-          <w:p>
-            <w:pPr>
-              <w:spacing w:after="0" w:before="0" w:line="240" w:lineRule="auto"/>
-              <w:ind w:firstLine="0"/>
-              <w:jc w:val="left"/>
-            </w:pPr>
-            <w:r/>
-            <w:r>
-              <w:rPr>
-                <w:rFonts w:ascii="Times New Roman" w:hAnsi="Times New Roman" w:eastAsia="Times New Roman"/>
-                <w:b w:val="0"/>
-                <w:i w:val="0"/>
-                <w:color w:val="000000"/>
-                <w:sz w:val="24"/>
-                <w:cs w:val="0"/>
-              </w:rPr>
-              <w:t>форма бухгалтера, загрузка из Excel, создание заявки</w:t>
-            </w:r>
-          </w:p>
-        </w:tc>
-      </w:tr>
-      <w:tr>
-        <w:tc>
-          <w:tcPr>
-            <w:tcW w:type="dxa" w:w="2268"/>
-            <w:vAlign w:val="center"/>
-            <w:tcBorders>
-              <w:top w:val="single" w:sz="8" w:space="0" w:color="000000"/>
-              <w:left w:val="single" w:sz="8" w:space="0" w:color="000000"/>
-              <w:bottom w:val="single" w:sz="8" w:space="0" w:color="000000"/>
-              <w:right w:val="single" w:sz="8" w:space="0" w:color="000000"/>
-            </w:tcBorders>
-            <w:tcMar>
-              <w:top w:w="45" w:type="dxa"/>
-              <w:left w:w="45" w:type="dxa"/>
-              <w:bottom w:w="45" w:type="dxa"/>
-              <w:right w:w="45" w:type="dxa"/>
-            </w:tcMar>
-          </w:tcPr>
-          <w:p>
-            <w:pPr>
-              <w:spacing w:after="0" w:before="0" w:line="240" w:lineRule="auto"/>
-              <w:ind w:firstLine="0"/>
-              <w:jc w:val="left"/>
-            </w:pPr>
-            <w:r/>
-            <w:r>
-              <w:rPr>
-                <w:rFonts w:ascii="Times New Roman" w:hAnsi="Times New Roman" w:eastAsia="Times New Roman"/>
-                <w:b w:val="0"/>
-                <w:i w:val="0"/>
-                <w:color w:val="000000"/>
-                <w:sz w:val="24"/>
-                <w:cs w:val="0"/>
               </w:rPr>
               <w:t>Регламентное задание</w:t>
             </w:r>
@@ -3034,7 +2741,6 @@
                 <w:i w:val="0"/>
                 <w:color w:val="000000"/>
                 <w:sz w:val="24"/>
-                <w:cs w:val="0"/>
               </w:rPr>
               <w:t>нп_СдвигДатЗапретаИзменения</w:t>
             </w:r>
@@ -3071,7 +2777,6 @@
                 <w:i w:val="0"/>
                 <w:color w:val="000000"/>
                 <w:sz w:val="24"/>
-                <w:cs w:val="0"/>
               </w:rPr>
               <w:t>ночной пересчет абсолютных дат</w:t>
             </w:r>
@@ -3110,7 +2815,6 @@
                 <w:i w:val="0"/>
                 <w:color w:val="000000"/>
                 <w:sz w:val="24"/>
-                <w:cs w:val="0"/>
               </w:rPr>
               <w:t>Общий модуль</w:t>
             </w:r>
@@ -3147,7 +2851,6 @@
                 <w:i w:val="0"/>
                 <w:color w:val="000000"/>
                 <w:sz w:val="24"/>
-                <w:cs w:val="0"/>
               </w:rPr>
               <w:t>нп_ДатыЗапретаИзменения</w:t>
             </w:r>
@@ -3184,9 +2887,8 @@
                 <w:i w:val="0"/>
                 <w:color w:val="000000"/>
                 <w:sz w:val="24"/>
-                <w:cs w:val="0"/>
               </w:rPr>
-              <w:t>запись ключей, проверка организаций, автосдвиг, окно заявки</w:t>
+              <w:t>запись ключей, автосдвиг, срок действия открытого периода</w:t>
             </w:r>
           </w:p>
         </w:tc>
@@ -3212,9 +2914,8 @@
           <w:i w:val="0"/>
           <w:color w:val="000000"/>
           <w:sz w:val="28"/>
-          <w:cs w:val="0"/>
         </w:rPr>
-        <w:t>Опционально допускается сборка внешней обработки (файл epf) по аналогии с обработкой нп_ОткрытиеДатЗапретаИзменения.</w:t>
+        <w:t>Документ заявки для интеграции с Документооборотом достаточно записывать. Проведение не является обязательным условием отправки на согласование.</w:t>
       </w:r>
     </w:p>
     <w:p>
@@ -3230,9 +2931,8 @@
           <w:i w:val="0"/>
           <w:color w:val="000000"/>
           <w:sz w:val="28"/>
-          <w:cs w:val="0"/>
         </w:rPr>
-        <w:t>Документ заявки для бесшовной интеграции достаточно записывать. Проведение не является обязательным условием отправки на согласование.</w:t>
+        <w:t>Обработка нп_УстановкаДатЗапретаИзменения и роль нп_УстановкаДатЗапретаПоОрганизациям в этой очереди не создаются.</w:t>
       </w:r>
     </w:p>
     <w:p>
@@ -3249,9 +2949,8 @@
           <w:i w:val="0"/>
           <w:color w:val="000000"/>
           <w:sz w:val="28"/>
-          <w:cs w:val="0"/>
         </w:rPr>
-        <w:t>6. Требования к форме бухгалтера</w:t>
+        <w:t>6. Требования к автосдвигу дат</w:t>
       </w:r>
     </w:p>
     <w:p>
@@ -3268,9 +2967,8 @@
           <w:i w:val="0"/>
           <w:color w:val="000000"/>
           <w:sz w:val="28"/>
-          <w:cs w:val="0"/>
         </w:rPr>
-        <w:t>6.1. Назначение</w:t>
+        <w:t>6.1. Настройки</w:t>
       </w:r>
     </w:p>
     <w:p>
@@ -3286,1334 +2984,6 @@
           <w:i w:val="0"/>
           <w:color w:val="000000"/>
           <w:sz w:val="28"/>
-          <w:cs w:val="0"/>
-        </w:rPr>
-        <w:t>Предоставить бухгалтеру установку дат по своим организациям без роли на весь регистр ДатыЗапретаИзменения и без открытия типовой формы администрирования.</w:t>
-      </w:r>
-    </w:p>
-    <w:p>
-      <w:pPr>
-        <w:keepNext/>
-        <w:spacing w:after="160" w:before="240" w:line="360" w:lineRule="auto"/>
-        <w:ind w:firstLine="0"/>
-        <w:jc w:val="left"/>
-      </w:pPr>
-      <w:r>
-        <w:rPr>
-          <w:rFonts w:ascii="Times New Roman" w:hAnsi="Times New Roman" w:eastAsia="Times New Roman"/>
-          <w:b/>
-          <w:i w:val="0"/>
-          <w:color w:val="000000"/>
-          <w:sz w:val="28"/>
-          <w:cs w:val="0"/>
-        </w:rPr>
-        <w:t>6.2. Состав формы обработки нп_УстановкаДатЗапретаИзменения</w:t>
-      </w:r>
-    </w:p>
-    <w:p>
-      <w:pPr>
-        <w:spacing w:after="80" w:before="0" w:line="360" w:lineRule="auto"/>
-        <w:ind w:left="709" w:hanging="425"/>
-        <w:jc w:val="both"/>
-      </w:pPr>
-      <w:r>
-        <w:rPr>
-          <w:rFonts w:ascii="Times New Roman" w:hAnsi="Times New Roman" w:eastAsia="Times New Roman"/>
-          <w:b w:val="0"/>
-          <w:i w:val="0"/>
-          <w:color w:val="000000"/>
-          <w:sz w:val="28"/>
-          <w:cs w:val="0"/>
-        </w:rPr>
-        <w:t>1. Список доступных организаций.</w:t>
-      </w:r>
-    </w:p>
-    <w:p>
-      <w:pPr>
-        <w:spacing w:after="80" w:before="0" w:line="360" w:lineRule="auto"/>
-        <w:ind w:left="709" w:hanging="425"/>
-        <w:jc w:val="both"/>
-      </w:pPr>
-      <w:r>
-        <w:rPr>
-          <w:rFonts w:ascii="Times New Roman" w:hAnsi="Times New Roman" w:eastAsia="Times New Roman"/>
-          <w:b w:val="0"/>
-          <w:i w:val="0"/>
-          <w:color w:val="000000"/>
-          <w:sz w:val="28"/>
-          <w:cs w:val="0"/>
-        </w:rPr>
-        <w:t>2. Число дней автосдвига N и признак включения автосдвига.</w:t>
-      </w:r>
-    </w:p>
-    <w:p>
-      <w:pPr>
-        <w:spacing w:after="80" w:before="0" w:line="360" w:lineRule="auto"/>
-        <w:ind w:left="709" w:hanging="425"/>
-        <w:jc w:val="both"/>
-      </w:pPr>
-      <w:r>
-        <w:rPr>
-          <w:rFonts w:ascii="Times New Roman" w:hAnsi="Times New Roman" w:eastAsia="Times New Roman"/>
-          <w:b w:val="0"/>
-          <w:i w:val="0"/>
-          <w:color w:val="000000"/>
-          <w:sz w:val="28"/>
-          <w:cs w:val="0"/>
-        </w:rPr>
-        <w:t>3. Команда загрузки из Excel (табличного документа).</w:t>
-      </w:r>
-    </w:p>
-    <w:p>
-      <w:pPr>
-        <w:spacing w:after="80" w:before="0" w:line="360" w:lineRule="auto"/>
-        <w:ind w:left="709" w:hanging="425"/>
-        <w:jc w:val="both"/>
-      </w:pPr>
-      <w:r>
-        <w:rPr>
-          <w:rFonts w:ascii="Times New Roman" w:hAnsi="Times New Roman" w:eastAsia="Times New Roman"/>
-          <w:b w:val="0"/>
-          <w:i w:val="0"/>
-          <w:color w:val="000000"/>
-          <w:sz w:val="28"/>
-          <w:cs w:val="0"/>
-        </w:rPr>
-        <w:t>4. Команда применения настроек или разовой даты.</w:t>
-      </w:r>
-    </w:p>
-    <w:p>
-      <w:pPr>
-        <w:spacing w:after="80" w:before="0" w:line="360" w:lineRule="auto"/>
-        <w:ind w:left="709" w:hanging="425"/>
-        <w:jc w:val="both"/>
-      </w:pPr>
-      <w:r>
-        <w:rPr>
-          <w:rFonts w:ascii="Times New Roman" w:hAnsi="Times New Roman" w:eastAsia="Times New Roman"/>
-          <w:b w:val="0"/>
-          <w:i w:val="0"/>
-          <w:color w:val="000000"/>
-          <w:sz w:val="28"/>
-          <w:cs w:val="0"/>
-        </w:rPr>
-        <w:t>5. Команда создания документа нп_ЗаявкаНаОткрытиеПериода с подстановкой выбранных организаций.</w:t>
-      </w:r>
-    </w:p>
-    <w:p>
-      <w:pPr>
-        <w:spacing w:after="80" w:before="0" w:line="360" w:lineRule="auto"/>
-        <w:ind w:left="709" w:hanging="425"/>
-        <w:jc w:val="both"/>
-      </w:pPr>
-      <w:r>
-        <w:rPr>
-          <w:rFonts w:ascii="Times New Roman" w:hAnsi="Times New Roman" w:eastAsia="Times New Roman"/>
-          <w:b w:val="0"/>
-          <w:i w:val="0"/>
-          <w:color w:val="000000"/>
-          <w:sz w:val="28"/>
-          <w:cs w:val="0"/>
-        </w:rPr>
-        <w:t>6. Протокол ошибок (построчно при загрузке).</w:t>
-      </w:r>
-    </w:p>
-    <w:p>
-      <w:pPr>
-        <w:spacing w:after="120" w:before="0" w:line="360" w:lineRule="auto"/>
-        <w:ind w:firstLine="709"/>
-        <w:jc w:val="both"/>
-      </w:pPr>
-      <w:r>
-        <w:rPr>
-          <w:rFonts w:ascii="Times New Roman" w:hAnsi="Times New Roman" w:eastAsia="Times New Roman"/>
-          <w:b w:val="0"/>
-          <w:i w:val="0"/>
-          <w:color w:val="000000"/>
-          <w:sz w:val="28"/>
-          <w:cs w:val="0"/>
-        </w:rPr>
-        <w:t>Типовая форма РегистрСведений.ДатыЗапретаИзменения.Форма.ДатыЗапретаИзменения из обработки не открывается.</w:t>
-      </w:r>
-    </w:p>
-    <w:p>
-      <w:pPr>
-        <w:keepNext/>
-        <w:spacing w:after="160" w:before="240" w:line="360" w:lineRule="auto"/>
-        <w:ind w:firstLine="0"/>
-        <w:jc w:val="left"/>
-      </w:pPr>
-      <w:r>
-        <w:rPr>
-          <w:rFonts w:ascii="Times New Roman" w:hAnsi="Times New Roman" w:eastAsia="Times New Roman"/>
-          <w:b/>
-          <w:i w:val="0"/>
-          <w:color w:val="000000"/>
-          <w:sz w:val="28"/>
-          <w:cs w:val="0"/>
-        </w:rPr>
-        <w:t>6.3. Список своих организаций</w:t>
-      </w:r>
-    </w:p>
-    <w:p>
-      <w:pPr>
-        <w:spacing w:after="120" w:before="0" w:line="360" w:lineRule="auto"/>
-        <w:ind w:firstLine="709"/>
-        <w:jc w:val="both"/>
-      </w:pPr>
-      <w:r>
-        <w:rPr>
-          <w:rFonts w:ascii="Times New Roman" w:hAnsi="Times New Roman" w:eastAsia="Times New Roman"/>
-          <w:b w:val="0"/>
-          <w:i w:val="0"/>
-          <w:color w:val="000000"/>
-          <w:sz w:val="28"/>
-          <w:cs w:val="0"/>
-        </w:rPr>
-        <w:t>По умолчанию - организации, доступные пользователю по правам чтения справочника Организации (при наличии учета ответственных лиц - организации, по которым пользователь является ответственным). Клиентский отбор не является единственной защитой: сервер повторно проверяет организацию перед записью.</w:t>
-      </w:r>
-    </w:p>
-    <w:p>
-      <w:pPr>
-        <w:keepNext/>
-        <w:spacing w:after="160" w:before="240" w:line="360" w:lineRule="auto"/>
-        <w:ind w:firstLine="0"/>
-        <w:jc w:val="left"/>
-      </w:pPr>
-      <w:r>
-        <w:rPr>
-          <w:rFonts w:ascii="Times New Roman" w:hAnsi="Times New Roman" w:eastAsia="Times New Roman"/>
-          <w:b/>
-          <w:i w:val="0"/>
-          <w:color w:val="000000"/>
-          <w:sz w:val="28"/>
-          <w:cs w:val="0"/>
-        </w:rPr>
-        <w:t>6.4. Права</w:t>
-      </w:r>
-    </w:p>
-    <w:p>
-      <w:pPr>
-        <w:spacing w:after="120" w:before="0" w:line="360" w:lineRule="auto"/>
-        <w:ind w:firstLine="709"/>
-        <w:jc w:val="both"/>
-      </w:pPr>
-      <w:r>
-        <w:rPr>
-          <w:rFonts w:ascii="Times New Roman" w:hAnsi="Times New Roman" w:eastAsia="Times New Roman"/>
-          <w:b w:val="0"/>
-          <w:i w:val="0"/>
-          <w:color w:val="000000"/>
-          <w:sz w:val="28"/>
-          <w:cs w:val="0"/>
-        </w:rPr>
-        <w:t>Пользователь с ролью нп_УстановкаДатЗапретаПоОрганизациям и без типовых ролей ДобавлениеИзменениеДатЗапретаИзменения и ЧтениеДатЗапретаИзменения:</w:t>
-      </w:r>
-    </w:p>
-    <w:p>
-      <w:pPr>
-        <w:spacing w:after="80" w:before="0" w:line="360" w:lineRule="auto"/>
-        <w:ind w:left="709" w:hanging="425"/>
-        <w:jc w:val="both"/>
-      </w:pPr>
-      <w:r>
-        <w:rPr>
-          <w:rFonts w:ascii="Times New Roman" w:hAnsi="Times New Roman" w:eastAsia="Times New Roman"/>
-          <w:b w:val="0"/>
-          <w:i w:val="0"/>
-          <w:color w:val="000000"/>
-          <w:sz w:val="28"/>
-          <w:cs w:val="0"/>
-        </w:rPr>
-        <w:t>- имеет доступ к обработке, заявке и настройкам автосдвига;</w:t>
-      </w:r>
-    </w:p>
-    <w:p>
-      <w:pPr>
-        <w:spacing w:after="80" w:before="0" w:line="360" w:lineRule="auto"/>
-        <w:ind w:left="709" w:hanging="425"/>
-        <w:jc w:val="both"/>
-      </w:pPr>
-      <w:r>
-        <w:rPr>
-          <w:rFonts w:ascii="Times New Roman" w:hAnsi="Times New Roman" w:eastAsia="Times New Roman"/>
-          <w:b w:val="0"/>
-          <w:i w:val="0"/>
-          <w:color w:val="000000"/>
-          <w:sz w:val="28"/>
-          <w:cs w:val="0"/>
-        </w:rPr>
-        <w:t>- не имеет доступа к списку всего типового регистра и типовой форме администрирования;</w:t>
-      </w:r>
-    </w:p>
-    <w:p>
-      <w:pPr>
-        <w:spacing w:after="80" w:before="0" w:line="360" w:lineRule="auto"/>
-        <w:ind w:left="709" w:hanging="425"/>
-        <w:jc w:val="both"/>
-      </w:pPr>
-      <w:r>
-        <w:rPr>
-          <w:rFonts w:ascii="Times New Roman" w:hAnsi="Times New Roman" w:eastAsia="Times New Roman"/>
-          <w:b w:val="0"/>
-          <w:i w:val="0"/>
-          <w:color w:val="000000"/>
-          <w:sz w:val="28"/>
-          <w:cs w:val="0"/>
-        </w:rPr>
-        <w:t>- не может записать чужую организацию (отказ с сообщением).</w:t>
-      </w:r>
-    </w:p>
-    <w:p>
-      <w:pPr>
-        <w:keepNext/>
-        <w:spacing w:after="160" w:before="240" w:line="360" w:lineRule="auto"/>
-        <w:ind w:firstLine="0"/>
-        <w:jc w:val="left"/>
-      </w:pPr>
-      <w:r>
-        <w:rPr>
-          <w:rFonts w:ascii="Times New Roman" w:hAnsi="Times New Roman" w:eastAsia="Times New Roman"/>
-          <w:b/>
-          <w:i w:val="0"/>
-          <w:color w:val="000000"/>
-          <w:sz w:val="28"/>
-          <w:cs w:val="0"/>
-        </w:rPr>
-        <w:t>7. Требования к загрузке из Excel</w:t>
-      </w:r>
-    </w:p>
-    <w:p>
-      <w:pPr>
-        <w:keepNext/>
-        <w:spacing w:after="160" w:before="240" w:line="360" w:lineRule="auto"/>
-        <w:ind w:firstLine="0"/>
-        <w:jc w:val="left"/>
-      </w:pPr>
-      <w:r>
-        <w:rPr>
-          <w:rFonts w:ascii="Times New Roman" w:hAnsi="Times New Roman" w:eastAsia="Times New Roman"/>
-          <w:b/>
-          <w:i w:val="0"/>
-          <w:color w:val="000000"/>
-          <w:sz w:val="28"/>
-          <w:cs w:val="0"/>
-        </w:rPr>
-        <w:t>7.1. Общие требования</w:t>
-      </w:r>
-    </w:p>
-    <w:p>
-      <w:pPr>
-        <w:spacing w:after="80" w:before="0" w:line="360" w:lineRule="auto"/>
-        <w:ind w:left="709" w:hanging="425"/>
-        <w:jc w:val="both"/>
-      </w:pPr>
-      <w:r>
-        <w:rPr>
-          <w:rFonts w:ascii="Times New Roman" w:hAnsi="Times New Roman" w:eastAsia="Times New Roman"/>
-          <w:b w:val="0"/>
-          <w:i w:val="0"/>
-          <w:color w:val="000000"/>
-          <w:sz w:val="28"/>
-          <w:cs w:val="0"/>
-        </w:rPr>
-        <w:t>1. Загрузка выполняется командой обработки нп_УстановкаДатЗапретаИзменения.</w:t>
-      </w:r>
-    </w:p>
-    <w:p>
-      <w:pPr>
-        <w:spacing w:after="80" w:before="0" w:line="360" w:lineRule="auto"/>
-        <w:ind w:left="709" w:hanging="425"/>
-        <w:jc w:val="both"/>
-      </w:pPr>
-      <w:r>
-        <w:rPr>
-          <w:rFonts w:ascii="Times New Roman" w:hAnsi="Times New Roman" w:eastAsia="Times New Roman"/>
-          <w:b w:val="0"/>
-          <w:i w:val="0"/>
-          <w:color w:val="000000"/>
-          <w:sz w:val="28"/>
-          <w:cs w:val="0"/>
-        </w:rPr>
-        <w:t>2. Разбор файла - по приемам типовой подсистемы «Загрузка данных из файла»: табличный документ, сопоставление колонок, построчный протокол.</w:t>
-      </w:r>
-    </w:p>
-    <w:p>
-      <w:pPr>
-        <w:spacing w:after="80" w:before="0" w:line="360" w:lineRule="auto"/>
-        <w:ind w:left="709" w:hanging="425"/>
-        <w:jc w:val="both"/>
-      </w:pPr>
-      <w:r>
-        <w:rPr>
-          <w:rFonts w:ascii="Times New Roman" w:hAnsi="Times New Roman" w:eastAsia="Times New Roman"/>
-          <w:b w:val="0"/>
-          <w:i w:val="0"/>
-          <w:color w:val="000000"/>
-          <w:sz w:val="28"/>
-          <w:cs w:val="0"/>
-        </w:rPr>
-        <w:t>3. Регистр ДатыЗапретаИзменения в типовой список загружаемых справочников не добавляется.</w:t>
-      </w:r>
-    </w:p>
-    <w:p>
-      <w:pPr>
-        <w:keepNext/>
-        <w:spacing w:after="160" w:before="240" w:line="360" w:lineRule="auto"/>
-        <w:ind w:firstLine="0"/>
-        <w:jc w:val="left"/>
-      </w:pPr>
-      <w:r>
-        <w:rPr>
-          <w:rFonts w:ascii="Times New Roman" w:hAnsi="Times New Roman" w:eastAsia="Times New Roman"/>
-          <w:b/>
-          <w:i w:val="0"/>
-          <w:color w:val="000000"/>
-          <w:sz w:val="28"/>
-          <w:cs w:val="0"/>
-        </w:rPr>
-        <w:t>7.2. Колонки файла</w:t>
-      </w:r>
-    </w:p>
-    <w:p>
-      <w:pPr>
-        <w:spacing w:after="80" w:before="160" w:line="360" w:lineRule="auto"/>
-        <w:ind w:firstLine="0"/>
-        <w:jc w:val="center"/>
-      </w:pPr>
-      <w:r>
-        <w:rPr>
-          <w:rFonts w:ascii="Times New Roman" w:hAnsi="Times New Roman" w:eastAsia="Times New Roman"/>
-          <w:b w:val="0"/>
-          <w:i/>
-          <w:color w:val="000000"/>
-          <w:sz w:val="24"/>
-          <w:cs w:val="0"/>
-        </w:rPr>
-        <w:t>Таблица 5 - Колонки файла загрузки</w:t>
-      </w:r>
-    </w:p>
-    <w:tbl>
-      <w:tblPr>
-        <w:tblW w:type="auto" w:w="0"/>
-        <w:jc w:val="center"/>
-        <w:tblLayout w:type="fixed"/>
-        <w:tblLook w:firstColumn="1" w:firstRow="1" w:lastColumn="0" w:lastRow="0" w:noHBand="0" w:noVBand="1" w:val="04A0"/>
-      </w:tblPr>
-      <w:tblGrid>
-        <w:gridCol w:w="2339"/>
-        <w:gridCol w:w="2339"/>
-        <w:gridCol w:w="2339"/>
-        <w:gridCol w:w="2339"/>
-      </w:tblGrid>
-      <w:tr>
-        <w:trPr>
-          <w:tblHeader w:val="true"/>
-        </w:trPr>
-        <w:tc>
-          <w:tcPr>
-            <w:tcW w:type="dxa" w:w="680"/>
-            <w:vAlign w:val="center"/>
-            <w:tcBorders>
-              <w:top w:val="single" w:sz="8" w:space="0" w:color="000000"/>
-              <w:left w:val="single" w:sz="8" w:space="0" w:color="000000"/>
-              <w:bottom w:val="single" w:sz="8" w:space="0" w:color="000000"/>
-              <w:right w:val="single" w:sz="8" w:space="0" w:color="000000"/>
-            </w:tcBorders>
-            <w:tcMar>
-              <w:top w:w="45" w:type="dxa"/>
-              <w:left w:w="45" w:type="dxa"/>
-              <w:bottom w:w="45" w:type="dxa"/>
-              <w:right w:w="45" w:type="dxa"/>
-            </w:tcMar>
-            <w:shd w:fill="D9D9D9" w:val="clear"/>
-          </w:tcPr>
-          <w:p>
-            <w:pPr>
-              <w:spacing w:after="0" w:before="0" w:line="240" w:lineRule="auto"/>
-              <w:ind w:firstLine="0"/>
-              <w:jc w:val="center"/>
-            </w:pPr>
-            <w:r/>
-            <w:r>
-              <w:rPr>
-                <w:rFonts w:ascii="Times New Roman" w:hAnsi="Times New Roman" w:eastAsia="Times New Roman"/>
-                <w:b/>
-                <w:i w:val="0"/>
-                <w:color w:val="000000"/>
-                <w:sz w:val="24"/>
-                <w:cs w:val="0"/>
-              </w:rPr>
-              <w:t>N</w:t>
-            </w:r>
-          </w:p>
-        </w:tc>
-        <w:tc>
-          <w:tcPr>
-            <w:tcW w:type="dxa" w:w="3005"/>
-            <w:vAlign w:val="center"/>
-            <w:tcBorders>
-              <w:top w:val="single" w:sz="8" w:space="0" w:color="000000"/>
-              <w:left w:val="single" w:sz="8" w:space="0" w:color="000000"/>
-              <w:bottom w:val="single" w:sz="8" w:space="0" w:color="000000"/>
-              <w:right w:val="single" w:sz="8" w:space="0" w:color="000000"/>
-            </w:tcBorders>
-            <w:tcMar>
-              <w:top w:w="45" w:type="dxa"/>
-              <w:left w:w="45" w:type="dxa"/>
-              <w:bottom w:w="45" w:type="dxa"/>
-              <w:right w:w="45" w:type="dxa"/>
-            </w:tcMar>
-            <w:shd w:fill="D9D9D9" w:val="clear"/>
-          </w:tcPr>
-          <w:p>
-            <w:pPr>
-              <w:spacing w:after="0" w:before="0" w:line="240" w:lineRule="auto"/>
-              <w:ind w:firstLine="0"/>
-              <w:jc w:val="center"/>
-            </w:pPr>
-            <w:r/>
-            <w:r>
-              <w:rPr>
-                <w:rFonts w:ascii="Times New Roman" w:hAnsi="Times New Roman" w:eastAsia="Times New Roman"/>
-                <w:b/>
-                <w:i w:val="0"/>
-                <w:color w:val="000000"/>
-                <w:sz w:val="24"/>
-                <w:cs w:val="0"/>
-              </w:rPr>
-              <w:t>Колонка</w:t>
-            </w:r>
-          </w:p>
-        </w:tc>
-        <w:tc>
-          <w:tcPr>
-            <w:tcW w:type="dxa" w:w="1701"/>
-            <w:vAlign w:val="center"/>
-            <w:tcBorders>
-              <w:top w:val="single" w:sz="8" w:space="0" w:color="000000"/>
-              <w:left w:val="single" w:sz="8" w:space="0" w:color="000000"/>
-              <w:bottom w:val="single" w:sz="8" w:space="0" w:color="000000"/>
-              <w:right w:val="single" w:sz="8" w:space="0" w:color="000000"/>
-            </w:tcBorders>
-            <w:tcMar>
-              <w:top w:w="45" w:type="dxa"/>
-              <w:left w:w="45" w:type="dxa"/>
-              <w:bottom w:w="45" w:type="dxa"/>
-              <w:right w:w="45" w:type="dxa"/>
-            </w:tcMar>
-            <w:shd w:fill="D9D9D9" w:val="clear"/>
-          </w:tcPr>
-          <w:p>
-            <w:pPr>
-              <w:spacing w:after="0" w:before="0" w:line="240" w:lineRule="auto"/>
-              <w:ind w:firstLine="0"/>
-              <w:jc w:val="center"/>
-            </w:pPr>
-            <w:r/>
-            <w:r>
-              <w:rPr>
-                <w:rFonts w:ascii="Times New Roman" w:hAnsi="Times New Roman" w:eastAsia="Times New Roman"/>
-                <w:b/>
-                <w:i w:val="0"/>
-                <w:color w:val="000000"/>
-                <w:sz w:val="24"/>
-                <w:cs w:val="0"/>
-              </w:rPr>
-              <w:t>Обязательность</w:t>
-            </w:r>
-          </w:p>
-        </w:tc>
-        <w:tc>
-          <w:tcPr>
-            <w:tcW w:type="dxa" w:w="3969"/>
-            <w:vAlign w:val="center"/>
-            <w:tcBorders>
-              <w:top w:val="single" w:sz="8" w:space="0" w:color="000000"/>
-              <w:left w:val="single" w:sz="8" w:space="0" w:color="000000"/>
-              <w:bottom w:val="single" w:sz="8" w:space="0" w:color="000000"/>
-              <w:right w:val="single" w:sz="8" w:space="0" w:color="000000"/>
-            </w:tcBorders>
-            <w:tcMar>
-              <w:top w:w="45" w:type="dxa"/>
-              <w:left w:w="45" w:type="dxa"/>
-              <w:bottom w:w="45" w:type="dxa"/>
-              <w:right w:w="45" w:type="dxa"/>
-            </w:tcMar>
-            <w:shd w:fill="D9D9D9" w:val="clear"/>
-          </w:tcPr>
-          <w:p>
-            <w:pPr>
-              <w:spacing w:after="0" w:before="0" w:line="240" w:lineRule="auto"/>
-              <w:ind w:firstLine="0"/>
-              <w:jc w:val="center"/>
-            </w:pPr>
-            <w:r/>
-            <w:r>
-              <w:rPr>
-                <w:rFonts w:ascii="Times New Roman" w:hAnsi="Times New Roman" w:eastAsia="Times New Roman"/>
-                <w:b/>
-                <w:i w:val="0"/>
-                <w:color w:val="000000"/>
-                <w:sz w:val="24"/>
-                <w:cs w:val="0"/>
-              </w:rPr>
-              <w:t>Действие</w:t>
-            </w:r>
-          </w:p>
-        </w:tc>
-      </w:tr>
-      <w:tr>
-        <w:tc>
-          <w:tcPr>
-            <w:tcW w:type="dxa" w:w="680"/>
-            <w:vAlign w:val="center"/>
-            <w:tcBorders>
-              <w:top w:val="single" w:sz="8" w:space="0" w:color="000000"/>
-              <w:left w:val="single" w:sz="8" w:space="0" w:color="000000"/>
-              <w:bottom w:val="single" w:sz="8" w:space="0" w:color="000000"/>
-              <w:right w:val="single" w:sz="8" w:space="0" w:color="000000"/>
-            </w:tcBorders>
-            <w:tcMar>
-              <w:top w:w="45" w:type="dxa"/>
-              <w:left w:w="45" w:type="dxa"/>
-              <w:bottom w:w="45" w:type="dxa"/>
-              <w:right w:w="45" w:type="dxa"/>
-            </w:tcMar>
-          </w:tcPr>
-          <w:p>
-            <w:pPr>
-              <w:spacing w:after="0" w:before="0" w:line="240" w:lineRule="auto"/>
-              <w:ind w:firstLine="0"/>
-              <w:jc w:val="center"/>
-            </w:pPr>
-            <w:r/>
-            <w:r>
-              <w:rPr>
-                <w:rFonts w:ascii="Times New Roman" w:hAnsi="Times New Roman" w:eastAsia="Times New Roman"/>
-                <w:b w:val="0"/>
-                <w:i w:val="0"/>
-                <w:color w:val="000000"/>
-                <w:sz w:val="24"/>
-                <w:cs w:val="0"/>
-              </w:rPr>
-              <w:t>1</w:t>
-            </w:r>
-          </w:p>
-        </w:tc>
-        <w:tc>
-          <w:tcPr>
-            <w:tcW w:type="dxa" w:w="3005"/>
-            <w:vAlign w:val="center"/>
-            <w:tcBorders>
-              <w:top w:val="single" w:sz="8" w:space="0" w:color="000000"/>
-              <w:left w:val="single" w:sz="8" w:space="0" w:color="000000"/>
-              <w:bottom w:val="single" w:sz="8" w:space="0" w:color="000000"/>
-              <w:right w:val="single" w:sz="8" w:space="0" w:color="000000"/>
-            </w:tcBorders>
-            <w:tcMar>
-              <w:top w:w="45" w:type="dxa"/>
-              <w:left w:w="45" w:type="dxa"/>
-              <w:bottom w:w="45" w:type="dxa"/>
-              <w:right w:w="45" w:type="dxa"/>
-            </w:tcMar>
-          </w:tcPr>
-          <w:p>
-            <w:pPr>
-              <w:spacing w:after="0" w:before="0" w:line="240" w:lineRule="auto"/>
-              <w:ind w:firstLine="0"/>
-              <w:jc w:val="left"/>
-            </w:pPr>
-            <w:r/>
-            <w:r>
-              <w:rPr>
-                <w:rFonts w:ascii="Times New Roman" w:hAnsi="Times New Roman" w:eastAsia="Times New Roman"/>
-                <w:b w:val="0"/>
-                <w:i w:val="0"/>
-                <w:color w:val="000000"/>
-                <w:sz w:val="24"/>
-                <w:cs w:val="0"/>
-              </w:rPr>
-              <w:t>Организация (наименование, код или ИНН по правилам сопоставления)</w:t>
-            </w:r>
-          </w:p>
-        </w:tc>
-        <w:tc>
-          <w:tcPr>
-            <w:tcW w:type="dxa" w:w="1701"/>
-            <w:vAlign w:val="center"/>
-            <w:tcBorders>
-              <w:top w:val="single" w:sz="8" w:space="0" w:color="000000"/>
-              <w:left w:val="single" w:sz="8" w:space="0" w:color="000000"/>
-              <w:bottom w:val="single" w:sz="8" w:space="0" w:color="000000"/>
-              <w:right w:val="single" w:sz="8" w:space="0" w:color="000000"/>
-            </w:tcBorders>
-            <w:tcMar>
-              <w:top w:w="45" w:type="dxa"/>
-              <w:left w:w="45" w:type="dxa"/>
-              <w:bottom w:w="45" w:type="dxa"/>
-              <w:right w:w="45" w:type="dxa"/>
-            </w:tcMar>
-          </w:tcPr>
-          <w:p>
-            <w:pPr>
-              <w:spacing w:after="0" w:before="0" w:line="240" w:lineRule="auto"/>
-              <w:ind w:firstLine="0"/>
-              <w:jc w:val="left"/>
-            </w:pPr>
-            <w:r/>
-            <w:r>
-              <w:rPr>
-                <w:rFonts w:ascii="Times New Roman" w:hAnsi="Times New Roman" w:eastAsia="Times New Roman"/>
-                <w:b w:val="0"/>
-                <w:i w:val="0"/>
-                <w:color w:val="000000"/>
-                <w:sz w:val="24"/>
-                <w:cs w:val="0"/>
-              </w:rPr>
-              <w:t>да</w:t>
-            </w:r>
-          </w:p>
-        </w:tc>
-        <w:tc>
-          <w:tcPr>
-            <w:tcW w:type="dxa" w:w="3969"/>
-            <w:vAlign w:val="center"/>
-            <w:tcBorders>
-              <w:top w:val="single" w:sz="8" w:space="0" w:color="000000"/>
-              <w:left w:val="single" w:sz="8" w:space="0" w:color="000000"/>
-              <w:bottom w:val="single" w:sz="8" w:space="0" w:color="000000"/>
-              <w:right w:val="single" w:sz="8" w:space="0" w:color="000000"/>
-            </w:tcBorders>
-            <w:tcMar>
-              <w:top w:w="45" w:type="dxa"/>
-              <w:left w:w="45" w:type="dxa"/>
-              <w:bottom w:w="45" w:type="dxa"/>
-              <w:right w:w="45" w:type="dxa"/>
-            </w:tcMar>
-          </w:tcPr>
-          <w:p>
-            <w:pPr>
-              <w:spacing w:after="0" w:before="0" w:line="240" w:lineRule="auto"/>
-              <w:ind w:firstLine="0"/>
-              <w:jc w:val="left"/>
-            </w:pPr>
-            <w:r/>
-            <w:r>
-              <w:rPr>
-                <w:rFonts w:ascii="Times New Roman" w:hAnsi="Times New Roman" w:eastAsia="Times New Roman"/>
-                <w:b w:val="0"/>
-                <w:i w:val="0"/>
-                <w:color w:val="000000"/>
-                <w:sz w:val="24"/>
-                <w:cs w:val="0"/>
-              </w:rPr>
-              <w:t>поиск в справочнике Организации</w:t>
-            </w:r>
-          </w:p>
-        </w:tc>
-      </w:tr>
-      <w:tr>
-        <w:tc>
-          <w:tcPr>
-            <w:tcW w:type="dxa" w:w="680"/>
-            <w:vAlign w:val="center"/>
-            <w:tcBorders>
-              <w:top w:val="single" w:sz="8" w:space="0" w:color="000000"/>
-              <w:left w:val="single" w:sz="8" w:space="0" w:color="000000"/>
-              <w:bottom w:val="single" w:sz="8" w:space="0" w:color="000000"/>
-              <w:right w:val="single" w:sz="8" w:space="0" w:color="000000"/>
-            </w:tcBorders>
-            <w:tcMar>
-              <w:top w:w="45" w:type="dxa"/>
-              <w:left w:w="45" w:type="dxa"/>
-              <w:bottom w:w="45" w:type="dxa"/>
-              <w:right w:w="45" w:type="dxa"/>
-            </w:tcMar>
-          </w:tcPr>
-          <w:p>
-            <w:pPr>
-              <w:spacing w:after="0" w:before="0" w:line="240" w:lineRule="auto"/>
-              <w:ind w:firstLine="0"/>
-              <w:jc w:val="center"/>
-            </w:pPr>
-            <w:r/>
-            <w:r>
-              <w:rPr>
-                <w:rFonts w:ascii="Times New Roman" w:hAnsi="Times New Roman" w:eastAsia="Times New Roman"/>
-                <w:b w:val="0"/>
-                <w:i w:val="0"/>
-                <w:color w:val="000000"/>
-                <w:sz w:val="24"/>
-                <w:cs w:val="0"/>
-              </w:rPr>
-              <w:t>2</w:t>
-            </w:r>
-          </w:p>
-        </w:tc>
-        <w:tc>
-          <w:tcPr>
-            <w:tcW w:type="dxa" w:w="3005"/>
-            <w:vAlign w:val="center"/>
-            <w:tcBorders>
-              <w:top w:val="single" w:sz="8" w:space="0" w:color="000000"/>
-              <w:left w:val="single" w:sz="8" w:space="0" w:color="000000"/>
-              <w:bottom w:val="single" w:sz="8" w:space="0" w:color="000000"/>
-              <w:right w:val="single" w:sz="8" w:space="0" w:color="000000"/>
-            </w:tcBorders>
-            <w:tcMar>
-              <w:top w:w="45" w:type="dxa"/>
-              <w:left w:w="45" w:type="dxa"/>
-              <w:bottom w:w="45" w:type="dxa"/>
-              <w:right w:w="45" w:type="dxa"/>
-            </w:tcMar>
-          </w:tcPr>
-          <w:p>
-            <w:pPr>
-              <w:spacing w:after="0" w:before="0" w:line="240" w:lineRule="auto"/>
-              <w:ind w:firstLine="0"/>
-              <w:jc w:val="left"/>
-            </w:pPr>
-            <w:r/>
-            <w:r>
-              <w:rPr>
-                <w:rFonts w:ascii="Times New Roman" w:hAnsi="Times New Roman" w:eastAsia="Times New Roman"/>
-                <w:b w:val="0"/>
-                <w:i w:val="0"/>
-                <w:color w:val="000000"/>
-                <w:sz w:val="24"/>
-                <w:cs w:val="0"/>
-              </w:rPr>
-              <w:t>N (число дней автосдвига)</w:t>
-            </w:r>
-          </w:p>
-        </w:tc>
-        <w:tc>
-          <w:tcPr>
-            <w:tcW w:type="dxa" w:w="1701"/>
-            <w:vAlign w:val="center"/>
-            <w:tcBorders>
-              <w:top w:val="single" w:sz="8" w:space="0" w:color="000000"/>
-              <w:left w:val="single" w:sz="8" w:space="0" w:color="000000"/>
-              <w:bottom w:val="single" w:sz="8" w:space="0" w:color="000000"/>
-              <w:right w:val="single" w:sz="8" w:space="0" w:color="000000"/>
-            </w:tcBorders>
-            <w:tcMar>
-              <w:top w:w="45" w:type="dxa"/>
-              <w:left w:w="45" w:type="dxa"/>
-              <w:bottom w:w="45" w:type="dxa"/>
-              <w:right w:w="45" w:type="dxa"/>
-            </w:tcMar>
-          </w:tcPr>
-          <w:p>
-            <w:pPr>
-              <w:spacing w:after="0" w:before="0" w:line="240" w:lineRule="auto"/>
-              <w:ind w:firstLine="0"/>
-              <w:jc w:val="left"/>
-            </w:pPr>
-            <w:r/>
-            <w:r>
-              <w:rPr>
-                <w:rFonts w:ascii="Times New Roman" w:hAnsi="Times New Roman" w:eastAsia="Times New Roman"/>
-                <w:b w:val="0"/>
-                <w:i w:val="0"/>
-                <w:color w:val="000000"/>
-                <w:sz w:val="24"/>
-                <w:cs w:val="0"/>
-              </w:rPr>
-              <w:t>нет</w:t>
-            </w:r>
-          </w:p>
-        </w:tc>
-        <w:tc>
-          <w:tcPr>
-            <w:tcW w:type="dxa" w:w="3969"/>
-            <w:vAlign w:val="center"/>
-            <w:tcBorders>
-              <w:top w:val="single" w:sz="8" w:space="0" w:color="000000"/>
-              <w:left w:val="single" w:sz="8" w:space="0" w:color="000000"/>
-              <w:bottom w:val="single" w:sz="8" w:space="0" w:color="000000"/>
-              <w:right w:val="single" w:sz="8" w:space="0" w:color="000000"/>
-            </w:tcBorders>
-            <w:tcMar>
-              <w:top w:w="45" w:type="dxa"/>
-              <w:left w:w="45" w:type="dxa"/>
-              <w:bottom w:w="45" w:type="dxa"/>
-              <w:right w:w="45" w:type="dxa"/>
-            </w:tcMar>
-          </w:tcPr>
-          <w:p>
-            <w:pPr>
-              <w:spacing w:after="0" w:before="0" w:line="240" w:lineRule="auto"/>
-              <w:ind w:firstLine="0"/>
-              <w:jc w:val="left"/>
-            </w:pPr>
-            <w:r/>
-            <w:r>
-              <w:rPr>
-                <w:rFonts w:ascii="Times New Roman" w:hAnsi="Times New Roman" w:eastAsia="Times New Roman"/>
-                <w:b w:val="0"/>
-                <w:i w:val="0"/>
-                <w:color w:val="000000"/>
-                <w:sz w:val="24"/>
-                <w:cs w:val="0"/>
-              </w:rPr>
-              <w:t>если N больше 0 - создать или обновить запись в нп_НастройкиАвтосдвигаДатЗапрета</w:t>
-            </w:r>
-          </w:p>
-        </w:tc>
-      </w:tr>
-      <w:tr>
-        <w:tc>
-          <w:tcPr>
-            <w:tcW w:type="dxa" w:w="680"/>
-            <w:vAlign w:val="center"/>
-            <w:tcBorders>
-              <w:top w:val="single" w:sz="8" w:space="0" w:color="000000"/>
-              <w:left w:val="single" w:sz="8" w:space="0" w:color="000000"/>
-              <w:bottom w:val="single" w:sz="8" w:space="0" w:color="000000"/>
-              <w:right w:val="single" w:sz="8" w:space="0" w:color="000000"/>
-            </w:tcBorders>
-            <w:tcMar>
-              <w:top w:w="45" w:type="dxa"/>
-              <w:left w:w="45" w:type="dxa"/>
-              <w:bottom w:w="45" w:type="dxa"/>
-              <w:right w:w="45" w:type="dxa"/>
-            </w:tcMar>
-          </w:tcPr>
-          <w:p>
-            <w:pPr>
-              <w:spacing w:after="0" w:before="0" w:line="240" w:lineRule="auto"/>
-              <w:ind w:firstLine="0"/>
-              <w:jc w:val="center"/>
-            </w:pPr>
-            <w:r/>
-            <w:r>
-              <w:rPr>
-                <w:rFonts w:ascii="Times New Roman" w:hAnsi="Times New Roman" w:eastAsia="Times New Roman"/>
-                <w:b w:val="0"/>
-                <w:i w:val="0"/>
-                <w:color w:val="000000"/>
-                <w:sz w:val="24"/>
-                <w:cs w:val="0"/>
-              </w:rPr>
-              <w:t>3</w:t>
-            </w:r>
-          </w:p>
-        </w:tc>
-        <w:tc>
-          <w:tcPr>
-            <w:tcW w:type="dxa" w:w="3005"/>
-            <w:vAlign w:val="center"/>
-            <w:tcBorders>
-              <w:top w:val="single" w:sz="8" w:space="0" w:color="000000"/>
-              <w:left w:val="single" w:sz="8" w:space="0" w:color="000000"/>
-              <w:bottom w:val="single" w:sz="8" w:space="0" w:color="000000"/>
-              <w:right w:val="single" w:sz="8" w:space="0" w:color="000000"/>
-            </w:tcBorders>
-            <w:tcMar>
-              <w:top w:w="45" w:type="dxa"/>
-              <w:left w:w="45" w:type="dxa"/>
-              <w:bottom w:w="45" w:type="dxa"/>
-              <w:right w:w="45" w:type="dxa"/>
-            </w:tcMar>
-          </w:tcPr>
-          <w:p>
-            <w:pPr>
-              <w:spacing w:after="0" w:before="0" w:line="240" w:lineRule="auto"/>
-              <w:ind w:firstLine="0"/>
-              <w:jc w:val="left"/>
-            </w:pPr>
-            <w:r/>
-            <w:r>
-              <w:rPr>
-                <w:rFonts w:ascii="Times New Roman" w:hAnsi="Times New Roman" w:eastAsia="Times New Roman"/>
-                <w:b w:val="0"/>
-                <w:i w:val="0"/>
-                <w:color w:val="000000"/>
-                <w:sz w:val="24"/>
-                <w:cs w:val="0"/>
-              </w:rPr>
-              <w:t>Дата запрета (абсолютная)</w:t>
-            </w:r>
-          </w:p>
-        </w:tc>
-        <w:tc>
-          <w:tcPr>
-            <w:tcW w:type="dxa" w:w="1701"/>
-            <w:vAlign w:val="center"/>
-            <w:tcBorders>
-              <w:top w:val="single" w:sz="8" w:space="0" w:color="000000"/>
-              <w:left w:val="single" w:sz="8" w:space="0" w:color="000000"/>
-              <w:bottom w:val="single" w:sz="8" w:space="0" w:color="000000"/>
-              <w:right w:val="single" w:sz="8" w:space="0" w:color="000000"/>
-            </w:tcBorders>
-            <w:tcMar>
-              <w:top w:w="45" w:type="dxa"/>
-              <w:left w:w="45" w:type="dxa"/>
-              <w:bottom w:w="45" w:type="dxa"/>
-              <w:right w:w="45" w:type="dxa"/>
-            </w:tcMar>
-          </w:tcPr>
-          <w:p>
-            <w:pPr>
-              <w:spacing w:after="0" w:before="0" w:line="240" w:lineRule="auto"/>
-              <w:ind w:firstLine="0"/>
-              <w:jc w:val="left"/>
-            </w:pPr>
-            <w:r/>
-            <w:r>
-              <w:rPr>
-                <w:rFonts w:ascii="Times New Roman" w:hAnsi="Times New Roman" w:eastAsia="Times New Roman"/>
-                <w:b w:val="0"/>
-                <w:i w:val="0"/>
-                <w:color w:val="000000"/>
-                <w:sz w:val="24"/>
-                <w:cs w:val="0"/>
-              </w:rPr>
-              <w:t>нет</w:t>
-            </w:r>
-          </w:p>
-        </w:tc>
-        <w:tc>
-          <w:tcPr>
-            <w:tcW w:type="dxa" w:w="3969"/>
-            <w:vAlign w:val="center"/>
-            <w:tcBorders>
-              <w:top w:val="single" w:sz="8" w:space="0" w:color="000000"/>
-              <w:left w:val="single" w:sz="8" w:space="0" w:color="000000"/>
-              <w:bottom w:val="single" w:sz="8" w:space="0" w:color="000000"/>
-              <w:right w:val="single" w:sz="8" w:space="0" w:color="000000"/>
-            </w:tcBorders>
-            <w:tcMar>
-              <w:top w:w="45" w:type="dxa"/>
-              <w:left w:w="45" w:type="dxa"/>
-              <w:bottom w:w="45" w:type="dxa"/>
-              <w:right w:w="45" w:type="dxa"/>
-            </w:tcMar>
-          </w:tcPr>
-          <w:p>
-            <w:pPr>
-              <w:spacing w:after="0" w:before="0" w:line="240" w:lineRule="auto"/>
-              <w:ind w:firstLine="0"/>
-              <w:jc w:val="left"/>
-            </w:pPr>
-            <w:r/>
-            <w:r>
-              <w:rPr>
-                <w:rFonts w:ascii="Times New Roman" w:hAnsi="Times New Roman" w:eastAsia="Times New Roman"/>
-                <w:b w:val="0"/>
-                <w:i w:val="0"/>
-                <w:color w:val="000000"/>
-                <w:sz w:val="24"/>
-                <w:cs w:val="0"/>
-              </w:rPr>
-              <w:t>разовая запись в типовой регистр; не включает автосдвиг, если N не задан</w:t>
-            </w:r>
-          </w:p>
-        </w:tc>
-      </w:tr>
-      <w:tr>
-        <w:tc>
-          <w:tcPr>
-            <w:tcW w:type="dxa" w:w="680"/>
-            <w:vAlign w:val="center"/>
-            <w:tcBorders>
-              <w:top w:val="single" w:sz="8" w:space="0" w:color="000000"/>
-              <w:left w:val="single" w:sz="8" w:space="0" w:color="000000"/>
-              <w:bottom w:val="single" w:sz="8" w:space="0" w:color="000000"/>
-              <w:right w:val="single" w:sz="8" w:space="0" w:color="000000"/>
-            </w:tcBorders>
-            <w:tcMar>
-              <w:top w:w="45" w:type="dxa"/>
-              <w:left w:w="45" w:type="dxa"/>
-              <w:bottom w:w="45" w:type="dxa"/>
-              <w:right w:w="45" w:type="dxa"/>
-            </w:tcMar>
-          </w:tcPr>
-          <w:p>
-            <w:pPr>
-              <w:spacing w:after="0" w:before="0" w:line="240" w:lineRule="auto"/>
-              <w:ind w:firstLine="0"/>
-              <w:jc w:val="center"/>
-            </w:pPr>
-            <w:r/>
-            <w:r>
-              <w:rPr>
-                <w:rFonts w:ascii="Times New Roman" w:hAnsi="Times New Roman" w:eastAsia="Times New Roman"/>
-                <w:b w:val="0"/>
-                <w:i w:val="0"/>
-                <w:color w:val="000000"/>
-                <w:sz w:val="24"/>
-                <w:cs w:val="0"/>
-              </w:rPr>
-              <w:t>4</w:t>
-            </w:r>
-          </w:p>
-        </w:tc>
-        <w:tc>
-          <w:tcPr>
-            <w:tcW w:type="dxa" w:w="3005"/>
-            <w:vAlign w:val="center"/>
-            <w:tcBorders>
-              <w:top w:val="single" w:sz="8" w:space="0" w:color="000000"/>
-              <w:left w:val="single" w:sz="8" w:space="0" w:color="000000"/>
-              <w:bottom w:val="single" w:sz="8" w:space="0" w:color="000000"/>
-              <w:right w:val="single" w:sz="8" w:space="0" w:color="000000"/>
-            </w:tcBorders>
-            <w:tcMar>
-              <w:top w:w="45" w:type="dxa"/>
-              <w:left w:w="45" w:type="dxa"/>
-              <w:bottom w:w="45" w:type="dxa"/>
-              <w:right w:w="45" w:type="dxa"/>
-            </w:tcMar>
-          </w:tcPr>
-          <w:p>
-            <w:pPr>
-              <w:spacing w:after="0" w:before="0" w:line="240" w:lineRule="auto"/>
-              <w:ind w:firstLine="0"/>
-              <w:jc w:val="left"/>
-            </w:pPr>
-            <w:r/>
-            <w:r>
-              <w:rPr>
-                <w:rFonts w:ascii="Times New Roman" w:hAnsi="Times New Roman" w:eastAsia="Times New Roman"/>
-                <w:b w:val="0"/>
-                <w:i w:val="0"/>
-                <w:color w:val="000000"/>
-                <w:sz w:val="24"/>
-                <w:cs w:val="0"/>
-              </w:rPr>
-              <w:t>Раздел учета</w:t>
-            </w:r>
-          </w:p>
-        </w:tc>
-        <w:tc>
-          <w:tcPr>
-            <w:tcW w:type="dxa" w:w="1701"/>
-            <w:vAlign w:val="center"/>
-            <w:tcBorders>
-              <w:top w:val="single" w:sz="8" w:space="0" w:color="000000"/>
-              <w:left w:val="single" w:sz="8" w:space="0" w:color="000000"/>
-              <w:bottom w:val="single" w:sz="8" w:space="0" w:color="000000"/>
-              <w:right w:val="single" w:sz="8" w:space="0" w:color="000000"/>
-            </w:tcBorders>
-            <w:tcMar>
-              <w:top w:w="45" w:type="dxa"/>
-              <w:left w:w="45" w:type="dxa"/>
-              <w:bottom w:w="45" w:type="dxa"/>
-              <w:right w:w="45" w:type="dxa"/>
-            </w:tcMar>
-          </w:tcPr>
-          <w:p>
-            <w:pPr>
-              <w:spacing w:after="0" w:before="0" w:line="240" w:lineRule="auto"/>
-              <w:ind w:firstLine="0"/>
-              <w:jc w:val="left"/>
-            </w:pPr>
-            <w:r/>
-            <w:r>
-              <w:rPr>
-                <w:rFonts w:ascii="Times New Roman" w:hAnsi="Times New Roman" w:eastAsia="Times New Roman"/>
-                <w:b w:val="0"/>
-                <w:i w:val="0"/>
-                <w:color w:val="000000"/>
-                <w:sz w:val="24"/>
-                <w:cs w:val="0"/>
-              </w:rPr>
-              <w:t>нет</w:t>
-            </w:r>
-          </w:p>
-        </w:tc>
-        <w:tc>
-          <w:tcPr>
-            <w:tcW w:type="dxa" w:w="3969"/>
-            <w:vAlign w:val="center"/>
-            <w:tcBorders>
-              <w:top w:val="single" w:sz="8" w:space="0" w:color="000000"/>
-              <w:left w:val="single" w:sz="8" w:space="0" w:color="000000"/>
-              <w:bottom w:val="single" w:sz="8" w:space="0" w:color="000000"/>
-              <w:right w:val="single" w:sz="8" w:space="0" w:color="000000"/>
-            </w:tcBorders>
-            <w:tcMar>
-              <w:top w:w="45" w:type="dxa"/>
-              <w:left w:w="45" w:type="dxa"/>
-              <w:bottom w:w="45" w:type="dxa"/>
-              <w:right w:w="45" w:type="dxa"/>
-            </w:tcMar>
-          </w:tcPr>
-          <w:p>
-            <w:pPr>
-              <w:spacing w:after="0" w:before="0" w:line="240" w:lineRule="auto"/>
-              <w:ind w:firstLine="0"/>
-              <w:jc w:val="left"/>
-            </w:pPr>
-            <w:r/>
-            <w:r>
-              <w:rPr>
-                <w:rFonts w:ascii="Times New Roman" w:hAnsi="Times New Roman" w:eastAsia="Times New Roman"/>
-                <w:b w:val="0"/>
-                <w:i w:val="0"/>
-                <w:color w:val="000000"/>
-                <w:sz w:val="24"/>
-                <w:cs w:val="0"/>
-              </w:rPr>
-              <w:t>пусто - все разделы с типом «Организации»; иначе только указанный раздел</w:t>
-            </w:r>
-          </w:p>
-        </w:tc>
-      </w:tr>
-    </w:tbl>
-    <w:p>
-      <w:pPr>
-        <w:spacing w:after="120" w:before="0" w:line="360" w:lineRule="auto"/>
-        <w:ind w:firstLine="0"/>
-        <w:jc w:val="both"/>
-      </w:pPr>
-    </w:p>
-    <w:p>
-      <w:pPr>
-        <w:keepNext/>
-        <w:spacing w:after="160" w:before="240" w:line="360" w:lineRule="auto"/>
-        <w:ind w:firstLine="0"/>
-        <w:jc w:val="left"/>
-      </w:pPr>
-      <w:r>
-        <w:rPr>
-          <w:rFonts w:ascii="Times New Roman" w:hAnsi="Times New Roman" w:eastAsia="Times New Roman"/>
-          <w:b/>
-          <w:i w:val="0"/>
-          <w:color w:val="000000"/>
-          <w:sz w:val="28"/>
-          <w:cs w:val="0"/>
-        </w:rPr>
-        <w:t>7.3. Правила применения строк</w:t>
-      </w:r>
-    </w:p>
-    <w:p>
-      <w:pPr>
-        <w:spacing w:after="80" w:before="0" w:line="360" w:lineRule="auto"/>
-        <w:ind w:left="709" w:hanging="425"/>
-        <w:jc w:val="both"/>
-      </w:pPr>
-      <w:r>
-        <w:rPr>
-          <w:rFonts w:ascii="Times New Roman" w:hAnsi="Times New Roman" w:eastAsia="Times New Roman"/>
-          <w:b w:val="0"/>
-          <w:i w:val="0"/>
-          <w:color w:val="000000"/>
-          <w:sz w:val="28"/>
-          <w:cs w:val="0"/>
-        </w:rPr>
-        <w:t>1. Неоднозначное или отсутствующее сопоставление организации - строка не записывается, в протоколе фиксируется ошибка сопоставления.</w:t>
-      </w:r>
-    </w:p>
-    <w:p>
-      <w:pPr>
-        <w:spacing w:after="80" w:before="0" w:line="360" w:lineRule="auto"/>
-        <w:ind w:left="709" w:hanging="425"/>
-        <w:jc w:val="both"/>
-      </w:pPr>
-      <w:r>
-        <w:rPr>
-          <w:rFonts w:ascii="Times New Roman" w:hAnsi="Times New Roman" w:eastAsia="Times New Roman"/>
-          <w:b w:val="0"/>
-          <w:i w:val="0"/>
-          <w:color w:val="000000"/>
-          <w:sz w:val="28"/>
-          <w:cs w:val="0"/>
-        </w:rPr>
-        <w:t>2. Организация вне доступного бухгалтеру списка - строка не применяется, в протоколе фиксируется отказ по правам.</w:t>
-      </w:r>
-    </w:p>
-    <w:p>
-      <w:pPr>
-        <w:spacing w:after="80" w:before="0" w:line="360" w:lineRule="auto"/>
-        <w:ind w:left="709" w:hanging="425"/>
-        <w:jc w:val="both"/>
-      </w:pPr>
-      <w:r>
-        <w:rPr>
-          <w:rFonts w:ascii="Times New Roman" w:hAnsi="Times New Roman" w:eastAsia="Times New Roman"/>
-          <w:b w:val="0"/>
-          <w:i w:val="0"/>
-          <w:color w:val="000000"/>
-          <w:sz w:val="28"/>
-          <w:cs w:val="0"/>
-        </w:rPr>
-        <w:t>3. Корректные строки попадают в таблицу формы и применяются согласно п. 4.</w:t>
-      </w:r>
-    </w:p>
-    <w:p>
-      <w:pPr>
-        <w:spacing w:after="80" w:before="0" w:line="360" w:lineRule="auto"/>
-        <w:ind w:left="709" w:hanging="425"/>
-        <w:jc w:val="both"/>
-      </w:pPr>
-      <w:r>
-        <w:rPr>
-          <w:rFonts w:ascii="Times New Roman" w:hAnsi="Times New Roman" w:eastAsia="Times New Roman"/>
-          <w:b w:val="0"/>
-          <w:i w:val="0"/>
-          <w:color w:val="000000"/>
-          <w:sz w:val="28"/>
-          <w:cs w:val="0"/>
-        </w:rPr>
-        <w:t>4. Явный раздел должен существовать и иметь тип объекта «Организации»; иначе строка не применяется, в протоколе фиксируется ошибка.</w:t>
-      </w:r>
-    </w:p>
-    <w:p>
-      <w:pPr>
-        <w:keepNext/>
-        <w:spacing w:after="160" w:before="240" w:line="360" w:lineRule="auto"/>
-        <w:ind w:firstLine="0"/>
-        <w:jc w:val="left"/>
-      </w:pPr>
-      <w:r>
-        <w:rPr>
-          <w:rFonts w:ascii="Times New Roman" w:hAnsi="Times New Roman" w:eastAsia="Times New Roman"/>
-          <w:b/>
-          <w:i w:val="0"/>
-          <w:color w:val="000000"/>
-          <w:sz w:val="28"/>
-          <w:cs w:val="0"/>
-        </w:rPr>
-        <w:t>8. Требования к автосдвигу дат</w:t>
-      </w:r>
-    </w:p>
-    <w:p>
-      <w:pPr>
-        <w:keepNext/>
-        <w:spacing w:after="160" w:before="240" w:line="360" w:lineRule="auto"/>
-        <w:ind w:firstLine="0"/>
-        <w:jc w:val="left"/>
-      </w:pPr>
-      <w:r>
-        <w:rPr>
-          <w:rFonts w:ascii="Times New Roman" w:hAnsi="Times New Roman" w:eastAsia="Times New Roman"/>
-          <w:b/>
-          <w:i w:val="0"/>
-          <w:color w:val="000000"/>
-          <w:sz w:val="28"/>
-          <w:cs w:val="0"/>
-        </w:rPr>
-        <w:t>8.1. Настройки</w:t>
-      </w:r>
-    </w:p>
-    <w:p>
-      <w:pPr>
-        <w:spacing w:after="120" w:before="0" w:line="360" w:lineRule="auto"/>
-        <w:ind w:firstLine="709"/>
-        <w:jc w:val="both"/>
-      </w:pPr>
-      <w:r>
-        <w:rPr>
-          <w:rFonts w:ascii="Times New Roman" w:hAnsi="Times New Roman" w:eastAsia="Times New Roman"/>
-          <w:b w:val="0"/>
-          <w:i w:val="0"/>
-          <w:color w:val="000000"/>
-          <w:sz w:val="28"/>
-          <w:cs w:val="0"/>
         </w:rPr>
         <w:t>Регистр сведений нп_НастройкиАвтосдвигаДатЗапрета:</w:t>
       </w:r>
@@ -4631,9 +3001,8 @@
           <w:i/>
           <w:color w:val="000000"/>
           <w:sz w:val="24"/>
-          <w:cs w:val="0"/>
         </w:rPr>
-        <w:t>Таблица 6 - Реквизиты настроек автосдвига</w:t>
+        <w:t>Таблица 5 - Реквизиты настроек автосдвига</w:t>
       </w:r>
     </w:p>
     <w:tbl>
@@ -4683,7 +3052,6 @@
                 <w:i w:val="0"/>
                 <w:color w:val="000000"/>
                 <w:sz w:val="24"/>
-                <w:cs w:val="0"/>
               </w:rPr>
               <w:t>Реквизит</w:t>
             </w:r>
@@ -4721,7 +3089,6 @@
                 <w:i w:val="0"/>
                 <w:color w:val="000000"/>
                 <w:sz w:val="24"/>
-                <w:cs w:val="0"/>
               </w:rPr>
               <w:t>Тип и смысл</w:t>
             </w:r>
@@ -4760,7 +3127,6 @@
                 <w:i w:val="0"/>
                 <w:color w:val="000000"/>
                 <w:sz w:val="24"/>
-                <w:cs w:val="0"/>
               </w:rPr>
               <w:t>Организация</w:t>
             </w:r>
@@ -4797,7 +3163,6 @@
                 <w:i w:val="0"/>
                 <w:color w:val="000000"/>
                 <w:sz w:val="24"/>
-                <w:cs w:val="0"/>
               </w:rPr>
               <w:t>СправочникСсылка.Организации</w:t>
             </w:r>
@@ -4836,7 +3201,6 @@
                 <w:i w:val="0"/>
                 <w:color w:val="000000"/>
                 <w:sz w:val="24"/>
-                <w:cs w:val="0"/>
               </w:rPr>
               <w:t>Количество дней N</w:t>
             </w:r>
@@ -4873,7 +3237,6 @@
                 <w:i w:val="0"/>
                 <w:color w:val="000000"/>
                 <w:sz w:val="24"/>
-                <w:cs w:val="0"/>
               </w:rPr>
               <w:t>число больше 0</w:t>
             </w:r>
@@ -4912,7 +3275,6 @@
                 <w:i w:val="0"/>
                 <w:color w:val="000000"/>
                 <w:sz w:val="24"/>
-                <w:cs w:val="0"/>
               </w:rPr>
               <w:t>Включено</w:t>
             </w:r>
@@ -4949,7 +3311,6 @@
                 <w:i w:val="0"/>
                 <w:color w:val="000000"/>
                 <w:sz w:val="24"/>
-                <w:cs w:val="0"/>
               </w:rPr>
               <w:t>булево</w:t>
             </w:r>
@@ -4977,9 +3338,8 @@
           <w:i w:val="0"/>
           <w:color w:val="000000"/>
           <w:sz w:val="28"/>
-          <w:cs w:val="0"/>
         </w:rPr>
-        <w:t>Настройки задаются формой бухгалтера и (или) колонкой N в файле Excel. Типовые относительные описания («конец прошлого месяца» и аналогичные) не подменяются.</w:t>
+        <w:t>Настройки задаются формой списка или записи регистра. Типовые относительные описания («конец прошлого месяца» и аналогичные) не подменяются.</w:t>
       </w:r>
     </w:p>
     <w:p>
@@ -4996,9 +3356,8 @@
           <w:i w:val="0"/>
           <w:color w:val="000000"/>
           <w:sz w:val="28"/>
-          <w:cs w:val="0"/>
         </w:rPr>
-        <w:t>8.2. Регламентное задание нп_СдвигДатЗапретаИзменения</w:t>
+        <w:t>6.2. Регламентное задание нп_СдвигДатЗапретаИзменения</w:t>
       </w:r>
     </w:p>
     <w:p>
@@ -5014,9 +3373,8 @@
           <w:i w:val="0"/>
           <w:color w:val="000000"/>
           <w:sz w:val="28"/>
-          <w:cs w:val="0"/>
         </w:rPr>
-        <w:t>Для каждой включенной настройки, по которой нет действующего окна заявки (п. 9.4), в типовой регистр записывается:</w:t>
+        <w:t>Для каждой включенной настройки, по которой нет действующей заявки на открытие периода (п. 7.4), в типовой регистр записывается:</w:t>
       </w:r>
     </w:p>
     <w:p>
@@ -5032,7 +3390,6 @@
           <w:i/>
           <w:color w:val="000000"/>
           <w:sz w:val="28"/>
-          <w:cs w:val="0"/>
         </w:rPr>
         <w:t>ДатаЗапрета равна началу дня текущей даты сеанса минус N дней.</w:t>
       </w:r>
@@ -5050,9 +3407,8 @@
           <w:i w:val="0"/>
           <w:color w:val="000000"/>
           <w:sz w:val="28"/>
-          <w:cs w:val="0"/>
         </w:rPr>
-        <w:t>Пример. Выполнение 18.08, N равно 10: ДатаЗапрета равна 08.08. На следующий день при тех же условиях граница сдвигается на один день вперед.</w:t>
+        <w:t>Пример. Выполнение 18.08, N равно 10: ДатаЗапрета равна 08.08. На следующий день при тех же условиях граница сдвигается на один день вперед (скользящая граница).</w:t>
       </w:r>
     </w:p>
     <w:p>
@@ -5069,9 +3425,8 @@
           <w:i w:val="0"/>
           <w:color w:val="000000"/>
           <w:sz w:val="28"/>
-          <w:cs w:val="0"/>
         </w:rPr>
-        <w:t>8.3. Ограничения задания</w:t>
+        <w:t>6.3. Ограничения задания</w:t>
       </w:r>
     </w:p>
     <w:p>
@@ -5087,7 +3442,6 @@
           <w:i w:val="0"/>
           <w:color w:val="000000"/>
           <w:sz w:val="28"/>
-          <w:cs w:val="0"/>
         </w:rPr>
         <w:t>1. Изменяются только ключи механизма (п. 4).</w:t>
       </w:r>
@@ -5105,7 +3459,6 @@
           <w:i w:val="0"/>
           <w:color w:val="000000"/>
           <w:sz w:val="28"/>
-          <w:cs w:val="0"/>
         </w:rPr>
         <w:t>2. Персональные строки пользователей не изменяются.</w:t>
       </w:r>
@@ -5123,7 +3476,6 @@
           <w:i w:val="0"/>
           <w:color w:val="000000"/>
           <w:sz w:val="28"/>
-          <w:cs w:val="0"/>
         </w:rPr>
         <w:t>3. Запись выполняется привилегированно и не должна отменяться проверкой даты запрета по самим записям механизма.</w:t>
       </w:r>
@@ -5141,9 +3493,8 @@
           <w:i w:val="0"/>
           <w:color w:val="000000"/>
           <w:sz w:val="28"/>
-          <w:cs w:val="0"/>
         </w:rPr>
-        <w:t>4. При наличии живого окна заявки по организации задание не записывает значение «сегодня минус N» по ключам этой заявки.</w:t>
+        <w:t>4. Если по организации есть согласованная заявка, срок действия открытого периода которой не истек, задание не записывает значение «сегодня минус N» по ключам этой заявки.</w:t>
       </w:r>
     </w:p>
     <w:p>
@@ -5159,9 +3510,8 @@
           <w:i w:val="0"/>
           <w:color w:val="000000"/>
           <w:sz w:val="28"/>
-          <w:cs w:val="0"/>
         </w:rPr>
-        <w:t>5. После истечения окна при включенном автосдвиге задание восстанавливает значение «сегодня минус N».</w:t>
+        <w:t>5. После истечения срока действия открытия при включенном автосдвиге задание восстанавливает значение «сегодня минус N».</w:t>
       </w:r>
     </w:p>
     <w:p>
@@ -5178,9 +3528,8 @@
           <w:i w:val="0"/>
           <w:color w:val="000000"/>
           <w:sz w:val="28"/>
-          <w:cs w:val="0"/>
         </w:rPr>
-        <w:t>9. Требования к заявке на открытие периода</w:t>
+        <w:t>7. Требования к заявке на открытие периода</w:t>
       </w:r>
     </w:p>
     <w:p>
@@ -5197,9 +3546,8 @@
           <w:i w:val="0"/>
           <w:color w:val="000000"/>
           <w:sz w:val="28"/>
-          <w:cs w:val="0"/>
         </w:rPr>
-        <w:t>9.1. Документ нп_ЗаявкаНаОткрытиеПериода</w:t>
+        <w:t>7.1. Документ нп_ЗаявкаНаОткрытиеПериода</w:t>
       </w:r>
     </w:p>
     <w:p>
@@ -5215,9 +3563,8 @@
           <w:i/>
           <w:color w:val="000000"/>
           <w:sz w:val="24"/>
-          <w:cs w:val="0"/>
         </w:rPr>
-        <w:t>Таблица 7 - Реквизиты документа заявки</w:t>
+        <w:t>Таблица 6 - Реквизиты документа заявки</w:t>
       </w:r>
     </w:p>
     <w:tbl>
@@ -5238,7 +3585,7 @@
         </w:trPr>
         <w:tc>
           <w:tcPr>
-            <w:tcW w:type="dxa" w:w="2835"/>
+            <w:tcW w:type="dxa" w:w="3118"/>
             <w:vAlign w:val="center"/>
             <w:tcBorders>
               <w:top w:val="single" w:sz="8" w:space="0" w:color="000000"/>
@@ -5268,7 +3615,6 @@
                 <w:i w:val="0"/>
                 <w:color w:val="000000"/>
                 <w:sz w:val="24"/>
-                <w:cs w:val="0"/>
               </w:rPr>
               <w:t>Реквизит</w:t>
             </w:r>
@@ -5306,7 +3652,6 @@
                 <w:i w:val="0"/>
                 <w:color w:val="000000"/>
                 <w:sz w:val="24"/>
-                <w:cs w:val="0"/>
               </w:rPr>
               <w:t>Обязательность</w:t>
             </w:r>
@@ -5314,7 +3659,7 @@
         </w:tc>
         <w:tc>
           <w:tcPr>
-            <w:tcW w:type="dxa" w:w="4706"/>
+            <w:tcW w:type="dxa" w:w="4422"/>
             <w:vAlign w:val="center"/>
             <w:tcBorders>
               <w:top w:val="single" w:sz="8" w:space="0" w:color="000000"/>
@@ -5344,7 +3689,6 @@
                 <w:i w:val="0"/>
                 <w:color w:val="000000"/>
                 <w:sz w:val="24"/>
-                <w:cs w:val="0"/>
               </w:rPr>
               <w:t>Описание</w:t>
             </w:r>
@@ -5354,7 +3698,7 @@
       <w:tr>
         <w:tc>
           <w:tcPr>
-            <w:tcW w:type="dxa" w:w="2835"/>
+            <w:tcW w:type="dxa" w:w="3118"/>
             <w:vAlign w:val="center"/>
             <w:tcBorders>
               <w:top w:val="single" w:sz="8" w:space="0" w:color="000000"/>
@@ -5383,7 +3727,6 @@
                 <w:i w:val="0"/>
                 <w:color w:val="000000"/>
                 <w:sz w:val="24"/>
-                <w:cs w:val="0"/>
               </w:rPr>
               <w:t>Организации (табличная часть)</w:t>
             </w:r>
@@ -5420,7 +3763,6 @@
                 <w:i w:val="0"/>
                 <w:color w:val="000000"/>
                 <w:sz w:val="24"/>
-                <w:cs w:val="0"/>
               </w:rPr>
               <w:t>да</w:t>
             </w:r>
@@ -5428,7 +3770,7 @@
         </w:tc>
         <w:tc>
           <w:tcPr>
-            <w:tcW w:type="dxa" w:w="4706"/>
+            <w:tcW w:type="dxa" w:w="4422"/>
             <w:vAlign w:val="center"/>
             <w:tcBorders>
               <w:top w:val="single" w:sz="8" w:space="0" w:color="000000"/>
@@ -5457,7 +3799,6 @@
                 <w:i w:val="0"/>
                 <w:color w:val="000000"/>
                 <w:sz w:val="24"/>
-                <w:cs w:val="0"/>
               </w:rPr>
               <w:t>одна или несколько организаций</w:t>
             </w:r>
@@ -5467,7 +3808,7 @@
       <w:tr>
         <w:tc>
           <w:tcPr>
-            <w:tcW w:type="dxa" w:w="2835"/>
+            <w:tcW w:type="dxa" w:w="3118"/>
             <w:vAlign w:val="center"/>
             <w:tcBorders>
               <w:top w:val="single" w:sz="8" w:space="0" w:color="000000"/>
@@ -5496,9 +3837,8 @@
                 <w:i w:val="0"/>
                 <w:color w:val="000000"/>
                 <w:sz w:val="24"/>
-                <w:cs w:val="0"/>
               </w:rPr>
-              <w:t>Срок действия K, дней</w:t>
+              <w:t>Срок действия открытого периода, дней (K)</w:t>
             </w:r>
           </w:p>
         </w:tc>
@@ -5533,7 +3873,6 @@
                 <w:i w:val="0"/>
                 <w:color w:val="000000"/>
                 <w:sz w:val="24"/>
-                <w:cs w:val="0"/>
               </w:rPr>
               <w:t>да</w:t>
             </w:r>
@@ -5541,7 +3880,7 @@
         </w:tc>
         <w:tc>
           <w:tcPr>
-            <w:tcW w:type="dxa" w:w="4706"/>
+            <w:tcW w:type="dxa" w:w="4422"/>
             <w:vAlign w:val="center"/>
             <w:tcBorders>
               <w:top w:val="single" w:sz="8" w:space="0" w:color="000000"/>
@@ -5570,7 +3909,6 @@
                 <w:i w:val="0"/>
                 <w:color w:val="000000"/>
                 <w:sz w:val="24"/>
-                <w:cs w:val="0"/>
               </w:rPr>
               <w:t>целое число больше 0</w:t>
             </w:r>
@@ -5580,7 +3918,7 @@
       <w:tr>
         <w:tc>
           <w:tcPr>
-            <w:tcW w:type="dxa" w:w="2835"/>
+            <w:tcW w:type="dxa" w:w="3118"/>
             <w:vAlign w:val="center"/>
             <w:tcBorders>
               <w:top w:val="single" w:sz="8" w:space="0" w:color="000000"/>
@@ -5609,7 +3947,6 @@
                 <w:i w:val="0"/>
                 <w:color w:val="000000"/>
                 <w:sz w:val="24"/>
-                <w:cs w:val="0"/>
               </w:rPr>
               <w:t>Период с</w:t>
             </w:r>
@@ -5646,7 +3983,6 @@
                 <w:i w:val="0"/>
                 <w:color w:val="000000"/>
                 <w:sz w:val="24"/>
-                <w:cs w:val="0"/>
               </w:rPr>
               <w:t>да</w:t>
             </w:r>
@@ -5654,7 +3990,7 @@
         </w:tc>
         <w:tc>
           <w:tcPr>
-            <w:tcW w:type="dxa" w:w="4706"/>
+            <w:tcW w:type="dxa" w:w="4422"/>
             <w:vAlign w:val="center"/>
             <w:tcBorders>
               <w:top w:val="single" w:sz="8" w:space="0" w:color="000000"/>
@@ -5683,9 +4019,8 @@
                 <w:i w:val="0"/>
                 <w:color w:val="000000"/>
                 <w:sz w:val="24"/>
-                <w:cs w:val="0"/>
               </w:rPr>
-              <w:t>начало открываемого периода</w:t>
+              <w:t>начало открываемого периода учета</w:t>
             </w:r>
           </w:p>
         </w:tc>
@@ -5693,7 +4028,7 @@
       <w:tr>
         <w:tc>
           <w:tcPr>
-            <w:tcW w:type="dxa" w:w="2835"/>
+            <w:tcW w:type="dxa" w:w="3118"/>
             <w:vAlign w:val="center"/>
             <w:tcBorders>
               <w:top w:val="single" w:sz="8" w:space="0" w:color="000000"/>
@@ -5722,7 +4057,6 @@
                 <w:i w:val="0"/>
                 <w:color w:val="000000"/>
                 <w:sz w:val="24"/>
-                <w:cs w:val="0"/>
               </w:rPr>
               <w:t>Период по</w:t>
             </w:r>
@@ -5759,7 +4093,6 @@
                 <w:i w:val="0"/>
                 <w:color w:val="000000"/>
                 <w:sz w:val="24"/>
-                <w:cs w:val="0"/>
               </w:rPr>
               <w:t>да</w:t>
             </w:r>
@@ -5767,7 +4100,7 @@
         </w:tc>
         <w:tc>
           <w:tcPr>
-            <w:tcW w:type="dxa" w:w="4706"/>
+            <w:tcW w:type="dxa" w:w="4422"/>
             <w:vAlign w:val="center"/>
             <w:tcBorders>
               <w:top w:val="single" w:sz="8" w:space="0" w:color="000000"/>
@@ -5796,7 +4129,6 @@
                 <w:i w:val="0"/>
                 <w:color w:val="000000"/>
                 <w:sz w:val="24"/>
-                <w:cs w:val="0"/>
               </w:rPr>
               <w:t>окончание открываемого периода; значение «Период с» не позже значения «Период по»</w:t>
             </w:r>
@@ -5806,7 +4138,7 @@
       <w:tr>
         <w:tc>
           <w:tcPr>
-            <w:tcW w:type="dxa" w:w="2835"/>
+            <w:tcW w:type="dxa" w:w="3118"/>
             <w:vAlign w:val="center"/>
             <w:tcBorders>
               <w:top w:val="single" w:sz="8" w:space="0" w:color="000000"/>
@@ -5835,7 +4167,6 @@
                 <w:i w:val="0"/>
                 <w:color w:val="000000"/>
                 <w:sz w:val="24"/>
-                <w:cs w:val="0"/>
               </w:rPr>
               <w:t>Раздел учета</w:t>
             </w:r>
@@ -5872,7 +4203,6 @@
                 <w:i w:val="0"/>
                 <w:color w:val="000000"/>
                 <w:sz w:val="24"/>
-                <w:cs w:val="0"/>
               </w:rPr>
               <w:t>нет</w:t>
             </w:r>
@@ -5880,7 +4210,7 @@
         </w:tc>
         <w:tc>
           <w:tcPr>
-            <w:tcW w:type="dxa" w:w="4706"/>
+            <w:tcW w:type="dxa" w:w="4422"/>
             <w:vAlign w:val="center"/>
             <w:tcBorders>
               <w:top w:val="single" w:sz="8" w:space="0" w:color="000000"/>
@@ -5909,7 +4239,6 @@
                 <w:i w:val="0"/>
                 <w:color w:val="000000"/>
                 <w:sz w:val="24"/>
-                <w:cs w:val="0"/>
               </w:rPr>
               <w:t>элемент плана видов характеристик РазделыДатЗапретаИзменения; пусто - все разделы с типом «Организации»</w:t>
             </w:r>
@@ -5937,7 +4266,6 @@
           <w:i w:val="0"/>
           <w:color w:val="000000"/>
           <w:sz w:val="28"/>
-          <w:cs w:val="0"/>
         </w:rPr>
         <w:t>При незаполненных обязательных полях запись документа отклоняется с указанием незаполненных реквизитов.</w:t>
       </w:r>
@@ -5955,7 +4283,6 @@
           <w:i w:val="0"/>
           <w:color w:val="000000"/>
           <w:sz w:val="28"/>
-          <w:cs w:val="0"/>
         </w:rPr>
         <w:t>На форме заявки выводится пояснение: отсечка БСП откроет все после даты «Период с минус 1 день», а не только выбранный месяц (открытие июля при уже закрытом августе откроет и август до новой отсечки).</w:t>
       </w:r>
@@ -5974,9 +4301,8 @@
           <w:i w:val="0"/>
           <w:color w:val="000000"/>
           <w:sz w:val="28"/>
-          <w:cs w:val="0"/>
         </w:rPr>
-        <w:t>9.2. Согласование в 1С:Документооборот 3</w:t>
+        <w:t>7.2. Согласование в 1С:Документооборот 3</w:t>
       </w:r>
     </w:p>
     <w:p>
@@ -5992,7 +4318,6 @@
           <w:i w:val="0"/>
           <w:color w:val="000000"/>
           <w:sz w:val="28"/>
-          <w:cs w:val="0"/>
         </w:rPr>
         <w:t>1. Отправка выполняется штатным программным интерфейсом ИнтеграцияС1СДокументооборот3.НачатьОбработку (или эквивалентом, используемым пилотными документами, в том числе контуром нп_КонтрольПроведенияПоДО).</w:t>
       </w:r>
@@ -6010,7 +4335,6 @@
           <w:i w:val="0"/>
           <w:color w:val="000000"/>
           <w:sz w:val="28"/>
-          <w:cs w:val="0"/>
         </w:rPr>
         <w:t>2. Маршрут настраивается в 1С:Документооборот 3 и в ERP не дублируется.</w:t>
       </w:r>
@@ -6028,7 +4352,6 @@
           <w:i w:val="0"/>
           <w:color w:val="000000"/>
           <w:sz w:val="28"/>
-          <w:cs w:val="0"/>
         </w:rPr>
         <w:t>3. Связь объекта хранится в регистре ОбъектыИнтегрированныеС1СДокументооборотом.</w:t>
       </w:r>
@@ -6046,7 +4369,6 @@
           <w:i w:val="0"/>
           <w:color w:val="000000"/>
           <w:sz w:val="28"/>
-          <w:cs w:val="0"/>
         </w:rPr>
         <w:t>4. Статус хранится в регистре СостоянияСогласованияВДокументообороте. Регламентное задание в веб-сервис Документооборота не обращается.</w:t>
       </w:r>
@@ -6064,7 +4386,6 @@
           <w:i w:val="0"/>
           <w:color w:val="000000"/>
           <w:sz w:val="28"/>
-          <w:cs w:val="0"/>
         </w:rPr>
         <w:t>5. Если веб-сервис Документооборота недоступен в момент отправки: заявка не считается согласованной, даты не меняются, пользователю выводится ошибка сервиса.</w:t>
       </w:r>
@@ -6083,9 +4404,8 @@
           <w:i w:val="0"/>
           <w:color w:val="000000"/>
           <w:sz w:val="28"/>
-          <w:cs w:val="0"/>
         </w:rPr>
-        <w:t>9.3. Запись в регистр только после согласования</w:t>
+        <w:t>7.3. Запись в регистр только после согласования</w:t>
       </w:r>
     </w:p>
     <w:p>
@@ -6101,7 +4421,6 @@
           <w:i w:val="0"/>
           <w:color w:val="000000"/>
           <w:sz w:val="28"/>
-          <w:cs w:val="0"/>
         </w:rPr>
         <w:t>Пока состояние не равно «Согласован» (черновик, нет связи с Документооборотом, состояние «На согласовании», отказ), заявка не изменяет типовой регистр сведений.</w:t>
       </w:r>
@@ -6120,9 +4439,8 @@
           <w:i w:val="0"/>
           <w:color w:val="000000"/>
           <w:sz w:val="28"/>
-          <w:cs w:val="0"/>
         </w:rPr>
-        <w:t>9.4. Окно действия</w:t>
+        <w:t>7.4. Срок действия открытого периода</w:t>
       </w:r>
     </w:p>
     <w:p>
@@ -6138,9 +4456,8 @@
           <w:i w:val="0"/>
           <w:color w:val="000000"/>
           <w:sz w:val="28"/>
-          <w:cs w:val="0"/>
         </w:rPr>
-        <w:t>День 1 - дата установки состояния «Согласован» (начало дня).</w:t>
+        <w:t>Срок действия открытого периода отсчитывается от даты установки состояния «Согласован» (начало дня). День согласования - день 1.</w:t>
       </w:r>
     </w:p>
     <w:p>
@@ -6156,9 +4473,8 @@
           <w:i w:val="0"/>
           <w:color w:val="000000"/>
           <w:sz w:val="28"/>
-          <w:cs w:val="0"/>
         </w:rPr>
-        <w:t>Окно действует с даты согласования по дату «дата согласования плюс (K минус 1)» включительно.</w:t>
+        <w:t>Срок действия открытого периода: с даты согласования по дату «дата согласования плюс (K минус 1)» включительно.</w:t>
       </w:r>
     </w:p>
     <w:p>
@@ -6174,9 +4490,8 @@
           <w:i w:val="0"/>
           <w:color w:val="000000"/>
           <w:sz w:val="28"/>
-          <w:cs w:val="0"/>
         </w:rPr>
-        <w:t>Пример. Согласовано 18.08, K равно 5: окно действует с 18.08 по 22.08 включительно. 23.08 окно истекло.</w:t>
+        <w:t>Пример. Согласовано 18.08, K равно 5: срок действия открытого периода с 18.08 по 22.08 включительно. 23.08 срок действия открытого периода истек.</w:t>
       </w:r>
     </w:p>
     <w:p>
@@ -6193,9 +4508,8 @@
           <w:i w:val="0"/>
           <w:color w:val="000000"/>
           <w:sz w:val="28"/>
-          <w:cs w:val="0"/>
         </w:rPr>
-        <w:t>9.5. Значение отсечки на время окна</w:t>
+        <w:t>7.5. Значение отсечки на срок действия открытого периода</w:t>
       </w:r>
     </w:p>
     <w:p>
@@ -6211,7 +4525,6 @@
           <w:i w:val="0"/>
           <w:color w:val="000000"/>
           <w:sz w:val="28"/>
-          <w:cs w:val="0"/>
         </w:rPr>
         <w:t>По ключам заявки (п. 4) записывается:</w:t>
       </w:r>
@@ -6229,7 +4542,6 @@
           <w:i/>
           <w:color w:val="000000"/>
           <w:sz w:val="28"/>
-          <w:cs w:val="0"/>
         </w:rPr>
         <w:t>ДатаЗапрета равна «Период с» минус 1 день.</w:t>
       </w:r>
@@ -6247,7 +4559,6 @@
           <w:i w:val="0"/>
           <w:color w:val="000000"/>
           <w:sz w:val="28"/>
-          <w:cs w:val="0"/>
         </w:rPr>
         <w:t>Пример. Открывается период с 01.07 по 31.07: в типовой регистр записывается 30.06.</w:t>
       </w:r>
@@ -6265,9 +4576,8 @@
           <w:i w:val="0"/>
           <w:color w:val="000000"/>
           <w:sz w:val="28"/>
-          <w:cs w:val="0"/>
         </w:rPr>
-        <w:t>Пока окно живо, автосдвиг эти ключи не перезаписывает значением «сегодня минус N». После истечения окна при включенном автосдвиге восстанавливается «сегодня минус N».</w:t>
+        <w:t>Пока срок действия открытого периода не истек, автосдвиг эти ключи не перезаписывает значением «сегодня минус N». После истечения срока действия открытого периода при включенном автосдвиге восстанавливается «сегодня минус N».</w:t>
       </w:r>
     </w:p>
     <w:p>
@@ -6283,7 +4593,6 @@
           <w:i w:val="0"/>
           <w:color w:val="000000"/>
           <w:sz w:val="28"/>
-          <w:cs w:val="0"/>
         </w:rPr>
         <w:t>Адресат записи - «для всех пользователей». Персональные строки пользователей заявка не изменяет.</w:t>
       </w:r>
@@ -6302,9 +4611,8 @@
           <w:i w:val="0"/>
           <w:color w:val="000000"/>
           <w:sz w:val="28"/>
-          <w:cs w:val="0"/>
         </w:rPr>
-        <w:t>10. Алгоритмы</w:t>
+        <w:t>8. Алгоритмы</w:t>
       </w:r>
     </w:p>
     <w:p>
@@ -6321,9 +4629,25 @@
           <w:i w:val="0"/>
           <w:color w:val="000000"/>
           <w:sz w:val="28"/>
-          <w:cs w:val="0"/>
         </w:rPr>
-        <w:t>10.1. Применение строки формы или файла Excel</w:t>
+        <w:t>8.1. Регламентное задание</w:t>
+      </w:r>
+    </w:p>
+    <w:p>
+      <w:pPr>
+        <w:spacing w:after="120" w:before="0" w:line="360" w:lineRule="auto"/>
+        <w:ind w:firstLine="709"/>
+        <w:jc w:val="both"/>
+      </w:pPr>
+      <w:r>
+        <w:rPr>
+          <w:rFonts w:ascii="Times New Roman" w:hAnsi="Times New Roman" w:eastAsia="Times New Roman"/>
+          <w:b w:val="0"/>
+          <w:i w:val="0"/>
+          <w:color w:val="000000"/>
+          <w:sz w:val="28"/>
+        </w:rPr>
+        <w:t>Для каждой включенной настройки автосдвига:</w:t>
       </w:r>
     </w:p>
     <w:p>
@@ -6339,9 +4663,8 @@
           <w:i w:val="0"/>
           <w:color w:val="000000"/>
           <w:sz w:val="28"/>
-          <w:cs w:val="0"/>
         </w:rPr>
-        <w:t>1. Определить организацию и проверить, что она входит в доступный пользователю список. Иначе - отказ.</w:t>
+        <w:t>1. Найти согласованные заявки по организации, срок действия открытого периода которых (п. 7.4) еще не истек.</w:t>
       </w:r>
     </w:p>
     <w:p>
@@ -6357,9 +4680,42 @@
           <w:i w:val="0"/>
           <w:color w:val="000000"/>
           <w:sz w:val="28"/>
-          <w:cs w:val="0"/>
         </w:rPr>
-        <w:t>2. Определить набор разделов: явный раздел либо все разделы с типом объекта «Организации».</w:t>
+        <w:t>2. Если такая заявка есть:</w:t>
+      </w:r>
+    </w:p>
+    <w:p>
+      <w:pPr>
+        <w:spacing w:after="60" w:before="0" w:line="360" w:lineRule="auto"/>
+        <w:ind w:left="1134" w:hanging="425"/>
+        <w:jc w:val="both"/>
+      </w:pPr>
+      <w:r>
+        <w:rPr>
+          <w:rFonts w:ascii="Times New Roman" w:hAnsi="Times New Roman" w:eastAsia="Times New Roman"/>
+          <w:b w:val="0"/>
+          <w:i w:val="0"/>
+          <w:color w:val="000000"/>
+          <w:sz w:val="28"/>
+        </w:rPr>
+        <w:t>- убедиться, что по ключам заявки стоит значение «Период с минус 1 день»;</w:t>
+      </w:r>
+    </w:p>
+    <w:p>
+      <w:pPr>
+        <w:spacing w:after="60" w:before="0" w:line="360" w:lineRule="auto"/>
+        <w:ind w:left="1134" w:hanging="425"/>
+        <w:jc w:val="both"/>
+      </w:pPr>
+      <w:r>
+        <w:rPr>
+          <w:rFonts w:ascii="Times New Roman" w:hAnsi="Times New Roman" w:eastAsia="Times New Roman"/>
+          <w:b w:val="0"/>
+          <w:i w:val="0"/>
+          <w:color w:val="000000"/>
+          <w:sz w:val="28"/>
+        </w:rPr>
+        <w:t>- значение «сегодня минус N» по этим ключам не записывать.</w:t>
       </w:r>
     </w:p>
     <w:p>
@@ -6375,9 +4731,8 @@
           <w:i w:val="0"/>
           <w:color w:val="000000"/>
           <w:sz w:val="28"/>
-          <w:cs w:val="0"/>
         </w:rPr>
-        <w:t>3. Если задано N больше 0 - записать или обновить нп_НастройкиАвтосдвигаДатЗапрета (организация, N, включено).</w:t>
+        <w:t>3. Если действующей заявки нет: рассчитать «сегодня минус N» и записать только ключи механизма по организации настройки.</w:t>
       </w:r>
     </w:p>
     <w:p>
@@ -6393,9 +4748,8 @@
           <w:i w:val="0"/>
           <w:color w:val="000000"/>
           <w:sz w:val="28"/>
-          <w:cs w:val="0"/>
         </w:rPr>
-        <w:t>4. Если задана абсолютная дата - записать ключи типового регистра (п. 4) с этой датой. Если N не задан, автосдвиг по этой строке не включать.</w:t>
+        <w:t>4. Не изменять персональные строки и разделы иных типов объектов.</w:t>
       </w:r>
     </w:p>
     <w:p>
@@ -6411,7 +4765,6 @@
           <w:i w:val="0"/>
           <w:color w:val="000000"/>
           <w:sz w:val="28"/>
-          <w:cs w:val="0"/>
         </w:rPr>
         <w:t>5. Обновить действующие даты запрета БСП.</w:t>
       </w:r>
@@ -6429,188 +4782,6 @@
           <w:i w:val="0"/>
           <w:color w:val="000000"/>
           <w:sz w:val="28"/>
-          <w:cs w:val="0"/>
-        </w:rPr>
-        <w:t>6. Записать событие в журнал регистрации.</w:t>
-      </w:r>
-    </w:p>
-    <w:p>
-      <w:pPr>
-        <w:keepNext/>
-        <w:spacing w:after="160" w:before="240" w:line="360" w:lineRule="auto"/>
-        <w:ind w:firstLine="0"/>
-        <w:jc w:val="left"/>
-      </w:pPr>
-      <w:r>
-        <w:rPr>
-          <w:rFonts w:ascii="Times New Roman" w:hAnsi="Times New Roman" w:eastAsia="Times New Roman"/>
-          <w:b/>
-          <w:i w:val="0"/>
-          <w:color w:val="000000"/>
-          <w:sz w:val="28"/>
-          <w:cs w:val="0"/>
-        </w:rPr>
-        <w:t>10.2. Регламентное задание</w:t>
-      </w:r>
-    </w:p>
-    <w:p>
-      <w:pPr>
-        <w:spacing w:after="120" w:before="0" w:line="360" w:lineRule="auto"/>
-        <w:ind w:firstLine="709"/>
-        <w:jc w:val="both"/>
-      </w:pPr>
-      <w:r>
-        <w:rPr>
-          <w:rFonts w:ascii="Times New Roman" w:hAnsi="Times New Roman" w:eastAsia="Times New Roman"/>
-          <w:b w:val="0"/>
-          <w:i w:val="0"/>
-          <w:color w:val="000000"/>
-          <w:sz w:val="28"/>
-          <w:cs w:val="0"/>
-        </w:rPr>
-        <w:t>Для каждой включенной настройки автосдвига:</w:t>
-      </w:r>
-    </w:p>
-    <w:p>
-      <w:pPr>
-        <w:spacing w:after="80" w:before="0" w:line="360" w:lineRule="auto"/>
-        <w:ind w:left="709" w:hanging="425"/>
-        <w:jc w:val="both"/>
-      </w:pPr>
-      <w:r>
-        <w:rPr>
-          <w:rFonts w:ascii="Times New Roman" w:hAnsi="Times New Roman" w:eastAsia="Times New Roman"/>
-          <w:b w:val="0"/>
-          <w:i w:val="0"/>
-          <w:color w:val="000000"/>
-          <w:sz w:val="28"/>
-          <w:cs w:val="0"/>
-        </w:rPr>
-        <w:t>1. Найти действующие согласованные заявки по организации (окно по п. 9.4 еще не истекло).</w:t>
-      </w:r>
-    </w:p>
-    <w:p>
-      <w:pPr>
-        <w:spacing w:after="80" w:before="0" w:line="360" w:lineRule="auto"/>
-        <w:ind w:left="709" w:hanging="425"/>
-        <w:jc w:val="both"/>
-      </w:pPr>
-      <w:r>
-        <w:rPr>
-          <w:rFonts w:ascii="Times New Roman" w:hAnsi="Times New Roman" w:eastAsia="Times New Roman"/>
-          <w:b w:val="0"/>
-          <w:i w:val="0"/>
-          <w:color w:val="000000"/>
-          <w:sz w:val="28"/>
-          <w:cs w:val="0"/>
-        </w:rPr>
-        <w:t>2. Если живое окно есть:</w:t>
-      </w:r>
-    </w:p>
-    <w:p>
-      <w:pPr>
-        <w:spacing w:after="60" w:before="0" w:line="360" w:lineRule="auto"/>
-        <w:ind w:left="1134" w:hanging="425"/>
-        <w:jc w:val="both"/>
-      </w:pPr>
-      <w:r>
-        <w:rPr>
-          <w:rFonts w:ascii="Times New Roman" w:hAnsi="Times New Roman" w:eastAsia="Times New Roman"/>
-          <w:b w:val="0"/>
-          <w:i w:val="0"/>
-          <w:color w:val="000000"/>
-          <w:sz w:val="28"/>
-          <w:cs w:val="0"/>
-        </w:rPr>
-        <w:t>- убедиться, что по ключам заявки стоит значение «Период с минус 1 день»;</w:t>
-      </w:r>
-    </w:p>
-    <w:p>
-      <w:pPr>
-        <w:spacing w:after="60" w:before="0" w:line="360" w:lineRule="auto"/>
-        <w:ind w:left="1134" w:hanging="425"/>
-        <w:jc w:val="both"/>
-      </w:pPr>
-      <w:r>
-        <w:rPr>
-          <w:rFonts w:ascii="Times New Roman" w:hAnsi="Times New Roman" w:eastAsia="Times New Roman"/>
-          <w:b w:val="0"/>
-          <w:i w:val="0"/>
-          <w:color w:val="000000"/>
-          <w:sz w:val="28"/>
-          <w:cs w:val="0"/>
-        </w:rPr>
-        <w:t>- значение «сегодня минус N» по этим ключам не записывать.</w:t>
-      </w:r>
-    </w:p>
-    <w:p>
-      <w:pPr>
-        <w:spacing w:after="80" w:before="0" w:line="360" w:lineRule="auto"/>
-        <w:ind w:left="709" w:hanging="425"/>
-        <w:jc w:val="both"/>
-      </w:pPr>
-      <w:r>
-        <w:rPr>
-          <w:rFonts w:ascii="Times New Roman" w:hAnsi="Times New Roman" w:eastAsia="Times New Roman"/>
-          <w:b w:val="0"/>
-          <w:i w:val="0"/>
-          <w:color w:val="000000"/>
-          <w:sz w:val="28"/>
-          <w:cs w:val="0"/>
-        </w:rPr>
-        <w:t>3. Если живого окна нет: рассчитать «сегодня минус N» и записать только ключи механизма по организации настройки.</w:t>
-      </w:r>
-    </w:p>
-    <w:p>
-      <w:pPr>
-        <w:spacing w:after="80" w:before="0" w:line="360" w:lineRule="auto"/>
-        <w:ind w:left="709" w:hanging="425"/>
-        <w:jc w:val="both"/>
-      </w:pPr>
-      <w:r>
-        <w:rPr>
-          <w:rFonts w:ascii="Times New Roman" w:hAnsi="Times New Roman" w:eastAsia="Times New Roman"/>
-          <w:b w:val="0"/>
-          <w:i w:val="0"/>
-          <w:color w:val="000000"/>
-          <w:sz w:val="28"/>
-          <w:cs w:val="0"/>
-        </w:rPr>
-        <w:t>4. Не изменять персональные строки и разделы иных типов объектов.</w:t>
-      </w:r>
-    </w:p>
-    <w:p>
-      <w:pPr>
-        <w:spacing w:after="80" w:before="0" w:line="360" w:lineRule="auto"/>
-        <w:ind w:left="709" w:hanging="425"/>
-        <w:jc w:val="both"/>
-      </w:pPr>
-      <w:r>
-        <w:rPr>
-          <w:rFonts w:ascii="Times New Roman" w:hAnsi="Times New Roman" w:eastAsia="Times New Roman"/>
-          <w:b w:val="0"/>
-          <w:i w:val="0"/>
-          <w:color w:val="000000"/>
-          <w:sz w:val="28"/>
-          <w:cs w:val="0"/>
-        </w:rPr>
-        <w:t>5. Обновить действующие даты запрета БСП.</w:t>
-      </w:r>
-    </w:p>
-    <w:p>
-      <w:pPr>
-        <w:spacing w:after="80" w:before="0" w:line="360" w:lineRule="auto"/>
-        <w:ind w:left="709" w:hanging="425"/>
-        <w:jc w:val="both"/>
-      </w:pPr>
-      <w:r>
-        <w:rPr>
-          <w:rFonts w:ascii="Times New Roman" w:hAnsi="Times New Roman" w:eastAsia="Times New Roman"/>
-          <w:b w:val="0"/>
-          <w:i w:val="0"/>
-          <w:color w:val="000000"/>
-          <w:sz w:val="28"/>
-          <w:cs w:val="0"/>
         </w:rPr>
         <w:t>6. Записать результат в журнал регистрации.</w:t>
       </w:r>
@@ -6629,9 +4800,8 @@
           <w:i w:val="0"/>
           <w:color w:val="000000"/>
           <w:sz w:val="28"/>
-          <w:cs w:val="0"/>
         </w:rPr>
-        <w:t>10.3. Согласование заявки</w:t>
+        <w:t>8.2. Согласование заявки</w:t>
       </w:r>
     </w:p>
     <w:p>
@@ -6647,9 +4817,8 @@
           <w:i w:val="0"/>
           <w:color w:val="000000"/>
           <w:sz w:val="28"/>
-          <w:cs w:val="0"/>
         </w:rPr>
-        <w:t>1. Пользователь записывает документ (проверка п. 9.1). Типовой регистр сведений не меняется.</w:t>
+        <w:t>1. Пользователь записывает документ (проверка п. 7.1). Типовой регистр сведений не меняется.</w:t>
       </w:r>
     </w:p>
     <w:p>
@@ -6665,7 +4834,6 @@
           <w:i w:val="0"/>
           <w:color w:val="000000"/>
           <w:sz w:val="28"/>
-          <w:cs w:val="0"/>
         </w:rPr>
         <w:t>2. Пользователь инициирует обработку в 1С:Документооборот 3. При ошибке сервиса выводится сообщение, статус «согласован» не ставится.</w:t>
       </w:r>
@@ -6683,9 +4851,8 @@
           <w:i w:val="0"/>
           <w:color w:val="000000"/>
           <w:sz w:val="28"/>
-          <w:cs w:val="0"/>
         </w:rPr>
-        <w:t>3. После появления состояния «Согласован»: вычислить окно по п. 9.4; записать в типовой регистр значение «Период с минус 1 день» по ключам заявки; обновить действующие даты запрета БСП.</w:t>
+        <w:t>3. После появления состояния «Согласован»: определить срок действия открытого периода по п. 7.4; записать в типовой регистр значение «Период с минус 1 день» по ключам заявки; обновить действующие даты запрета БСП.</w:t>
       </w:r>
     </w:p>
     <w:p>
@@ -6701,9 +4868,8 @@
           <w:i w:val="0"/>
           <w:color w:val="000000"/>
           <w:sz w:val="28"/>
-          <w:cs w:val="0"/>
         </w:rPr>
-        <w:t>4. Дальнейшее сопровождение окна выполняется регламентным заданием (п. 10.2).</w:t>
+        <w:t>4. Дальнейшее сопровождение срока действия открытия выполняется регламентным заданием (п. 8.1).</w:t>
       </w:r>
     </w:p>
     <w:p>
@@ -6720,9 +4886,8 @@
           <w:i w:val="0"/>
           <w:color w:val="000000"/>
           <w:sz w:val="28"/>
-          <w:cs w:val="0"/>
         </w:rPr>
-        <w:t>11. Требования к интерфейсу и сообщениям</w:t>
+        <w:t>9. Требования к интерфейсу и сообщениям</w:t>
       </w:r>
     </w:p>
     <w:p>
@@ -6738,9 +4903,8 @@
           <w:i w:val="0"/>
           <w:color w:val="000000"/>
           <w:sz w:val="28"/>
-          <w:cs w:val="0"/>
         </w:rPr>
-        <w:t>1. Форма бухгалтера не содержит команд открытия типового администрирования регистра.</w:t>
+        <w:t>1. На форме заявки выводится предупреждение об односторонней отсечке БСП (п. 7.1).</w:t>
       </w:r>
     </w:p>
     <w:p>
@@ -6756,45 +4920,8 @@
           <w:i w:val="0"/>
           <w:color w:val="000000"/>
           <w:sz w:val="28"/>
-          <w:cs w:val="0"/>
         </w:rPr>
-        <w:t>2. Протокол загрузки из Excel - построчный, с причиной отказа (сопоставление, права, неверный раздел).</w:t>
-      </w:r>
-    </w:p>
-    <w:p>
-      <w:pPr>
-        <w:spacing w:after="80" w:before="0" w:line="360" w:lineRule="auto"/>
-        <w:ind w:left="709" w:hanging="425"/>
-        <w:jc w:val="both"/>
-      </w:pPr>
-      <w:r>
-        <w:rPr>
-          <w:rFonts w:ascii="Times New Roman" w:hAnsi="Times New Roman" w:eastAsia="Times New Roman"/>
-          <w:b w:val="0"/>
-          <w:i w:val="0"/>
-          <w:color w:val="000000"/>
-          <w:sz w:val="28"/>
-          <w:cs w:val="0"/>
-        </w:rPr>
-        <w:t>3. На форме заявки выводится предупреждение об односторонней отсечке БСП (п. 9.1).</w:t>
-      </w:r>
-    </w:p>
-    <w:p>
-      <w:pPr>
-        <w:spacing w:after="80" w:before="0" w:line="360" w:lineRule="auto"/>
-        <w:ind w:left="709" w:hanging="425"/>
-        <w:jc w:val="both"/>
-      </w:pPr>
-      <w:r>
-        <w:rPr>
-          <w:rFonts w:ascii="Times New Roman" w:hAnsi="Times New Roman" w:eastAsia="Times New Roman"/>
-          <w:b w:val="0"/>
-          <w:i w:val="0"/>
-          <w:color w:val="000000"/>
-          <w:sz w:val="28"/>
-          <w:cs w:val="0"/>
-        </w:rPr>
-        <w:t>4. Отказ записи чужой организации - понятное сообщение без частичной записи набора.</w:t>
+        <w:t>2. Ошибка сервиса Документооборота - понятное сообщение; заявка не считается согласованной.</w:t>
       </w:r>
     </w:p>
     <w:p>
@@ -6811,9 +4938,8 @@
           <w:i w:val="0"/>
           <w:color w:val="000000"/>
           <w:sz w:val="28"/>
-          <w:cs w:val="0"/>
         </w:rPr>
-        <w:t>12. Критерии приемки</w:t>
+        <w:t>10. Критерии приемки</w:t>
       </w:r>
     </w:p>
     <w:p>
@@ -6829,9 +4955,8 @@
           <w:i/>
           <w:color w:val="000000"/>
           <w:sz w:val="24"/>
-          <w:cs w:val="0"/>
         </w:rPr>
-        <w:t>Таблица 8 - Критерии приемки</w:t>
+        <w:t>Таблица 7 - Критерии приемки</w:t>
       </w:r>
     </w:p>
     <w:tbl>
@@ -6882,7 +5007,6 @@
                 <w:i w:val="0"/>
                 <w:color w:val="000000"/>
                 <w:sz w:val="24"/>
-                <w:cs w:val="0"/>
               </w:rPr>
               <w:t>N</w:t>
             </w:r>
@@ -6920,7 +5044,6 @@
                 <w:i w:val="0"/>
                 <w:color w:val="000000"/>
                 <w:sz w:val="24"/>
-                <w:cs w:val="0"/>
               </w:rPr>
               <w:t>Сценарий</w:t>
             </w:r>
@@ -6958,7 +5081,6 @@
                 <w:i w:val="0"/>
                 <w:color w:val="000000"/>
                 <w:sz w:val="24"/>
-                <w:cs w:val="0"/>
               </w:rPr>
               <w:t>Ожидаемый результат</w:t>
             </w:r>
@@ -6997,7 +5119,6 @@
                 <w:i w:val="0"/>
                 <w:color w:val="000000"/>
                 <w:sz w:val="24"/>
-                <w:cs w:val="0"/>
               </w:rPr>
               <w:t>1</w:t>
             </w:r>
@@ -7034,7 +5155,6 @@
                 <w:i w:val="0"/>
                 <w:color w:val="000000"/>
                 <w:sz w:val="24"/>
-                <w:cs w:val="0"/>
               </w:rPr>
               <w:t>Автосдвиг без заявки, N равно 10, дата сеанса 18.08</w:t>
             </w:r>
@@ -7071,7 +5191,6 @@
                 <w:i w:val="0"/>
                 <w:color w:val="000000"/>
                 <w:sz w:val="24"/>
-                <w:cs w:val="0"/>
               </w:rPr>
               <w:t>В типовом регистре по ключам механизма ДатаЗапрета равна 08.08; на следующий день - 09.08</w:t>
             </w:r>
@@ -7110,7 +5229,6 @@
                 <w:i w:val="0"/>
                 <w:color w:val="000000"/>
                 <w:sz w:val="24"/>
-                <w:cs w:val="0"/>
               </w:rPr>
               <w:t>2</w:t>
             </w:r>
@@ -7147,7 +5265,6 @@
                 <w:i w:val="0"/>
                 <w:color w:val="000000"/>
                 <w:sz w:val="24"/>
-                <w:cs w:val="0"/>
               </w:rPr>
               <w:t>Заявка, K равно 5, согласована 18.08, период с 01.07</w:t>
             </w:r>
@@ -7184,7 +5301,6 @@
                 <w:i w:val="0"/>
                 <w:color w:val="000000"/>
                 <w:sz w:val="24"/>
-                <w:cs w:val="0"/>
               </w:rPr>
               <w:t>С 18.08 по 22.08 в регистре отсечка 30.06; задание 20.08 не ставит «сегодня минус N»; 23.08 при включенном N снова «сегодня минус N»</w:t>
             </w:r>
@@ -7223,7 +5339,6 @@
                 <w:i w:val="0"/>
                 <w:color w:val="000000"/>
                 <w:sz w:val="24"/>
-                <w:cs w:val="0"/>
               </w:rPr>
               <w:t>3</w:t>
             </w:r>
@@ -7260,233 +5375,6 @@
                 <w:i w:val="0"/>
                 <w:color w:val="000000"/>
                 <w:sz w:val="24"/>
-                <w:cs w:val="0"/>
-              </w:rPr>
-              <w:t>Файл Excel: своя организация, N, чужая организация, пустой и явный раздел</w:t>
-            </w:r>
-          </w:p>
-        </w:tc>
-        <w:tc>
-          <w:tcPr>
-            <w:tcW w:type="dxa" w:w="5102"/>
-            <w:vAlign w:val="center"/>
-            <w:tcBorders>
-              <w:top w:val="single" w:sz="8" w:space="0" w:color="000000"/>
-              <w:left w:val="single" w:sz="8" w:space="0" w:color="000000"/>
-              <w:bottom w:val="single" w:sz="8" w:space="0" w:color="000000"/>
-              <w:right w:val="single" w:sz="8" w:space="0" w:color="000000"/>
-            </w:tcBorders>
-            <w:tcMar>
-              <w:top w:w="45" w:type="dxa"/>
-              <w:left w:w="45" w:type="dxa"/>
-              <w:bottom w:w="45" w:type="dxa"/>
-              <w:right w:w="45" w:type="dxa"/>
-            </w:tcMar>
-          </w:tcPr>
-          <w:p>
-            <w:pPr>
-              <w:spacing w:after="0" w:before="0" w:line="240" w:lineRule="auto"/>
-              <w:ind w:firstLine="0"/>
-              <w:jc w:val="left"/>
-            </w:pPr>
-            <w:r/>
-            <w:r>
-              <w:rPr>
-                <w:rFonts w:ascii="Times New Roman" w:hAnsi="Times New Roman" w:eastAsia="Times New Roman"/>
-                <w:b w:val="0"/>
-                <w:i w:val="0"/>
-                <w:color w:val="000000"/>
-                <w:sz w:val="24"/>
-                <w:cs w:val="0"/>
-              </w:rPr>
-              <w:t>Свои строки применяются по правилам п. 7; чужая - отказ в протоколе; пустой раздел не затрагивает кассу, склад, сценарии, банк</w:t>
-            </w:r>
-          </w:p>
-        </w:tc>
-      </w:tr>
-      <w:tr>
-        <w:tc>
-          <w:tcPr>
-            <w:tcW w:type="dxa" w:w="680"/>
-            <w:vAlign w:val="center"/>
-            <w:tcBorders>
-              <w:top w:val="single" w:sz="8" w:space="0" w:color="000000"/>
-              <w:left w:val="single" w:sz="8" w:space="0" w:color="000000"/>
-              <w:bottom w:val="single" w:sz="8" w:space="0" w:color="000000"/>
-              <w:right w:val="single" w:sz="8" w:space="0" w:color="000000"/>
-            </w:tcBorders>
-            <w:tcMar>
-              <w:top w:w="45" w:type="dxa"/>
-              <w:left w:w="45" w:type="dxa"/>
-              <w:bottom w:w="45" w:type="dxa"/>
-              <w:right w:w="45" w:type="dxa"/>
-            </w:tcMar>
-          </w:tcPr>
-          <w:p>
-            <w:pPr>
-              <w:spacing w:after="0" w:before="0" w:line="240" w:lineRule="auto"/>
-              <w:ind w:firstLine="0"/>
-              <w:jc w:val="center"/>
-            </w:pPr>
-            <w:r/>
-            <w:r>
-              <w:rPr>
-                <w:rFonts w:ascii="Times New Roman" w:hAnsi="Times New Roman" w:eastAsia="Times New Roman"/>
-                <w:b w:val="0"/>
-                <w:i w:val="0"/>
-                <w:color w:val="000000"/>
-                <w:sz w:val="24"/>
-                <w:cs w:val="0"/>
-              </w:rPr>
-              <w:t>4</w:t>
-            </w:r>
-          </w:p>
-        </w:tc>
-        <w:tc>
-          <w:tcPr>
-            <w:tcW w:type="dxa" w:w="3572"/>
-            <w:vAlign w:val="center"/>
-            <w:tcBorders>
-              <w:top w:val="single" w:sz="8" w:space="0" w:color="000000"/>
-              <w:left w:val="single" w:sz="8" w:space="0" w:color="000000"/>
-              <w:bottom w:val="single" w:sz="8" w:space="0" w:color="000000"/>
-              <w:right w:val="single" w:sz="8" w:space="0" w:color="000000"/>
-            </w:tcBorders>
-            <w:tcMar>
-              <w:top w:w="45" w:type="dxa"/>
-              <w:left w:w="45" w:type="dxa"/>
-              <w:bottom w:w="45" w:type="dxa"/>
-              <w:right w:w="45" w:type="dxa"/>
-            </w:tcMar>
-          </w:tcPr>
-          <w:p>
-            <w:pPr>
-              <w:spacing w:after="0" w:before="0" w:line="240" w:lineRule="auto"/>
-              <w:ind w:firstLine="0"/>
-              <w:jc w:val="left"/>
-            </w:pPr>
-            <w:r/>
-            <w:r>
-              <w:rPr>
-                <w:rFonts w:ascii="Times New Roman" w:hAnsi="Times New Roman" w:eastAsia="Times New Roman"/>
-                <w:b w:val="0"/>
-                <w:i w:val="0"/>
-                <w:color w:val="000000"/>
-                <w:sz w:val="24"/>
-                <w:cs w:val="0"/>
-              </w:rPr>
-              <w:t>Бухгалтер без типовых ролей регистра</w:t>
-            </w:r>
-          </w:p>
-        </w:tc>
-        <w:tc>
-          <w:tcPr>
-            <w:tcW w:type="dxa" w:w="5102"/>
-            <w:vAlign w:val="center"/>
-            <w:tcBorders>
-              <w:top w:val="single" w:sz="8" w:space="0" w:color="000000"/>
-              <w:left w:val="single" w:sz="8" w:space="0" w:color="000000"/>
-              <w:bottom w:val="single" w:sz="8" w:space="0" w:color="000000"/>
-              <w:right w:val="single" w:sz="8" w:space="0" w:color="000000"/>
-            </w:tcBorders>
-            <w:tcMar>
-              <w:top w:w="45" w:type="dxa"/>
-              <w:left w:w="45" w:type="dxa"/>
-              <w:bottom w:w="45" w:type="dxa"/>
-              <w:right w:w="45" w:type="dxa"/>
-            </w:tcMar>
-          </w:tcPr>
-          <w:p>
-            <w:pPr>
-              <w:spacing w:after="0" w:before="0" w:line="240" w:lineRule="auto"/>
-              <w:ind w:firstLine="0"/>
-              <w:jc w:val="left"/>
-            </w:pPr>
-            <w:r/>
-            <w:r>
-              <w:rPr>
-                <w:rFonts w:ascii="Times New Roman" w:hAnsi="Times New Roman" w:eastAsia="Times New Roman"/>
-                <w:b w:val="0"/>
-                <w:i w:val="0"/>
-                <w:color w:val="000000"/>
-                <w:sz w:val="24"/>
-                <w:cs w:val="0"/>
-              </w:rPr>
-              <w:t>Обработка открывается; типовая форма регистра недоступна; чужие организации не записываются</w:t>
-            </w:r>
-          </w:p>
-        </w:tc>
-      </w:tr>
-      <w:tr>
-        <w:tc>
-          <w:tcPr>
-            <w:tcW w:type="dxa" w:w="680"/>
-            <w:vAlign w:val="center"/>
-            <w:tcBorders>
-              <w:top w:val="single" w:sz="8" w:space="0" w:color="000000"/>
-              <w:left w:val="single" w:sz="8" w:space="0" w:color="000000"/>
-              <w:bottom w:val="single" w:sz="8" w:space="0" w:color="000000"/>
-              <w:right w:val="single" w:sz="8" w:space="0" w:color="000000"/>
-            </w:tcBorders>
-            <w:tcMar>
-              <w:top w:w="45" w:type="dxa"/>
-              <w:left w:w="45" w:type="dxa"/>
-              <w:bottom w:w="45" w:type="dxa"/>
-              <w:right w:w="45" w:type="dxa"/>
-            </w:tcMar>
-          </w:tcPr>
-          <w:p>
-            <w:pPr>
-              <w:spacing w:after="0" w:before="0" w:line="240" w:lineRule="auto"/>
-              <w:ind w:firstLine="0"/>
-              <w:jc w:val="center"/>
-            </w:pPr>
-            <w:r/>
-            <w:r>
-              <w:rPr>
-                <w:rFonts w:ascii="Times New Roman" w:hAnsi="Times New Roman" w:eastAsia="Times New Roman"/>
-                <w:b w:val="0"/>
-                <w:i w:val="0"/>
-                <w:color w:val="000000"/>
-                <w:sz w:val="24"/>
-                <w:cs w:val="0"/>
-              </w:rPr>
-              <w:t>5</w:t>
-            </w:r>
-          </w:p>
-        </w:tc>
-        <w:tc>
-          <w:tcPr>
-            <w:tcW w:type="dxa" w:w="3572"/>
-            <w:vAlign w:val="center"/>
-            <w:tcBorders>
-              <w:top w:val="single" w:sz="8" w:space="0" w:color="000000"/>
-              <w:left w:val="single" w:sz="8" w:space="0" w:color="000000"/>
-              <w:bottom w:val="single" w:sz="8" w:space="0" w:color="000000"/>
-              <w:right w:val="single" w:sz="8" w:space="0" w:color="000000"/>
-            </w:tcBorders>
-            <w:tcMar>
-              <w:top w:w="45" w:type="dxa"/>
-              <w:left w:w="45" w:type="dxa"/>
-              <w:bottom w:w="45" w:type="dxa"/>
-              <w:right w:w="45" w:type="dxa"/>
-            </w:tcMar>
-          </w:tcPr>
-          <w:p>
-            <w:pPr>
-              <w:spacing w:after="0" w:before="0" w:line="240" w:lineRule="auto"/>
-              <w:ind w:firstLine="0"/>
-              <w:jc w:val="left"/>
-            </w:pPr>
-            <w:r/>
-            <w:r>
-              <w:rPr>
-                <w:rFonts w:ascii="Times New Roman" w:hAnsi="Times New Roman" w:eastAsia="Times New Roman"/>
-                <w:b w:val="0"/>
-                <w:i w:val="0"/>
-                <w:color w:val="000000"/>
-                <w:sz w:val="24"/>
-                <w:cs w:val="0"/>
               </w:rPr>
               <w:t>По организации есть персональная дата пользователя</w:t>
             </w:r>
@@ -7523,7 +5411,6 @@
                 <w:i w:val="0"/>
                 <w:color w:val="000000"/>
                 <w:sz w:val="24"/>
-                <w:cs w:val="0"/>
               </w:rPr>
               <w:t>Автосдвиг и заявка эту строку не меняют</w:t>
             </w:r>
@@ -7562,9 +5449,8 @@
                 <w:i w:val="0"/>
                 <w:color w:val="000000"/>
                 <w:sz w:val="24"/>
-                <w:cs w:val="0"/>
               </w:rPr>
-              <w:t>6</w:t>
+              <w:t>4</w:t>
             </w:r>
           </w:p>
         </w:tc>
@@ -7599,7 +5485,6 @@
                 <w:i w:val="0"/>
                 <w:color w:val="000000"/>
                 <w:sz w:val="24"/>
-                <w:cs w:val="0"/>
               </w:rPr>
               <w:t>Заявка записана, но не согласована</w:t>
             </w:r>
@@ -7636,7 +5521,6 @@
                 <w:i w:val="0"/>
                 <w:color w:val="000000"/>
                 <w:sz w:val="24"/>
-                <w:cs w:val="0"/>
               </w:rPr>
               <w:t>Типовой регистр этой заявкой не изменен</w:t>
             </w:r>
@@ -7675,9 +5559,8 @@
                 <w:i w:val="0"/>
                 <w:color w:val="000000"/>
                 <w:sz w:val="24"/>
-                <w:cs w:val="0"/>
               </w:rPr>
-              <w:t>7</w:t>
+              <w:t>5</w:t>
             </w:r>
           </w:p>
         </w:tc>
@@ -7712,7 +5595,6 @@
                 <w:i w:val="0"/>
                 <w:color w:val="000000"/>
                 <w:sz w:val="24"/>
-                <w:cs w:val="0"/>
               </w:rPr>
               <w:t>Сервис Документооборота недоступен при отправке</w:t>
             </w:r>
@@ -7749,7 +5631,6 @@
                 <w:i w:val="0"/>
                 <w:color w:val="000000"/>
                 <w:sz w:val="24"/>
-                <w:cs w:val="0"/>
               </w:rPr>
               <w:t>Ошибка пользователю; заявка не согласована; даты не изменены</w:t>
             </w:r>
@@ -7788,9 +5669,8 @@
                 <w:i w:val="0"/>
                 <w:color w:val="000000"/>
                 <w:sz w:val="24"/>
-                <w:cs w:val="0"/>
               </w:rPr>
-              <w:t>8</w:t>
+              <w:t>6</w:t>
             </w:r>
           </w:p>
         </w:tc>
@@ -7825,7 +5705,6 @@
                 <w:i w:val="0"/>
                 <w:color w:val="000000"/>
                 <w:sz w:val="24"/>
-                <w:cs w:val="0"/>
               </w:rPr>
               <w:t>Стиль метаданных</w:t>
             </w:r>
@@ -7862,7 +5741,6 @@
                 <w:i w:val="0"/>
                 <w:color w:val="000000"/>
                 <w:sz w:val="24"/>
-                <w:cs w:val="0"/>
               </w:rPr>
               <w:t>Префикс нп_, объекты в подсистеме расширения НП, области модулей по стандартам 1С</w:t>
             </w:r>
@@ -7891,9 +5769,8 @@
           <w:i w:val="0"/>
           <w:color w:val="000000"/>
           <w:sz w:val="28"/>
-          <w:cs w:val="0"/>
         </w:rPr>
-        <w:t>13. Порядок внедрения</w:t>
+        <w:t>11. Порядок внедрения</w:t>
       </w:r>
     </w:p>
     <w:p>
@@ -7909,9 +5786,8 @@
           <w:i w:val="0"/>
           <w:color w:val="000000"/>
           <w:sz w:val="28"/>
-          <w:cs w:val="0"/>
         </w:rPr>
-        <w:t>1. Установить расширение НП. Назначить бухгалтерам роль нп_УстановкаДатЗапретаПоОрганизациям. Типовую роль на весь регистр не выдавать.</w:t>
+        <w:t>1. Установить расширение НП.</w:t>
       </w:r>
     </w:p>
     <w:p>
@@ -7927,9 +5803,8 @@
           <w:i w:val="0"/>
           <w:color w:val="000000"/>
           <w:sz w:val="28"/>
-          <w:cs w:val="0"/>
         </w:rPr>
-        <w:t>2. Заполнить нп_НастройкиАвтосдвигаДатЗапрета (форма или файл Excel).</w:t>
+        <w:t>2. Заполнить нп_НастройкиАвтосдвигаДатЗапрета (форма регистра).</w:t>
       </w:r>
     </w:p>
     <w:p>
@@ -7945,7 +5820,6 @@
           <w:i w:val="0"/>
           <w:color w:val="000000"/>
           <w:sz w:val="28"/>
-          <w:cs w:val="0"/>
         </w:rPr>
         <w:t>3. Включить регламентное задание сначала в копии, сверить ключи, затем в рабочей базе.</w:t>
       </w:r>
@@ -7963,7 +5837,6 @@
           <w:i w:val="0"/>
           <w:color w:val="000000"/>
           <w:sz w:val="28"/>
-          <w:cs w:val="0"/>
         </w:rPr>
         <w:t>4. В 1С:Документооборот 3 завести вид документа и правило интеграции для нп_ЗаявкаНаОткрытиеПериода.</w:t>
       </w:r>
@@ -7981,9 +5854,8 @@
           <w:i w:val="0"/>
           <w:color w:val="000000"/>
           <w:sz w:val="28"/>
-          <w:cs w:val="0"/>
         </w:rPr>
-        <w:t>5. Откат: выключить задание и прекратить использование обработки и заявок. Записи типового регистра остаются последними абсолютными значениями; при необходимости их правит администратор дат запрета.</w:t>
+        <w:t>5. Откат: выключить задание и прекратить использование заявок. Записи типового регистра остаются последними абсолютными значениями; при необходимости их правит администратор дат запрета.</w:t>
       </w:r>
     </w:p>
     <w:p>
@@ -8000,9 +5872,8 @@
           <w:i w:val="0"/>
           <w:color w:val="000000"/>
           <w:sz w:val="28"/>
-          <w:cs w:val="0"/>
         </w:rPr>
-        <w:t>14. Открытые вопросы (значения по умолчанию до уточнения)</w:t>
+        <w:t>12. Открытые вопросы (значения по умолчанию до уточнения)</w:t>
       </w:r>
     </w:p>
     <w:p>
@@ -8018,9 +5889,8 @@
           <w:i/>
           <w:color w:val="000000"/>
           <w:sz w:val="24"/>
-          <w:cs w:val="0"/>
         </w:rPr>
-        <w:t>Таблица 9 - Открытые вопросы</w:t>
+        <w:t>Таблица 8 - Открытые вопросы</w:t>
       </w:r>
     </w:p>
     <w:tbl>
@@ -8070,7 +5940,6 @@
                 <w:i w:val="0"/>
                 <w:color w:val="000000"/>
                 <w:sz w:val="24"/>
-                <w:cs w:val="0"/>
               </w:rPr>
               <w:t>Вопрос</w:t>
             </w:r>
@@ -8108,7 +5977,6 @@
                 <w:i w:val="0"/>
                 <w:color w:val="000000"/>
                 <w:sz w:val="24"/>
-                <w:cs w:val="0"/>
               </w:rPr>
               <w:t>Принято для реализации</w:t>
             </w:r>
@@ -8147,9 +6015,8 @@
                 <w:i w:val="0"/>
                 <w:color w:val="000000"/>
                 <w:sz w:val="24"/>
-                <w:cs w:val="0"/>
               </w:rPr>
-              <w:t>Как определять свои организации</w:t>
+              <w:t>Раздел «Банк» при пустом разделе заявки</w:t>
             </w:r>
           </w:p>
         </w:tc>
@@ -8184,83 +6051,6 @@
                 <w:i w:val="0"/>
                 <w:color w:val="000000"/>
                 <w:sz w:val="24"/>
-                <w:cs w:val="0"/>
-              </w:rPr>
-              <w:t>Права чтения справочника Организации и (или) ответственные лица. Отдельный регистр ответственных в первой очереди не вводится</w:t>
-            </w:r>
-          </w:p>
-        </w:tc>
-      </w:tr>
-      <w:tr>
-        <w:tc>
-          <w:tcPr>
-            <w:tcW w:type="dxa" w:w="3685"/>
-            <w:vAlign w:val="center"/>
-            <w:tcBorders>
-              <w:top w:val="single" w:sz="8" w:space="0" w:color="000000"/>
-              <w:left w:val="single" w:sz="8" w:space="0" w:color="000000"/>
-              <w:bottom w:val="single" w:sz="8" w:space="0" w:color="000000"/>
-              <w:right w:val="single" w:sz="8" w:space="0" w:color="000000"/>
-            </w:tcBorders>
-            <w:tcMar>
-              <w:top w:w="45" w:type="dxa"/>
-              <w:left w:w="45" w:type="dxa"/>
-              <w:bottom w:w="45" w:type="dxa"/>
-              <w:right w:w="45" w:type="dxa"/>
-            </w:tcMar>
-          </w:tcPr>
-          <w:p>
-            <w:pPr>
-              <w:spacing w:after="0" w:before="0" w:line="240" w:lineRule="auto"/>
-              <w:ind w:firstLine="0"/>
-              <w:jc w:val="left"/>
-            </w:pPr>
-            <w:r/>
-            <w:r>
-              <w:rPr>
-                <w:rFonts w:ascii="Times New Roman" w:hAnsi="Times New Roman" w:eastAsia="Times New Roman"/>
-                <w:b w:val="0"/>
-                <w:i w:val="0"/>
-                <w:color w:val="000000"/>
-                <w:sz w:val="24"/>
-                <w:cs w:val="0"/>
-              </w:rPr>
-              <w:t>Раздел «Банк» при пустом разделе заявки или файла Excel</w:t>
-            </w:r>
-          </w:p>
-        </w:tc>
-        <w:tc>
-          <w:tcPr>
-            <w:tcW w:type="dxa" w:w="5669"/>
-            <w:vAlign w:val="center"/>
-            <w:tcBorders>
-              <w:top w:val="single" w:sz="8" w:space="0" w:color="000000"/>
-              <w:left w:val="single" w:sz="8" w:space="0" w:color="000000"/>
-              <w:bottom w:val="single" w:sz="8" w:space="0" w:color="000000"/>
-              <w:right w:val="single" w:sz="8" w:space="0" w:color="000000"/>
-            </w:tcBorders>
-            <w:tcMar>
-              <w:top w:w="45" w:type="dxa"/>
-              <w:left w:w="45" w:type="dxa"/>
-              <w:bottom w:w="45" w:type="dxa"/>
-              <w:right w:w="45" w:type="dxa"/>
-            </w:tcMar>
-          </w:tcPr>
-          <w:p>
-            <w:pPr>
-              <w:spacing w:after="0" w:before="0" w:line="240" w:lineRule="auto"/>
-              <w:ind w:firstLine="0"/>
-              <w:jc w:val="left"/>
-            </w:pPr>
-            <w:r/>
-            <w:r>
-              <w:rPr>
-                <w:rFonts w:ascii="Times New Roman" w:hAnsi="Times New Roman" w:eastAsia="Times New Roman"/>
-                <w:b w:val="0"/>
-                <w:i w:val="0"/>
-                <w:color w:val="000000"/>
-                <w:sz w:val="24"/>
-                <w:cs w:val="0"/>
               </w:rPr>
               <w:t>Не включается (объект - банковский счет, не организация)</w:t>
             </w:r>
@@ -8299,7 +6089,6 @@
                 <w:i w:val="0"/>
                 <w:color w:val="000000"/>
                 <w:sz w:val="24"/>
-                <w:cs w:val="0"/>
               </w:rPr>
               <w:t>Нужно ли проведение заявки</w:t>
             </w:r>
@@ -8336,9 +6125,82 @@
                 <w:i w:val="0"/>
                 <w:color w:val="000000"/>
                 <w:sz w:val="24"/>
-                <w:cs w:val="0"/>
               </w:rPr>
               <w:t>Нет; достаточно записи документа и статуса Документооборота</w:t>
+            </w:r>
+          </w:p>
+        </w:tc>
+      </w:tr>
+      <w:tr>
+        <w:tc>
+          <w:tcPr>
+            <w:tcW w:type="dxa" w:w="3685"/>
+            <w:vAlign w:val="center"/>
+            <w:tcBorders>
+              <w:top w:val="single" w:sz="8" w:space="0" w:color="000000"/>
+              <w:left w:val="single" w:sz="8" w:space="0" w:color="000000"/>
+              <w:bottom w:val="single" w:sz="8" w:space="0" w:color="000000"/>
+              <w:right w:val="single" w:sz="8" w:space="0" w:color="000000"/>
+            </w:tcBorders>
+            <w:tcMar>
+              <w:top w:w="45" w:type="dxa"/>
+              <w:left w:w="45" w:type="dxa"/>
+              <w:bottom w:w="45" w:type="dxa"/>
+              <w:right w:w="45" w:type="dxa"/>
+            </w:tcMar>
+          </w:tcPr>
+          <w:p>
+            <w:pPr>
+              <w:spacing w:after="0" w:before="0" w:line="240" w:lineRule="auto"/>
+              <w:ind w:firstLine="0"/>
+              <w:jc w:val="left"/>
+            </w:pPr>
+            <w:r/>
+            <w:r>
+              <w:rPr>
+                <w:rFonts w:ascii="Times New Roman" w:hAnsi="Times New Roman" w:eastAsia="Times New Roman"/>
+                <w:b w:val="0"/>
+                <w:i w:val="0"/>
+                <w:color w:val="000000"/>
+                <w:sz w:val="24"/>
+              </w:rPr>
+              <w:t>Кто создает заявку без отдельной бухгалтерской роли</w:t>
+            </w:r>
+          </w:p>
+        </w:tc>
+        <w:tc>
+          <w:tcPr>
+            <w:tcW w:type="dxa" w:w="5669"/>
+            <w:vAlign w:val="center"/>
+            <w:tcBorders>
+              <w:top w:val="single" w:sz="8" w:space="0" w:color="000000"/>
+              <w:left w:val="single" w:sz="8" w:space="0" w:color="000000"/>
+              <w:bottom w:val="single" w:sz="8" w:space="0" w:color="000000"/>
+              <w:right w:val="single" w:sz="8" w:space="0" w:color="000000"/>
+            </w:tcBorders>
+            <w:tcMar>
+              <w:top w:w="45" w:type="dxa"/>
+              <w:left w:w="45" w:type="dxa"/>
+              <w:bottom w:w="45" w:type="dxa"/>
+              <w:right w:w="45" w:type="dxa"/>
+            </w:tcMar>
+          </w:tcPr>
+          <w:p>
+            <w:pPr>
+              <w:spacing w:after="0" w:before="0" w:line="240" w:lineRule="auto"/>
+              <w:ind w:firstLine="0"/>
+              <w:jc w:val="left"/>
+            </w:pPr>
+            <w:r/>
+            <w:r>
+              <w:rPr>
+                <w:rFonts w:ascii="Times New Roman" w:hAnsi="Times New Roman" w:eastAsia="Times New Roman"/>
+                <w:b w:val="0"/>
+                <w:i w:val="0"/>
+                <w:color w:val="000000"/>
+                <w:sz w:val="24"/>
+              </w:rPr>
+              <w:t>Пользователи с правами на документ расширения или полные права. Профиль уточнить при внедрении</w:t>
             </w:r>
           </w:p>
         </w:tc>
@@ -8365,9 +6227,8 @@
           <w:i w:val="0"/>
           <w:color w:val="000000"/>
           <w:sz w:val="28"/>
-          <w:cs w:val="0"/>
         </w:rPr>
-        <w:t>15. Лист согласования</w:t>
+        <w:t>13. Лист согласования</w:t>
       </w:r>
     </w:p>
     <w:p>
@@ -8383,9 +6244,8 @@
           <w:i/>
           <w:color w:val="000000"/>
           <w:sz w:val="24"/>
-          <w:cs w:val="0"/>
         </w:rPr>
-        <w:t>Таблица 10 - Согласование документа</w:t>
+        <w:t>Таблица 9 - Согласование документа</w:t>
       </w:r>
     </w:p>
     <w:tbl>
@@ -8437,7 +6297,6 @@
                 <w:i w:val="0"/>
                 <w:color w:val="000000"/>
                 <w:sz w:val="24"/>
-                <w:cs w:val="0"/>
               </w:rPr>
               <w:t>Роль</w:t>
             </w:r>
@@ -8475,7 +6334,6 @@
                 <w:i w:val="0"/>
                 <w:color w:val="000000"/>
                 <w:sz w:val="24"/>
-                <w:cs w:val="0"/>
               </w:rPr>
               <w:t>ФИО</w:t>
             </w:r>
@@ -8513,7 +6371,6 @@
                 <w:i w:val="0"/>
                 <w:color w:val="000000"/>
                 <w:sz w:val="24"/>
-                <w:cs w:val="0"/>
               </w:rPr>
               <w:t>Подпись</w:t>
             </w:r>
@@ -8551,7 +6408,6 @@
                 <w:i w:val="0"/>
                 <w:color w:val="000000"/>
                 <w:sz w:val="24"/>
-                <w:cs w:val="0"/>
               </w:rPr>
               <w:t>Дата</w:t>
             </w:r>
@@ -8590,7 +6446,6 @@
                 <w:i w:val="0"/>
                 <w:color w:val="000000"/>
                 <w:sz w:val="24"/>
-                <w:cs w:val="0"/>
               </w:rPr>
               <w:t>Заказчик</w:t>
             </w:r>
@@ -8627,7 +6482,6 @@
                 <w:i w:val="0"/>
                 <w:color w:val="000000"/>
                 <w:sz w:val="24"/>
-                <w:cs w:val="0"/>
               </w:rPr>
             </w:r>
           </w:p>
@@ -8663,7 +6517,6 @@
                 <w:i w:val="0"/>
                 <w:color w:val="000000"/>
                 <w:sz w:val="24"/>
-                <w:cs w:val="0"/>
               </w:rPr>
             </w:r>
           </w:p>
@@ -8699,7 +6552,6 @@
                 <w:i w:val="0"/>
                 <w:color w:val="000000"/>
                 <w:sz w:val="24"/>
-                <w:cs w:val="0"/>
               </w:rPr>
             </w:r>
           </w:p>
@@ -8737,7 +6589,6 @@
                 <w:i w:val="0"/>
                 <w:color w:val="000000"/>
                 <w:sz w:val="24"/>
-                <w:cs w:val="0"/>
               </w:rPr>
               <w:t>Исполнитель</w:t>
             </w:r>
@@ -8774,7 +6625,6 @@
                 <w:i w:val="0"/>
                 <w:color w:val="000000"/>
                 <w:sz w:val="24"/>
-                <w:cs w:val="0"/>
               </w:rPr>
             </w:r>
           </w:p>
@@ -8810,7 +6660,6 @@
                 <w:i w:val="0"/>
                 <w:color w:val="000000"/>
                 <w:sz w:val="24"/>
-                <w:cs w:val="0"/>
               </w:rPr>
             </w:r>
           </w:p>
@@ -8846,7 +6695,6 @@
                 <w:i w:val="0"/>
                 <w:color w:val="000000"/>
                 <w:sz w:val="24"/>
-                <w:cs w:val="0"/>
               </w:rPr>
             </w:r>
           </w:p>
@@ -8884,7 +6732,6 @@
                 <w:i w:val="0"/>
                 <w:color w:val="000000"/>
                 <w:sz w:val="24"/>
-                <w:cs w:val="0"/>
               </w:rPr>
               <w:t>Согласовано</w:t>
             </w:r>
@@ -8921,7 +6768,6 @@
                 <w:i w:val="0"/>
                 <w:color w:val="000000"/>
                 <w:sz w:val="24"/>
-                <w:cs w:val="0"/>
               </w:rPr>
             </w:r>
           </w:p>
@@ -8957,7 +6803,6 @@
                 <w:i w:val="0"/>
                 <w:color w:val="000000"/>
                 <w:sz w:val="24"/>
-                <w:cs w:val="0"/>
               </w:rPr>
             </w:r>
           </w:p>
@@ -8993,7 +6838,6 @@
                 <w:i w:val="0"/>
                 <w:color w:val="000000"/>
                 <w:sz w:val="24"/>
-                <w:cs w:val="0"/>
               </w:rPr>
             </w:r>
           </w:p>
@@ -9011,7 +6855,7 @@
       <w:headerReference w:type="default" r:id="rId9"/>
       <w:footerReference w:type="default" r:id="rId10"/>
       <w:pgSz w:w="11906" w:h="16838"/>
-      <w:pgMar w:top="1134" w:right="850" w:bottom="1134" w:left="1701" w:header="567" w:footer="567" w:gutter="0"/>
+      <w:pgMar w:top="1134" w:right="850" w:bottom="1134" w:left="1701" w:header="720" w:footer="720" w:gutter="0"/>
       <w:cols w:space="720"/>
       <w:docGrid w:linePitch="360"/>
     </w:sectPr>
@@ -9024,7 +6868,6 @@
   <w:p>
     <w:pPr>
       <w:pStyle w:val="Footer"/>
-      <w:spacing w:before="0"/>
       <w:jc w:val="center"/>
     </w:pPr>
     <w:r>
@@ -9034,7 +6877,6 @@
         <w:i w:val="0"/>
         <w:color w:val="000000"/>
         <w:sz w:val="24"/>
-        <w:cs w:val="0"/>
       </w:rPr>
       <w:t xml:space="preserve">Лист </w:t>
     </w:r>
@@ -9045,7 +6887,6 @@
         <w:i w:val="0"/>
         <w:color w:val="000000"/>
         <w:sz w:val="24"/>
-        <w:cs w:val="0"/>
       </w:rPr>
       <w:fldChar w:fldCharType="begin"/>
       <w:instrText xml:space="preserve"> PAGE </w:instrText>
@@ -9060,7 +6901,6 @@
   <w:p>
     <w:pPr>
       <w:pStyle w:val="Header"/>
-      <w:spacing w:after="0"/>
       <w:jc w:val="center"/>
     </w:pPr>
     <w:r>
@@ -9070,9 +6910,8 @@
         <w:i/>
         <w:color w:val="000000"/>
         <w:sz w:val="20"/>
-        <w:cs w:val="0"/>
-      </w:rPr>
-      <w:t>Техническое задание. Установка дат запрета изменения</w:t>
+      </w:rPr>
+      <w:t>Техническое задание. Даты запрета изменения</w:t>
     </w:r>
   </w:p>
 </w:hdr>

</xml_diff>

<commit_message>
Rewrite TZ basis section in plain official wording
Split the jammed rationale into a request from accounting and
the two typical-mechanism gaps the change addresses.

Co-authored-by: an_skripko <an_skripko@vk.com>
</commit_message>
<xml_diff>
--- a/openspec/changes/np-dates-of-prohibition-setup/ТЗ_установка_дат_запрета_изменения.docx
+++ b/openspec/changes/np-dates-of-prohibition-setup/ТЗ_установка_дат_запрета_изменения.docx
@@ -286,7 +286,24 @@
           <w:color w:val="000000"/>
           <w:sz w:val="28"/>
         </w:rPr>
-        <w:t>Типовой механизм БСП «Даты запрета изменения» проверяет период при записи, но абсолютные даты сами не сдвигаются, а временное открытие уже закрытого периода нельзя согласовать в 1С:Документооборот 3.</w:t>
+        <w:t>Настоящее техническое задание подготовлено по требованию бухгалтерии холдинга.</w:t>
+      </w:r>
+    </w:p>
+    <w:p>
+      <w:pPr>
+        <w:spacing w:after="120" w:before="0" w:line="360" w:lineRule="auto"/>
+        <w:ind w:firstLine="709"/>
+        <w:jc w:val="both"/>
+      </w:pPr>
+      <w:r>
+        <w:rPr>
+          <w:rFonts w:ascii="Times New Roman" w:hAnsi="Times New Roman" w:eastAsia="Times New Roman"/>
+          <w:b w:val="0"/>
+          <w:i w:val="0"/>
+          <w:color w:val="000000"/>
+          <w:sz w:val="28"/>
+        </w:rPr>
+        <w:t>Типовой механизм БСП «Даты запрета изменения» закрывает период: объекты с датой не позднее установленной границы записывать нельзя. Для организаций граница задаётся абсолютной датой. Эту дату приходится регулярно переносить вручную. Отдельной заявки на временное открытие уже закрытого периода с согласованием в 1С:Документооборот 3 в типовой конфигурации нет.</w:t>
       </w:r>
     </w:p>
     <w:p>

</xml_diff>

<commit_message>
Spell out register records instead of mechanism keys in TZ
Name the typical ДатыЗапретаИзменения measurements: section,
organization, addressee for all users. Drop the jargon «ключи».

Co-authored-by: an_skripko <an_skripko@vk.com>
</commit_message>
<xml_diff>
--- a/openspec/changes/np-dates-of-prohibition-setup/ТЗ_установка_дат_запрета_изменения.docx
+++ b/openspec/changes/np-dates-of-prohibition-setup/ТЗ_установка_дат_запрета_изменения.docx
@@ -1614,7 +1614,7 @@
           <w:color w:val="000000"/>
           <w:sz w:val="28"/>
         </w:rPr>
-        <w:t>3. Записывать в типовой регистр сведений только ключи настоящего механизма (см. п. 4).</w:t>
+        <w:t>3. В типовой регистр сведений ДатыЗапретаИзменения записывать только записи, указанные в п. 4: раздел учета, организация, адресат «для всех пользователей». Прочие записи этого регистра не изменять.</w:t>
       </w:r>
     </w:p>
     <w:p>
@@ -1734,7 +1734,7 @@
           <w:color w:val="000000"/>
           <w:sz w:val="28"/>
         </w:rPr>
-        <w:t>Настоящий механизм создает и изменяет только следующие ключи:</w:t>
+        <w:t>Доработка создает и изменяет только записи регистра сведений ДатыЗапретаИзменения со следующими значениями:</w:t>
       </w:r>
     </w:p>
     <w:p>
@@ -1751,7 +1751,7 @@
           <w:color w:val="000000"/>
           <w:sz w:val="24"/>
         </w:rPr>
-        <w:t>Таблица 3 - Ключи записей механизма в типовом регистре</w:t>
+        <w:t>Таблица 3 - Записи типового регистра, которые изменяет доработка</w:t>
       </w:r>
     </w:p>
     <w:tbl>
@@ -1802,7 +1802,7 @@
                 <w:color w:val="000000"/>
                 <w:sz w:val="24"/>
               </w:rPr>
-              <w:t>Поле</w:t>
+              <w:t>Измерение / ресурс</w:t>
             </w:r>
           </w:p>
         </w:tc>
@@ -2287,7 +2287,7 @@
           <w:color w:val="000000"/>
           <w:sz w:val="28"/>
         </w:rPr>
-        <w:t>- затирать чужие относительные даты БСП на ключах, которыми механизм не владеет.</w:t>
+        <w:t>- изменять записи регистра с относительной датой БСП, которые не были созданы настоящей доработкой.</w:t>
       </w:r>
     </w:p>
     <w:p>
@@ -2905,7 +2905,7 @@
                 <w:color w:val="000000"/>
                 <w:sz w:val="24"/>
               </w:rPr>
-              <w:t>запись ключей, автосдвиг, срок действия открытого периода</w:t>
+              <w:t>запись в типовой регистр, автосдвиг, срок действия открытого периода</w:t>
             </w:r>
           </w:p>
         </w:tc>
@@ -3460,7 +3460,7 @@
           <w:color w:val="000000"/>
           <w:sz w:val="28"/>
         </w:rPr>
-        <w:t>1. Изменяются только ключи механизма (п. 4).</w:t>
+        <w:t>1. Изменяются только записи, указанные в п. 4.</w:t>
       </w:r>
     </w:p>
     <w:p>
@@ -3511,7 +3511,7 @@
           <w:color w:val="000000"/>
           <w:sz w:val="28"/>
         </w:rPr>
-        <w:t>4. Если по организации есть согласованная заявка, срок действия открытого периода которой не истек, задание не записывает значение «сегодня минус N» по ключам этой заявки.</w:t>
+        <w:t>4. Если по организации есть согласованная заявка, срок действия открытого периода которой не истек, задание не записывает значение «сегодня минус N» в записи регистра по этой заявке (п. 4).</w:t>
       </w:r>
     </w:p>
     <w:p>
@@ -3528,7 +3528,7 @@
           <w:color w:val="000000"/>
           <w:sz w:val="28"/>
         </w:rPr>
-        <w:t>5. После истечения срока действия открытия при включенном автосдвиге задание восстанавливает значение «сегодня минус N».</w:t>
+        <w:t>5. После истечения срока действия открытого периода при включенном автосдвиге задание восстанавливает значение «сегодня минус N».</w:t>
       </w:r>
     </w:p>
     <w:p>
@@ -4543,7 +4543,7 @@
           <w:color w:val="000000"/>
           <w:sz w:val="28"/>
         </w:rPr>
-        <w:t>По ключам заявки (п. 4) записывается:</w:t>
+        <w:t>В записи регистра сведений ДатыЗапретаИзменения по организации и разделу заявки (п. 4):</w:t>
       </w:r>
     </w:p>
     <w:p>
@@ -4594,7 +4594,7 @@
           <w:color w:val="000000"/>
           <w:sz w:val="28"/>
         </w:rPr>
-        <w:t>Пока срок действия открытого периода не истек, автосдвиг эти ключи не перезаписывает значением «сегодня минус N». После истечения срока действия открытого периода при включенном автосдвиге восстанавливается «сегодня минус N».</w:t>
+        <w:t>Пока срок действия открытого периода не истек, автосдвиг эти записи не перезаписывает значением «сегодня минус N». После истечения срока действия открытого периода при включенном автосдвиге восстанавливается «сегодня минус N».</w:t>
       </w:r>
     </w:p>
     <w:p>
@@ -4715,7 +4715,7 @@
           <w:color w:val="000000"/>
           <w:sz w:val="28"/>
         </w:rPr>
-        <w:t>- убедиться, что по ключам заявки стоит значение «Период с минус 1 день»;</w:t>
+        <w:t>- убедиться, что в записях регистра по заявке (п. 4) стоит значение «Период с минус 1 день»;</w:t>
       </w:r>
     </w:p>
     <w:p>
@@ -4732,7 +4732,7 @@
           <w:color w:val="000000"/>
           <w:sz w:val="28"/>
         </w:rPr>
-        <w:t>- значение «сегодня минус N» по этим ключам не записывать.</w:t>
+        <w:t>- значение «сегодня минус N» в эти записи не записывать.</w:t>
       </w:r>
     </w:p>
     <w:p>
@@ -4749,7 +4749,7 @@
           <w:color w:val="000000"/>
           <w:sz w:val="28"/>
         </w:rPr>
-        <w:t>3. Если действующей заявки нет: рассчитать «сегодня минус N» и записать только ключи механизма по организации настройки.</w:t>
+        <w:t>3. Если действующей заявки нет: рассчитать «сегодня минус N» и записать только записи по п. 4 для организации настройки.</w:t>
       </w:r>
     </w:p>
     <w:p>
@@ -4869,7 +4869,7 @@
           <w:color w:val="000000"/>
           <w:sz w:val="28"/>
         </w:rPr>
-        <w:t>3. После появления состояния «Согласован»: определить срок действия открытого периода по п. 7.4; записать в типовой регистр значение «Период с минус 1 день» по ключам заявки; обновить действующие даты запрета БСП.</w:t>
+        <w:t>3. После появления состояния «Согласован»: определить срок действия открытого периода по п. 7.4; записать в типовой регистр значение «Период с минус 1 день» в записи по организации и разделу заявки (п. 4); обновить действующие даты запрета БСП.</w:t>
       </w:r>
     </w:p>
     <w:p>
@@ -4886,7 +4886,7 @@
           <w:color w:val="000000"/>
           <w:sz w:val="28"/>
         </w:rPr>
-        <w:t>4. Дальнейшее сопровождение срока действия открытия выполняется регламентным заданием (п. 8.1).</w:t>
+        <w:t>4. Дальнейшее сопровождение срока действия открытого периода выполняется регламентным заданием (п. 8.1).</w:t>
       </w:r>
     </w:p>
     <w:p>
@@ -5209,7 +5209,7 @@
                 <w:color w:val="000000"/>
                 <w:sz w:val="24"/>
               </w:rPr>
-              <w:t>В типовом регистре по ключам механизма ДатаЗапрета равна 08.08; на следующий день - 09.08</w:t>
+              <w:t>В типовом регистре по записям п. 4 ДатаЗапрета равна 08.08; на следующий день - 09.08</w:t>
             </w:r>
           </w:p>
         </w:tc>
@@ -5838,7 +5838,7 @@
           <w:color w:val="000000"/>
           <w:sz w:val="28"/>
         </w:rPr>
-        <w:t>3. Включить регламентное задание сначала в копии, сверить ключи, затем в рабочей базе.</w:t>
+        <w:t>3. Включить регламентное задание сначала в копии, сверить записи типового регистра, затем в рабочей базе.</w:t>
       </w:r>
     </w:p>
     <w:p>

</xml_diff>

<commit_message>
Allow auto-shift by addressee and optional accounting section
Settings are organization + user/group/all users + optional section
with its own N. Empty section still means organization-typed sections
only. Opening request follows the same records.

Co-authored-by: an_skripko <an_skripko@vk.com>
</commit_message>
<xml_diff>
--- a/openspec/changes/np-dates-of-prohibition-setup/ТЗ_установка_дат_запрета_изменения.docx
+++ b/openspec/changes/np-dates-of-prohibition-setup/ТЗ_установка_дат_запрета_изменения.docx
@@ -1614,7 +1614,7 @@
           <w:color w:val="000000"/>
           <w:sz w:val="28"/>
         </w:rPr>
-        <w:t>3. В типовой регистр сведений ДатыЗапретаИзменения записывать только записи, указанные в п. 4: раздел учета, организация, адресат «для всех пользователей». Прочие записи этого регистра не изменять.</w:t>
+        <w:t>3. В типовой регистр сведений ДатыЗапретаИзменения записывать только записи, указанные в п. 4: раздел учета, организация, адресат (все пользователи, группа пользователей или пользователь). Прочие записи этого регистра не изменять.</w:t>
       </w:r>
     </w:p>
     <w:p>
@@ -1699,7 +1699,7 @@
           <w:color w:val="000000"/>
           <w:sz w:val="28"/>
         </w:rPr>
-        <w:t>8. Факты записи (организация, старая и новая дата, режим: автосдвиг или заявка) фиксировать в журнале регистрации.</w:t>
+        <w:t>8. Факты записи (организация, адресат, раздел, старая и новая дата, режим: автосдвиг или заявка) фиксировать в журнале регистрации.</w:t>
       </w:r>
     </w:p>
     <w:p>
@@ -1913,7 +1913,7 @@
                 <w:color w:val="000000"/>
                 <w:sz w:val="24"/>
               </w:rPr>
-              <w:t>выбранный раздел с типом объекта СправочникСсылка.Организации либо (если раздел не указан) все такие разделы</w:t>
+              <w:t>раздел из настройки или заявки. Если не указан - все разделы с типом объекта СправочникСсылка.Организации</w:t>
             </w:r>
           </w:p>
         </w:tc>
@@ -2061,7 +2061,7 @@
                 <w:color w:val="000000"/>
                 <w:sz w:val="24"/>
               </w:rPr>
-              <w:t>«для всех пользователей»</w:t>
+              <w:t>как в типовом регистре: «для всех пользователей», группа пользователей или пользователь. Берется из настройки автосдвига</w:t>
             </w:r>
           </w:p>
         </w:tc>
@@ -2236,13 +2236,13 @@
           <w:color w:val="000000"/>
           <w:sz w:val="28"/>
         </w:rPr>
-        <w:t>Запрещается:</w:t>
+        <w:t>Для одной организации допускается несколько настроек с разным N: по адресату и, при необходимости, по разделу учета.</w:t>
       </w:r>
     </w:p>
     <w:p>
       <w:pPr>
-        <w:spacing w:after="80" w:before="0" w:line="360" w:lineRule="auto"/>
-        <w:ind w:left="709" w:hanging="425"/>
+        <w:spacing w:after="120" w:before="0" w:line="360" w:lineRule="auto"/>
+        <w:ind w:firstLine="709"/>
         <w:jc w:val="both"/>
       </w:pPr>
       <w:r>
@@ -2253,7 +2253,7 @@
           <w:color w:val="000000"/>
           <w:sz w:val="28"/>
         </w:rPr>
-        <w:t>- изменять строки с конкретным пользователем;</w:t>
+        <w:t>Запрещается:</w:t>
       </w:r>
     </w:p>
     <w:p>
@@ -2287,6 +2287,23 @@
           <w:color w:val="000000"/>
           <w:sz w:val="28"/>
         </w:rPr>
+        <w:t>- изменять записи регистра, которых нет в настройках автосдвига (в том числе даты, заданные только в типовой форме);</w:t>
+      </w:r>
+    </w:p>
+    <w:p>
+      <w:pPr>
+        <w:spacing w:after="80" w:before="0" w:line="360" w:lineRule="auto"/>
+        <w:ind w:left="709" w:hanging="425"/>
+        <w:jc w:val="both"/>
+      </w:pPr>
+      <w:r>
+        <w:rPr>
+          <w:rFonts w:ascii="Times New Roman" w:hAnsi="Times New Roman" w:eastAsia="Times New Roman"/>
+          <w:b w:val="0"/>
+          <w:i w:val="0"/>
+          <w:color w:val="000000"/>
+          <w:sz w:val="28"/>
+        </w:rPr>
         <w:t>- изменять записи регистра с относительной датой БСП, которые не были созданы настоящей доработкой.</w:t>
       </w:r>
     </w:p>
@@ -2304,7 +2321,7 @@
           <w:color w:val="000000"/>
           <w:sz w:val="28"/>
         </w:rPr>
-        <w:t>Примечание. Индивидуальная дата пользователя в БСП по-прежнему перекрывает дату «для всех пользователей». Заявка и автосдвиг такие строки не открывают и не сдвигают.</w:t>
+        <w:t>Примечание. В БСП дата конкретного пользователя перекрывает дату «для всех пользователей». Поэтому индивидуальный сдвиг нужно задавать отдельной настройкой на этого пользователя (или группу), иначе заявка и автосдвиг по «для всех» на него не подействуют.</w:t>
       </w:r>
     </w:p>
     <w:p>
@@ -2575,7 +2592,7 @@
                 <w:color w:val="000000"/>
                 <w:sz w:val="24"/>
               </w:rPr>
-              <w:t>организация, число дней N, признак включения</w:t>
+              <w:t>организация, адресат, раздел учета (необязательно), число дней N, признак включения</w:t>
             </w:r>
           </w:p>
         </w:tc>
@@ -3219,6 +3236,154 @@
                 <w:color w:val="000000"/>
                 <w:sz w:val="24"/>
               </w:rPr>
+              <w:t>Адресат</w:t>
+            </w:r>
+          </w:p>
+        </w:tc>
+        <w:tc>
+          <w:tcPr>
+            <w:tcW w:type="dxa" w:w="5953"/>
+            <w:vAlign w:val="center"/>
+            <w:tcBorders>
+              <w:top w:val="single" w:sz="8" w:space="0" w:color="000000"/>
+              <w:left w:val="single" w:sz="8" w:space="0" w:color="000000"/>
+              <w:bottom w:val="single" w:sz="8" w:space="0" w:color="000000"/>
+              <w:right w:val="single" w:sz="8" w:space="0" w:color="000000"/>
+            </w:tcBorders>
+            <w:tcMar>
+              <w:top w:w="45" w:type="dxa"/>
+              <w:left w:w="45" w:type="dxa"/>
+              <w:bottom w:w="45" w:type="dxa"/>
+              <w:right w:w="45" w:type="dxa"/>
+            </w:tcMar>
+          </w:tcPr>
+          <w:p>
+            <w:pPr>
+              <w:spacing w:after="0" w:before="0" w:line="240" w:lineRule="auto"/>
+              <w:ind w:firstLine="0"/>
+              <w:jc w:val="left"/>
+            </w:pPr>
+            <w:r/>
+            <w:r>
+              <w:rPr>
+                <w:rFonts w:ascii="Times New Roman" w:hAnsi="Times New Roman" w:eastAsia="Times New Roman"/>
+                <w:b w:val="0"/>
+                <w:i w:val="0"/>
+                <w:color w:val="000000"/>
+                <w:sz w:val="24"/>
+              </w:rPr>
+              <w:t>«для всех пользователей», группа пользователей или пользователь (как измерение Пользователь типового регистра)</w:t>
+            </w:r>
+          </w:p>
+        </w:tc>
+      </w:tr>
+      <w:tr>
+        <w:tc>
+          <w:tcPr>
+            <w:tcW w:type="dxa" w:w="3402"/>
+            <w:vAlign w:val="center"/>
+            <w:tcBorders>
+              <w:top w:val="single" w:sz="8" w:space="0" w:color="000000"/>
+              <w:left w:val="single" w:sz="8" w:space="0" w:color="000000"/>
+              <w:bottom w:val="single" w:sz="8" w:space="0" w:color="000000"/>
+              <w:right w:val="single" w:sz="8" w:space="0" w:color="000000"/>
+            </w:tcBorders>
+            <w:tcMar>
+              <w:top w:w="45" w:type="dxa"/>
+              <w:left w:w="45" w:type="dxa"/>
+              <w:bottom w:w="45" w:type="dxa"/>
+              <w:right w:w="45" w:type="dxa"/>
+            </w:tcMar>
+          </w:tcPr>
+          <w:p>
+            <w:pPr>
+              <w:spacing w:after="0" w:before="0" w:line="240" w:lineRule="auto"/>
+              <w:ind w:firstLine="0"/>
+              <w:jc w:val="left"/>
+            </w:pPr>
+            <w:r/>
+            <w:r>
+              <w:rPr>
+                <w:rFonts w:ascii="Times New Roman" w:hAnsi="Times New Roman" w:eastAsia="Times New Roman"/>
+                <w:b w:val="0"/>
+                <w:i w:val="0"/>
+                <w:color w:val="000000"/>
+                <w:sz w:val="24"/>
+              </w:rPr>
+              <w:t>Раздел учета</w:t>
+            </w:r>
+          </w:p>
+        </w:tc>
+        <w:tc>
+          <w:tcPr>
+            <w:tcW w:type="dxa" w:w="5953"/>
+            <w:vAlign w:val="center"/>
+            <w:tcBorders>
+              <w:top w:val="single" w:sz="8" w:space="0" w:color="000000"/>
+              <w:left w:val="single" w:sz="8" w:space="0" w:color="000000"/>
+              <w:bottom w:val="single" w:sz="8" w:space="0" w:color="000000"/>
+              <w:right w:val="single" w:sz="8" w:space="0" w:color="000000"/>
+            </w:tcBorders>
+            <w:tcMar>
+              <w:top w:w="45" w:type="dxa"/>
+              <w:left w:w="45" w:type="dxa"/>
+              <w:bottom w:w="45" w:type="dxa"/>
+              <w:right w:w="45" w:type="dxa"/>
+            </w:tcMar>
+          </w:tcPr>
+          <w:p>
+            <w:pPr>
+              <w:spacing w:after="0" w:before="0" w:line="240" w:lineRule="auto"/>
+              <w:ind w:firstLine="0"/>
+              <w:jc w:val="left"/>
+            </w:pPr>
+            <w:r/>
+            <w:r>
+              <w:rPr>
+                <w:rFonts w:ascii="Times New Roman" w:hAnsi="Times New Roman" w:eastAsia="Times New Roman"/>
+                <w:b w:val="0"/>
+                <w:i w:val="0"/>
+                <w:color w:val="000000"/>
+                <w:sz w:val="24"/>
+              </w:rPr>
+              <w:t>элемент плана видов характеристик РазделыДатЗапретаИзменения; не обязателен</w:t>
+            </w:r>
+          </w:p>
+        </w:tc>
+      </w:tr>
+      <w:tr>
+        <w:tc>
+          <w:tcPr>
+            <w:tcW w:type="dxa" w:w="3402"/>
+            <w:vAlign w:val="center"/>
+            <w:tcBorders>
+              <w:top w:val="single" w:sz="8" w:space="0" w:color="000000"/>
+              <w:left w:val="single" w:sz="8" w:space="0" w:color="000000"/>
+              <w:bottom w:val="single" w:sz="8" w:space="0" w:color="000000"/>
+              <w:right w:val="single" w:sz="8" w:space="0" w:color="000000"/>
+            </w:tcBorders>
+            <w:tcMar>
+              <w:top w:w="45" w:type="dxa"/>
+              <w:left w:w="45" w:type="dxa"/>
+              <w:bottom w:w="45" w:type="dxa"/>
+              <w:right w:w="45" w:type="dxa"/>
+            </w:tcMar>
+          </w:tcPr>
+          <w:p>
+            <w:pPr>
+              <w:spacing w:after="0" w:before="0" w:line="240" w:lineRule="auto"/>
+              <w:ind w:firstLine="0"/>
+              <w:jc w:val="left"/>
+            </w:pPr>
+            <w:r/>
+            <w:r>
+              <w:rPr>
+                <w:rFonts w:ascii="Times New Roman" w:hAnsi="Times New Roman" w:eastAsia="Times New Roman"/>
+                <w:b w:val="0"/>
+                <w:i w:val="0"/>
+                <w:color w:val="000000"/>
+                <w:sz w:val="24"/>
+              </w:rPr>
               <w:t>Количество дней N</w:t>
             </w:r>
           </w:p>
@@ -3255,7 +3420,7 @@
                 <w:color w:val="000000"/>
                 <w:sz w:val="24"/>
               </w:rPr>
-              <w:t>число больше 0</w:t>
+              <w:t>число больше 0; свое значение для сочетания организация + адресат + раздел</w:t>
             </w:r>
           </w:p>
         </w:tc>
@@ -3356,7 +3521,7 @@
           <w:color w:val="000000"/>
           <w:sz w:val="28"/>
         </w:rPr>
-        <w:t>Настройки задаются формой списка или записи регистра. Типовые относительные описания («конец прошлого месяца» и аналогичные) не подменяются.</w:t>
+        <w:t>Пустой адресат означает «для всех пользователей». Пустой раздел означает все разделы с типом «Организации». Если по той же организации и адресату есть и настройка без раздела, и настройка с конкретным разделом, для этого раздела действует настройка с заполненным разделом, для остальных - настройка без раздела. Настройки задаются формой списка или записи регистра. Типовые относительные описания («конец прошлого месяца» и аналогичные) не подменяются.</w:t>
       </w:r>
     </w:p>
     <w:p>
@@ -3391,7 +3556,7 @@
           <w:color w:val="000000"/>
           <w:sz w:val="28"/>
         </w:rPr>
-        <w:t>Для каждой включенной настройки, по которой нет действующей заявки на открытие периода (п. 7.4), в типовой регистр записывается:</w:t>
+        <w:t>Для каждой включенной настройки, по которой нет действующей заявки на открытие периода по той же организации и тому же разделу (п. 7.4), в типовой регистр записывается:</w:t>
       </w:r>
     </w:p>
     <w:p>
@@ -3408,7 +3573,7 @@
           <w:color w:val="000000"/>
           <w:sz w:val="28"/>
         </w:rPr>
-        <w:t>ДатаЗапрета равна началу дня текущей даты сеанса минус N дней.</w:t>
+        <w:t>ДатаЗапрета равна началу дня текущей даты сеанса минус N дней этой настройки.</w:t>
       </w:r>
     </w:p>
     <w:p>
@@ -3425,7 +3590,7 @@
           <w:color w:val="000000"/>
           <w:sz w:val="28"/>
         </w:rPr>
-        <w:t>Пример. Выполнение 18.08, N равно 10: ДатаЗапрета равна 08.08. На следующий день при тех же условиях граница сдвигается на один день вперед (скользящая граница).</w:t>
+        <w:t>Пример. Выполнение 18.08, заявки нет. По организации для всех пользователей без раздела N равно 10, для раздела «Учет по МСФО» N равно 3, для пользователя Иванова без раздела N равно 5. В типовом регистре: для всех пользователей по обычным разделам ДатаЗапрета равна 08.08, по МСФО - 15.08, для Иванова - 13.08. На следующий день границы сдвигаются на один день вперед.</w:t>
       </w:r>
     </w:p>
     <w:p>
@@ -3460,7 +3625,7 @@
           <w:color w:val="000000"/>
           <w:sz w:val="28"/>
         </w:rPr>
-        <w:t>1. Изменяются только записи, указанные в п. 4.</w:t>
+        <w:t>1. Изменяются только записи, указанные в п. 4, по адресату и разделу из настройки.</w:t>
       </w:r>
     </w:p>
     <w:p>
@@ -3477,7 +3642,7 @@
           <w:color w:val="000000"/>
           <w:sz w:val="28"/>
         </w:rPr>
-        <w:t>2. Персональные строки пользователей не изменяются.</w:t>
+        <w:t>2. Записи типового регистра, которых нет в настройках автосдвига, не изменяются.</w:t>
       </w:r>
     </w:p>
     <w:p>
@@ -3511,7 +3676,7 @@
           <w:color w:val="000000"/>
           <w:sz w:val="28"/>
         </w:rPr>
-        <w:t>4. Если по организации есть согласованная заявка, срок действия открытого периода которой не истек, задание не записывает значение «сегодня минус N» в записи регистра по этой заявке (п. 4).</w:t>
+        <w:t>4. Если есть согласованная заявка со сроком действия открытого периода, который не истек, задание не записывает значение «сегодня минус N» в записи, которые эта заявка покрывает (организация, раздел, адресаты настроек). По остальным разделам той же организации автосдвиг продолжается.</w:t>
       </w:r>
     </w:p>
     <w:p>
@@ -3528,7 +3693,7 @@
           <w:color w:val="000000"/>
           <w:sz w:val="28"/>
         </w:rPr>
-        <w:t>5. После истечения срока действия открытого периода при включенном автосдвиге задание восстанавливает значение «сегодня минус N».</w:t>
+        <w:t>5. После истечения срока действия открытого периода при включенном автосдвиге задание восстанавливает для каждой настройки свое «сегодня минус N».</w:t>
       </w:r>
     </w:p>
     <w:p>
@@ -4543,7 +4708,7 @@
           <w:color w:val="000000"/>
           <w:sz w:val="28"/>
         </w:rPr>
-        <w:t>В записи регистра сведений ДатыЗапретаИзменения по организации и разделу заявки (п. 4):</w:t>
+        <w:t>В записи регистра сведений ДатыЗапретаИзменения по организациям заявки, разделу заявки (или всем разделам с типом «Организации», если раздел пуст) и адресатам из настроек автосдвига этих организаций (п. 4):</w:t>
       </w:r>
     </w:p>
     <w:p>
@@ -4577,6 +4742,23 @@
           <w:color w:val="000000"/>
           <w:sz w:val="28"/>
         </w:rPr>
+        <w:t>Если по организации нет настроек автосдвига, записывается адресат «для всех пользователей».</w:t>
+      </w:r>
+    </w:p>
+    <w:p>
+      <w:pPr>
+        <w:spacing w:after="120" w:before="0" w:line="360" w:lineRule="auto"/>
+        <w:ind w:firstLine="709"/>
+        <w:jc w:val="both"/>
+      </w:pPr>
+      <w:r>
+        <w:rPr>
+          <w:rFonts w:ascii="Times New Roman" w:hAnsi="Times New Roman" w:eastAsia="Times New Roman"/>
+          <w:b w:val="0"/>
+          <w:i w:val="0"/>
+          <w:color w:val="000000"/>
+          <w:sz w:val="28"/>
+        </w:rPr>
         <w:t>Пример. Открывается период с 01.07 по 31.07: в типовой регистр записывается 30.06.</w:t>
       </w:r>
     </w:p>
@@ -4594,24 +4776,7 @@
           <w:color w:val="000000"/>
           <w:sz w:val="28"/>
         </w:rPr>
-        <w:t>Пока срок действия открытого периода не истек, автосдвиг эти записи не перезаписывает значением «сегодня минус N». После истечения срока действия открытого периода при включенном автосдвиге восстанавливается «сегодня минус N».</w:t>
-      </w:r>
-    </w:p>
-    <w:p>
-      <w:pPr>
-        <w:spacing w:after="120" w:before="0" w:line="360" w:lineRule="auto"/>
-        <w:ind w:firstLine="709"/>
-        <w:jc w:val="both"/>
-      </w:pPr>
-      <w:r>
-        <w:rPr>
-          <w:rFonts w:ascii="Times New Roman" w:hAnsi="Times New Roman" w:eastAsia="Times New Roman"/>
-          <w:b w:val="0"/>
-          <w:i w:val="0"/>
-          <w:color w:val="000000"/>
-          <w:sz w:val="28"/>
-        </w:rPr>
-        <w:t>Адресат записи - «для всех пользователей». Персональные строки пользователей заявка не изменяет.</w:t>
+        <w:t>Пока срок действия открытого периода не истек, автосдвиг эти записи не перезаписывает значением «сегодня минус N». После истечения срока действия открытого периода при включенном автосдвиге восстанавливается свое «сегодня минус N» каждой настройки. Заявка изменяет те же адресаты, что ведутся автосдвигом. Строки типового регистра, которых нет в настройках, заявка не изменяет.</w:t>
       </w:r>
     </w:p>
     <w:p>
@@ -4681,7 +4846,7 @@
           <w:color w:val="000000"/>
           <w:sz w:val="28"/>
         </w:rPr>
-        <w:t>1. Найти согласованные заявки по организации, срок действия открытого периода которых (п. 7.4) еще не истек.</w:t>
+        <w:t>1. Найти согласованные заявки, срок действия открытого периода которых (п. 7.4) еще не истек и которые покрывают организацию и раздел этой настройки.</w:t>
       </w:r>
     </w:p>
     <w:p>
@@ -4749,7 +4914,7 @@
           <w:color w:val="000000"/>
           <w:sz w:val="28"/>
         </w:rPr>
-        <w:t>3. Если действующей заявки нет: рассчитать «сегодня минус N» и записать только записи по п. 4 для организации настройки.</w:t>
+        <w:t>3. Если действующей заявки по этой настройке нет: рассчитать «сегодня минус N» данной настройки и записать записи по п. 4 для организации, адресата и раздела настройки.</w:t>
       </w:r>
     </w:p>
     <w:p>
@@ -4766,7 +4931,7 @@
           <w:color w:val="000000"/>
           <w:sz w:val="28"/>
         </w:rPr>
-        <w:t>4. Не изменять персональные строки и разделы иных типов объектов.</w:t>
+        <w:t>4. Не изменять записи, которых нет в настройках, и разделы иных типов объектов.</w:t>
       </w:r>
     </w:p>
     <w:p>
@@ -4869,7 +5034,7 @@
           <w:color w:val="000000"/>
           <w:sz w:val="28"/>
         </w:rPr>
-        <w:t>3. После появления состояния «Согласован»: определить срок действия открытого периода по п. 7.4; записать в типовой регистр значение «Период с минус 1 день» в записи по организации и разделу заявки (п. 4); обновить действующие даты запрета БСП.</w:t>
+        <w:t>3. После появления состояния «Согласован»: определить срок действия открытого периода по п. 7.4; записать в типовой регистр значение «Период с минус 1 день» по организациям, разделу и адресатам заявки (п. 7.5); обновить действующие даты запрета БСП.</w:t>
       </w:r>
     </w:p>
     <w:p>
@@ -5173,7 +5338,7 @@
                 <w:color w:val="000000"/>
                 <w:sz w:val="24"/>
               </w:rPr>
-              <w:t>Автосдвиг без заявки, N равно 10, дата сеанса 18.08</w:t>
+              <w:t>Автосдвиг без заявки, для всех пользователей N равно 10, дата сеанса 18.08</w:t>
             </w:r>
           </w:p>
         </w:tc>
@@ -5319,7 +5484,7 @@
                 <w:color w:val="000000"/>
                 <w:sz w:val="24"/>
               </w:rPr>
-              <w:t>С 18.08 по 22.08 в регистре отсечка 30.06; задание 20.08 не ставит «сегодня минус N»; 23.08 при включенном N снова «сегодня минус N»</w:t>
+              <w:t>С 18.08 по 22.08 в регистре отсечка 30.06 по покрытым записям; задание 20.08 не ставит «сегодня минус N» по ним; 23.08 снова свое N каждой настройки</w:t>
             </w:r>
           </w:p>
         </w:tc>
@@ -5393,7 +5558,7 @@
                 <w:color w:val="000000"/>
                 <w:sz w:val="24"/>
               </w:rPr>
-              <w:t>По организации есть персональная дата пользователя</w:t>
+              <w:t>По организации есть дата пользователя только в типовой форме, без настройки автосдвига</w:t>
             </w:r>
           </w:p>
         </w:tc>
@@ -5503,6 +5668,226 @@
                 <w:color w:val="000000"/>
                 <w:sz w:val="24"/>
               </w:rPr>
+              <w:t>Настройка на пользователя Иванова, N равно 5, и настройка «для всех», N равно 10</w:t>
+            </w:r>
+          </w:p>
+        </w:tc>
+        <w:tc>
+          <w:tcPr>
+            <w:tcW w:type="dxa" w:w="5102"/>
+            <w:vAlign w:val="center"/>
+            <w:tcBorders>
+              <w:top w:val="single" w:sz="8" w:space="0" w:color="000000"/>
+              <w:left w:val="single" w:sz="8" w:space="0" w:color="000000"/>
+              <w:bottom w:val="single" w:sz="8" w:space="0" w:color="000000"/>
+              <w:right w:val="single" w:sz="8" w:space="0" w:color="000000"/>
+            </w:tcBorders>
+            <w:tcMar>
+              <w:top w:w="45" w:type="dxa"/>
+              <w:left w:w="45" w:type="dxa"/>
+              <w:bottom w:w="45" w:type="dxa"/>
+              <w:right w:w="45" w:type="dxa"/>
+            </w:tcMar>
+          </w:tcPr>
+          <w:p>
+            <w:pPr>
+              <w:spacing w:after="0" w:before="0" w:line="240" w:lineRule="auto"/>
+              <w:ind w:firstLine="0"/>
+              <w:jc w:val="left"/>
+            </w:pPr>
+            <w:r/>
+            <w:r>
+              <w:rPr>
+                <w:rFonts w:ascii="Times New Roman" w:hAnsi="Times New Roman" w:eastAsia="Times New Roman"/>
+                <w:b w:val="0"/>
+                <w:i w:val="0"/>
+                <w:color w:val="000000"/>
+                <w:sz w:val="24"/>
+              </w:rPr>
+              <w:t>У Иванова граница 13.08, у остальных 08.08 (при дате сеанса 18.08)</w:t>
+            </w:r>
+          </w:p>
+        </w:tc>
+      </w:tr>
+      <w:tr>
+        <w:tc>
+          <w:tcPr>
+            <w:tcW w:type="dxa" w:w="680"/>
+            <w:vAlign w:val="center"/>
+            <w:tcBorders>
+              <w:top w:val="single" w:sz="8" w:space="0" w:color="000000"/>
+              <w:left w:val="single" w:sz="8" w:space="0" w:color="000000"/>
+              <w:bottom w:val="single" w:sz="8" w:space="0" w:color="000000"/>
+              <w:right w:val="single" w:sz="8" w:space="0" w:color="000000"/>
+            </w:tcBorders>
+            <w:tcMar>
+              <w:top w:w="45" w:type="dxa"/>
+              <w:left w:w="45" w:type="dxa"/>
+              <w:bottom w:w="45" w:type="dxa"/>
+              <w:right w:w="45" w:type="dxa"/>
+            </w:tcMar>
+          </w:tcPr>
+          <w:p>
+            <w:pPr>
+              <w:spacing w:after="0" w:before="0" w:line="240" w:lineRule="auto"/>
+              <w:ind w:firstLine="0"/>
+              <w:jc w:val="center"/>
+            </w:pPr>
+            <w:r/>
+            <w:r>
+              <w:rPr>
+                <w:rFonts w:ascii="Times New Roman" w:hAnsi="Times New Roman" w:eastAsia="Times New Roman"/>
+                <w:b w:val="0"/>
+                <w:i w:val="0"/>
+                <w:color w:val="000000"/>
+                <w:sz w:val="24"/>
+              </w:rPr>
+              <w:t>5</w:t>
+            </w:r>
+          </w:p>
+        </w:tc>
+        <w:tc>
+          <w:tcPr>
+            <w:tcW w:type="dxa" w:w="3572"/>
+            <w:vAlign w:val="center"/>
+            <w:tcBorders>
+              <w:top w:val="single" w:sz="8" w:space="0" w:color="000000"/>
+              <w:left w:val="single" w:sz="8" w:space="0" w:color="000000"/>
+              <w:bottom w:val="single" w:sz="8" w:space="0" w:color="000000"/>
+              <w:right w:val="single" w:sz="8" w:space="0" w:color="000000"/>
+            </w:tcBorders>
+            <w:tcMar>
+              <w:top w:w="45" w:type="dxa"/>
+              <w:left w:w="45" w:type="dxa"/>
+              <w:bottom w:w="45" w:type="dxa"/>
+              <w:right w:w="45" w:type="dxa"/>
+            </w:tcMar>
+          </w:tcPr>
+          <w:p>
+            <w:pPr>
+              <w:spacing w:after="0" w:before="0" w:line="240" w:lineRule="auto"/>
+              <w:ind w:firstLine="0"/>
+              <w:jc w:val="left"/>
+            </w:pPr>
+            <w:r/>
+            <w:r>
+              <w:rPr>
+                <w:rFonts w:ascii="Times New Roman" w:hAnsi="Times New Roman" w:eastAsia="Times New Roman"/>
+                <w:b w:val="0"/>
+                <w:i w:val="0"/>
+                <w:color w:val="000000"/>
+                <w:sz w:val="24"/>
+              </w:rPr>
+              <w:t>Настройка без раздела N равно 10 и настройка на раздел «Учет по МСФО» N равно 3</w:t>
+            </w:r>
+          </w:p>
+        </w:tc>
+        <w:tc>
+          <w:tcPr>
+            <w:tcW w:type="dxa" w:w="5102"/>
+            <w:vAlign w:val="center"/>
+            <w:tcBorders>
+              <w:top w:val="single" w:sz="8" w:space="0" w:color="000000"/>
+              <w:left w:val="single" w:sz="8" w:space="0" w:color="000000"/>
+              <w:bottom w:val="single" w:sz="8" w:space="0" w:color="000000"/>
+              <w:right w:val="single" w:sz="8" w:space="0" w:color="000000"/>
+            </w:tcBorders>
+            <w:tcMar>
+              <w:top w:w="45" w:type="dxa"/>
+              <w:left w:w="45" w:type="dxa"/>
+              <w:bottom w:w="45" w:type="dxa"/>
+              <w:right w:w="45" w:type="dxa"/>
+            </w:tcMar>
+          </w:tcPr>
+          <w:p>
+            <w:pPr>
+              <w:spacing w:after="0" w:before="0" w:line="240" w:lineRule="auto"/>
+              <w:ind w:firstLine="0"/>
+              <w:jc w:val="left"/>
+            </w:pPr>
+            <w:r/>
+            <w:r>
+              <w:rPr>
+                <w:rFonts w:ascii="Times New Roman" w:hAnsi="Times New Roman" w:eastAsia="Times New Roman"/>
+                <w:b w:val="0"/>
+                <w:i w:val="0"/>
+                <w:color w:val="000000"/>
+                <w:sz w:val="24"/>
+              </w:rPr>
+              <w:t>По МСФО граница 15.08, по остальным разделам с типом «Организации» - 08.08</w:t>
+            </w:r>
+          </w:p>
+        </w:tc>
+      </w:tr>
+      <w:tr>
+        <w:tc>
+          <w:tcPr>
+            <w:tcW w:type="dxa" w:w="680"/>
+            <w:vAlign w:val="center"/>
+            <w:tcBorders>
+              <w:top w:val="single" w:sz="8" w:space="0" w:color="000000"/>
+              <w:left w:val="single" w:sz="8" w:space="0" w:color="000000"/>
+              <w:bottom w:val="single" w:sz="8" w:space="0" w:color="000000"/>
+              <w:right w:val="single" w:sz="8" w:space="0" w:color="000000"/>
+            </w:tcBorders>
+            <w:tcMar>
+              <w:top w:w="45" w:type="dxa"/>
+              <w:left w:w="45" w:type="dxa"/>
+              <w:bottom w:w="45" w:type="dxa"/>
+              <w:right w:w="45" w:type="dxa"/>
+            </w:tcMar>
+          </w:tcPr>
+          <w:p>
+            <w:pPr>
+              <w:spacing w:after="0" w:before="0" w:line="240" w:lineRule="auto"/>
+              <w:ind w:firstLine="0"/>
+              <w:jc w:val="center"/>
+            </w:pPr>
+            <w:r/>
+            <w:r>
+              <w:rPr>
+                <w:rFonts w:ascii="Times New Roman" w:hAnsi="Times New Roman" w:eastAsia="Times New Roman"/>
+                <w:b w:val="0"/>
+                <w:i w:val="0"/>
+                <w:color w:val="000000"/>
+                <w:sz w:val="24"/>
+              </w:rPr>
+              <w:t>6</w:t>
+            </w:r>
+          </w:p>
+        </w:tc>
+        <w:tc>
+          <w:tcPr>
+            <w:tcW w:type="dxa" w:w="3572"/>
+            <w:vAlign w:val="center"/>
+            <w:tcBorders>
+              <w:top w:val="single" w:sz="8" w:space="0" w:color="000000"/>
+              <w:left w:val="single" w:sz="8" w:space="0" w:color="000000"/>
+              <w:bottom w:val="single" w:sz="8" w:space="0" w:color="000000"/>
+              <w:right w:val="single" w:sz="8" w:space="0" w:color="000000"/>
+            </w:tcBorders>
+            <w:tcMar>
+              <w:top w:w="45" w:type="dxa"/>
+              <w:left w:w="45" w:type="dxa"/>
+              <w:bottom w:w="45" w:type="dxa"/>
+              <w:right w:w="45" w:type="dxa"/>
+            </w:tcMar>
+          </w:tcPr>
+          <w:p>
+            <w:pPr>
+              <w:spacing w:after="0" w:before="0" w:line="240" w:lineRule="auto"/>
+              <w:ind w:firstLine="0"/>
+              <w:jc w:val="left"/>
+            </w:pPr>
+            <w:r/>
+            <w:r>
+              <w:rPr>
+                <w:rFonts w:ascii="Times New Roman" w:hAnsi="Times New Roman" w:eastAsia="Times New Roman"/>
+                <w:b w:val="0"/>
+                <w:i w:val="0"/>
+                <w:color w:val="000000"/>
+                <w:sz w:val="24"/>
+              </w:rPr>
               <w:t>Заявка записана, но не согласована</w:t>
             </w:r>
           </w:p>
@@ -5577,7 +5962,7 @@
                 <w:color w:val="000000"/>
                 <w:sz w:val="24"/>
               </w:rPr>
-              <w:t>5</w:t>
+              <w:t>7</w:t>
             </w:r>
           </w:p>
         </w:tc>
@@ -5687,7 +6072,7 @@
                 <w:color w:val="000000"/>
                 <w:sz w:val="24"/>
               </w:rPr>
-              <w:t>6</w:t>
+              <w:t>8</w:t>
             </w:r>
           </w:p>
         </w:tc>

</xml_diff>

<commit_message>
Rename addressee to Пользователи in TZ and OpenSpec
Call the settings dimension Пользователи instead of адресат, with
(пользователь/группа пользователей) where the value set needs spelling out.
Typical RS dimension name Пользователь is unchanged.

Co-authored-by: an_skripko <an_skripko@vk.com>
</commit_message>
<xml_diff>
--- a/openspec/changes/np-dates-of-prohibition-setup/ТЗ_установка_дат_запрета_изменения.docx
+++ b/openspec/changes/np-dates-of-prohibition-setup/ТЗ_установка_дат_запрета_изменения.docx
@@ -1614,7 +1614,7 @@
           <w:color w:val="000000"/>
           <w:sz w:val="28"/>
         </w:rPr>
-        <w:t>3. В типовой регистр сведений ДатыЗапретаИзменения записывать только записи, указанные в п. 4: раздел учета, организация, адресат (все пользователи, группа пользователей или пользователь). Прочие записи этого регистра не изменять.</w:t>
+        <w:t>3. В типовой регистр сведений ДатыЗапретаИзменения записывать только записи, указанные в п. 4: раздел учета, организация, Пользователи (пользователь/группа пользователей). Прочие записи этого регистра не изменять.</w:t>
       </w:r>
     </w:p>
     <w:p>
@@ -1699,7 +1699,7 @@
           <w:color w:val="000000"/>
           <w:sz w:val="28"/>
         </w:rPr>
-        <w:t>8. Факты записи (организация, адресат, раздел, старая и новая дата, режим: автосдвиг или заявка) фиксировать в журнале регистрации.</w:t>
+        <w:t>8. Факты записи (организация, Пользователи, раздел, старая и новая дата, режим: автосдвиг или заявка) фиксировать в журнале регистрации.</w:t>
       </w:r>
     </w:p>
     <w:p>
@@ -2061,7 +2061,7 @@
                 <w:color w:val="000000"/>
                 <w:sz w:val="24"/>
               </w:rPr>
-              <w:t>как в типовом регистре: «для всех пользователей», группа пользователей или пользователь. Берется из настройки автосдвига</w:t>
+              <w:t>значение из реквизита Пользователи настройки: «для всех пользователей», пользователь или группа пользователей</w:t>
             </w:r>
           </w:p>
         </w:tc>
@@ -2236,7 +2236,7 @@
           <w:color w:val="000000"/>
           <w:sz w:val="28"/>
         </w:rPr>
-        <w:t>Для одной организации допускается несколько настроек с разным N: по адресату и, при необходимости, по разделу учета.</w:t>
+        <w:t>Для одной организации допускается несколько настроек с разным N: по Пользователям (пользователь/группа пользователей) и, при необходимости, по разделу учета.</w:t>
       </w:r>
     </w:p>
     <w:p>
@@ -2592,7 +2592,7 @@
                 <w:color w:val="000000"/>
                 <w:sz w:val="24"/>
               </w:rPr>
-              <w:t>организация, адресат, раздел учета (необязательно), число дней N, признак включения</w:t>
+              <w:t>организация, Пользователи, раздел учета (необязательно), число дней N, признак включения</w:t>
             </w:r>
           </w:p>
         </w:tc>
@@ -3236,7 +3236,7 @@
                 <w:color w:val="000000"/>
                 <w:sz w:val="24"/>
               </w:rPr>
-              <w:t>Адресат</w:t>
+              <w:t>Пользователи</w:t>
             </w:r>
           </w:p>
         </w:tc>
@@ -3272,7 +3272,7 @@
                 <w:color w:val="000000"/>
                 <w:sz w:val="24"/>
               </w:rPr>
-              <w:t>«для всех пользователей», группа пользователей или пользователь (как измерение Пользователь типового регистра)</w:t>
+              <w:t>«для всех пользователей», пользователь или группа пользователей (как измерение Пользователь типового регистра)</w:t>
             </w:r>
           </w:p>
         </w:tc>
@@ -3420,7 +3420,7 @@
                 <w:color w:val="000000"/>
                 <w:sz w:val="24"/>
               </w:rPr>
-              <w:t>число больше 0; свое значение для сочетания организация + адресат + раздел</w:t>
+              <w:t>число больше 0; свое значение для сочетания организация + Пользователи + раздел</w:t>
             </w:r>
           </w:p>
         </w:tc>
@@ -3521,7 +3521,7 @@
           <w:color w:val="000000"/>
           <w:sz w:val="28"/>
         </w:rPr>
-        <w:t>Пустой адресат означает «для всех пользователей». Пустой раздел означает все разделы с типом «Организации». Если по той же организации и адресату есть и настройка без раздела, и настройка с конкретным разделом, для этого раздела действует настройка с заполненным разделом, для остальных - настройка без раздела. Настройки задаются формой списка или записи регистра. Типовые относительные описания («конец прошлого месяца» и аналогичные) не подменяются.</w:t>
+        <w:t>Пустое значение Пользователи означает «для всех пользователей». Пустой раздел означает все разделы с типом «Организации». Если по той же организации и тем же Пользователям есть и настройка без раздела, и настройка с конкретным разделом, для этого раздела действует настройка с заполненным разделом, для остальных - настройка без раздела. Настройки задаются формой списка или записи регистра. Типовые относительные описания («конец прошлого месяца» и аналогичные) не подменяются.</w:t>
       </w:r>
     </w:p>
     <w:p>
@@ -3625,7 +3625,7 @@
           <w:color w:val="000000"/>
           <w:sz w:val="28"/>
         </w:rPr>
-        <w:t>1. Изменяются только записи, указанные в п. 4, по адресату и разделу из настройки.</w:t>
+        <w:t>1. Изменяются только записи, указанные в п. 4, по Пользователям и разделу из настройки.</w:t>
       </w:r>
     </w:p>
     <w:p>
@@ -3676,7 +3676,7 @@
           <w:color w:val="000000"/>
           <w:sz w:val="28"/>
         </w:rPr>
-        <w:t>4. Если есть согласованная заявка со сроком действия открытого периода, который не истек, задание не записывает значение «сегодня минус N» в записи, которые эта заявка покрывает (организация, раздел, адресаты настроек). По остальным разделам той же организации автосдвиг продолжается.</w:t>
+        <w:t>4. Если есть согласованная заявка со сроком действия открытого периода, который не истек, задание не записывает значение «сегодня минус N» в записи, которые эта заявка покрывает (организация, раздел, Пользователи настроек). По остальным разделам той же организации автосдвиг продолжается.</w:t>
       </w:r>
     </w:p>
     <w:p>
@@ -4708,7 +4708,7 @@
           <w:color w:val="000000"/>
           <w:sz w:val="28"/>
         </w:rPr>
-        <w:t>В записи регистра сведений ДатыЗапретаИзменения по организациям заявки, разделу заявки (или всем разделам с типом «Организации», если раздел пуст) и адресатам из настроек автосдвига этих организаций (п. 4):</w:t>
+        <w:t>В записи регистра сведений ДатыЗапретаИзменения по организациям заявки, разделу заявки (или всем разделам с типом «Организации», если раздел пуст) и Пользователям из настроек автосдвига этих организаций (п. 4):</w:t>
       </w:r>
     </w:p>
     <w:p>
@@ -4742,7 +4742,7 @@
           <w:color w:val="000000"/>
           <w:sz w:val="28"/>
         </w:rPr>
-        <w:t>Если по организации нет настроек автосдвига, записывается адресат «для всех пользователей».</w:t>
+        <w:t>Если по организации нет настроек автосдвига, записывается «для всех пользователей».</w:t>
       </w:r>
     </w:p>
     <w:p>
@@ -4776,7 +4776,7 @@
           <w:color w:val="000000"/>
           <w:sz w:val="28"/>
         </w:rPr>
-        <w:t>Пока срок действия открытого периода не истек, автосдвиг эти записи не перезаписывает значением «сегодня минус N». После истечения срока действия открытого периода при включенном автосдвиге восстанавливается свое «сегодня минус N» каждой настройки. Заявка изменяет те же адресаты, что ведутся автосдвигом. Строки типового регистра, которых нет в настройках, заявка не изменяет.</w:t>
+        <w:t>Пока срок действия открытого периода не истек, автосдвиг эти записи не перезаписывает значением «сегодня минус N». После истечения срока действия открытого периода при включенном автосдвиге восстанавливается свое «сегодня минус N» каждой настройки. Заявка изменяет те же Пользователи, что ведутся автосдвигом (пользователь/группа пользователей). Строки типового регистра, которых нет в настройках, заявка не изменяет.</w:t>
       </w:r>
     </w:p>
     <w:p>
@@ -4914,7 +4914,7 @@
           <w:color w:val="000000"/>
           <w:sz w:val="28"/>
         </w:rPr>
-        <w:t>3. Если действующей заявки по этой настройке нет: рассчитать «сегодня минус N» данной настройки и записать записи по п. 4 для организации, адресата и раздела настройки.</w:t>
+        <w:t>3. Если действующей заявки по этой настройке нет: рассчитать «сегодня минус N» данной настройки и записать записи по п. 4 для организации, Пользователей и раздела настройки.</w:t>
       </w:r>
     </w:p>
     <w:p>
@@ -5034,7 +5034,7 @@
           <w:color w:val="000000"/>
           <w:sz w:val="28"/>
         </w:rPr>
-        <w:t>3. После появления состояния «Согласован»: определить срок действия открытого периода по п. 7.4; записать в типовой регистр значение «Период с минус 1 день» по организациям, разделу и адресатам заявки (п. 7.5); обновить действующие даты запрета БСП.</w:t>
+        <w:t>3. После появления состояния «Согласован»: определить срок действия открытого периода по п. 7.4; записать в типовой регистр значение «Период с минус 1 день» по организациям, разделу и Пользователям заявки (п. 7.5); обновить действующие даты запрета БСП.</w:t>
       </w:r>
     </w:p>
     <w:p>

</xml_diff>